<commit_message>
feat(docs): add complete library ERD to BRD
- Include the consolidated ERD in the BRD and diagram exports
- Add build and layout tools for generating and verifying the documents
</commit_message>
<xml_diff>
--- a/docs/BRD-perpus-merah-putih.docx
+++ b/docs/BRD-perpus-merah-putih.docx
@@ -40,6 +40,7 @@
         <w:keepLines/>
         <w:spacing w:after="440" w:line="1080" w:lineRule="exact"/>
       </w:pPr>
+      <w:proofErr w:type="spellStart"/>
       <w:r>
         <w:rPr>
           <w:rFonts w:ascii="Arial" w:hAnsi="Arial" w:cs="Arial"/>
@@ -49,6 +50,7 @@
         </w:rPr>
         <w:t>Perpus</w:t>
       </w:r>
+      <w:proofErr w:type="spellEnd"/>
       <w:r>
         <w:rPr>
           <w:rFonts w:ascii="Arial" w:hAnsi="Arial" w:cs="Arial"/>
@@ -134,13 +136,32 @@
         </w:tabs>
         <w:spacing w:after="180" w:line="360" w:lineRule="exact"/>
       </w:pPr>
+      <w:proofErr w:type="spellStart"/>
       <w:r>
         <w:rPr>
           <w:rFonts w:ascii="Arial" w:hAnsi="Arial" w:cs="Arial"/>
           <w:color w:val="003E51"/>
           <w:sz w:val="22"/>
         </w:rPr>
-        <w:t>Version 1.3</w:t>
+        <w:t>Version</w:t>
+      </w:r>
+      <w:proofErr w:type="spellEnd"/>
+      <w:r>
+        <w:rPr>
+          <w:rFonts w:ascii="Arial" w:hAnsi="Arial" w:cs="Arial"/>
+          <w:color w:val="003E51"/>
+          <w:sz w:val="22"/>
+        </w:rPr>
+        <w:t xml:space="preserve"> 1.</w:t>
+      </w:r>
+      <w:r>
+        <w:rPr>
+          <w:rFonts w:ascii="Arial" w:hAnsi="Arial" w:cs="Arial"/>
+          <w:color w:val="003E51"/>
+          <w:sz w:val="22"/>
+          <w:lang w:val="en-US"/>
+        </w:rPr>
+        <w:t>0</w:t>
       </w:r>
       <w:r>
         <w:rPr>
@@ -155,28 +176,206 @@
     <w:p>
       <w:pPr>
         <w:keepLines/>
-        <w:tabs>
-          <w:tab w:val="right" w:pos="9026"/>
-        </w:tabs>
-        <w:spacing w:after="1080" w:line="340" w:lineRule="exact"/>
-      </w:pPr>
-      <w:r>
+        <w:spacing w:after="0" w:line="260" w:lineRule="exact"/>
         <w:rPr>
           <w:rFonts w:ascii="Arial" w:hAnsi="Arial" w:cs="Arial"/>
           <w:color w:val="696F80"/>
-          <w:sz w:val="20"/>
+          <w:spacing w:val="14"/>
+          <w:sz w:val="16"/>
         </w:rPr>
-        <w:t>Document status</w:t>
-      </w:r>
-      <w:r>
+      </w:pPr>
+    </w:p>
+    <w:p>
+      <w:pPr>
+        <w:keepLines/>
+        <w:spacing w:after="0" w:line="260" w:lineRule="exact"/>
         <w:rPr>
           <w:rFonts w:ascii="Arial" w:hAnsi="Arial" w:cs="Arial"/>
           <w:color w:val="696F80"/>
-          <w:sz w:val="20"/>
+          <w:spacing w:val="14"/>
+          <w:sz w:val="16"/>
         </w:rPr>
-        <w:tab/>
-        <w:t>Draf untuk peninjauan</w:t>
-      </w:r>
+      </w:pPr>
+    </w:p>
+    <w:p>
+      <w:pPr>
+        <w:keepLines/>
+        <w:spacing w:after="0" w:line="260" w:lineRule="exact"/>
+        <w:rPr>
+          <w:rFonts w:ascii="Arial" w:hAnsi="Arial" w:cs="Arial"/>
+          <w:color w:val="696F80"/>
+          <w:spacing w:val="14"/>
+          <w:sz w:val="16"/>
+        </w:rPr>
+      </w:pPr>
+    </w:p>
+    <w:p>
+      <w:pPr>
+        <w:keepLines/>
+        <w:spacing w:after="0" w:line="260" w:lineRule="exact"/>
+        <w:rPr>
+          <w:rFonts w:ascii="Arial" w:hAnsi="Arial" w:cs="Arial"/>
+          <w:color w:val="696F80"/>
+          <w:spacing w:val="14"/>
+          <w:sz w:val="16"/>
+        </w:rPr>
+      </w:pPr>
+    </w:p>
+    <w:p>
+      <w:pPr>
+        <w:keepLines/>
+        <w:spacing w:after="0" w:line="260" w:lineRule="exact"/>
+        <w:rPr>
+          <w:rFonts w:ascii="Arial" w:hAnsi="Arial" w:cs="Arial"/>
+          <w:color w:val="696F80"/>
+          <w:spacing w:val="14"/>
+          <w:sz w:val="16"/>
+        </w:rPr>
+      </w:pPr>
+    </w:p>
+    <w:p>
+      <w:pPr>
+        <w:keepLines/>
+        <w:spacing w:after="0" w:line="260" w:lineRule="exact"/>
+        <w:rPr>
+          <w:rFonts w:ascii="Arial" w:hAnsi="Arial" w:cs="Arial"/>
+          <w:color w:val="696F80"/>
+          <w:spacing w:val="14"/>
+          <w:sz w:val="16"/>
+        </w:rPr>
+      </w:pPr>
+    </w:p>
+    <w:p>
+      <w:pPr>
+        <w:keepLines/>
+        <w:spacing w:after="0" w:line="260" w:lineRule="exact"/>
+        <w:rPr>
+          <w:rFonts w:ascii="Arial" w:hAnsi="Arial" w:cs="Arial"/>
+          <w:color w:val="696F80"/>
+          <w:spacing w:val="14"/>
+          <w:sz w:val="16"/>
+        </w:rPr>
+      </w:pPr>
+    </w:p>
+    <w:p>
+      <w:pPr>
+        <w:keepLines/>
+        <w:spacing w:after="0" w:line="260" w:lineRule="exact"/>
+        <w:rPr>
+          <w:rFonts w:ascii="Arial" w:hAnsi="Arial" w:cs="Arial"/>
+          <w:color w:val="696F80"/>
+          <w:spacing w:val="14"/>
+          <w:sz w:val="16"/>
+        </w:rPr>
+      </w:pPr>
+    </w:p>
+    <w:p>
+      <w:pPr>
+        <w:keepLines/>
+        <w:spacing w:after="0" w:line="260" w:lineRule="exact"/>
+        <w:rPr>
+          <w:rFonts w:ascii="Arial" w:hAnsi="Arial" w:cs="Arial"/>
+          <w:color w:val="696F80"/>
+          <w:spacing w:val="14"/>
+          <w:sz w:val="16"/>
+        </w:rPr>
+      </w:pPr>
+    </w:p>
+    <w:p>
+      <w:pPr>
+        <w:keepLines/>
+        <w:spacing w:after="0" w:line="260" w:lineRule="exact"/>
+        <w:rPr>
+          <w:rFonts w:ascii="Arial" w:hAnsi="Arial" w:cs="Arial"/>
+          <w:color w:val="696F80"/>
+          <w:spacing w:val="14"/>
+          <w:sz w:val="16"/>
+        </w:rPr>
+      </w:pPr>
+    </w:p>
+    <w:p>
+      <w:pPr>
+        <w:keepLines/>
+        <w:spacing w:after="0" w:line="260" w:lineRule="exact"/>
+        <w:rPr>
+          <w:rFonts w:ascii="Arial" w:hAnsi="Arial" w:cs="Arial"/>
+          <w:color w:val="696F80"/>
+          <w:spacing w:val="14"/>
+          <w:sz w:val="16"/>
+        </w:rPr>
+      </w:pPr>
+    </w:p>
+    <w:p>
+      <w:pPr>
+        <w:keepLines/>
+        <w:spacing w:after="0" w:line="260" w:lineRule="exact"/>
+        <w:rPr>
+          <w:rFonts w:ascii="Arial" w:hAnsi="Arial" w:cs="Arial"/>
+          <w:color w:val="696F80"/>
+          <w:spacing w:val="14"/>
+          <w:sz w:val="16"/>
+        </w:rPr>
+      </w:pPr>
+    </w:p>
+    <w:p>
+      <w:pPr>
+        <w:keepLines/>
+        <w:spacing w:after="0" w:line="260" w:lineRule="exact"/>
+        <w:rPr>
+          <w:rFonts w:ascii="Arial" w:hAnsi="Arial" w:cs="Arial"/>
+          <w:color w:val="696F80"/>
+          <w:spacing w:val="14"/>
+          <w:sz w:val="16"/>
+        </w:rPr>
+      </w:pPr>
+    </w:p>
+    <w:p>
+      <w:pPr>
+        <w:keepLines/>
+        <w:spacing w:after="0" w:line="260" w:lineRule="exact"/>
+        <w:rPr>
+          <w:rFonts w:ascii="Arial" w:hAnsi="Arial" w:cs="Arial"/>
+          <w:color w:val="696F80"/>
+          <w:spacing w:val="14"/>
+          <w:sz w:val="16"/>
+        </w:rPr>
+      </w:pPr>
+    </w:p>
+    <w:p>
+      <w:pPr>
+        <w:keepLines/>
+        <w:spacing w:after="0" w:line="260" w:lineRule="exact"/>
+        <w:rPr>
+          <w:rFonts w:ascii="Arial" w:hAnsi="Arial" w:cs="Arial"/>
+          <w:color w:val="696F80"/>
+          <w:spacing w:val="14"/>
+          <w:sz w:val="16"/>
+        </w:rPr>
+      </w:pPr>
+    </w:p>
+    <w:p>
+      <w:pPr>
+        <w:keepLines/>
+        <w:spacing w:after="0" w:line="260" w:lineRule="exact"/>
+        <w:rPr>
+          <w:rFonts w:ascii="Arial" w:hAnsi="Arial" w:cs="Arial"/>
+          <w:color w:val="696F80"/>
+          <w:spacing w:val="14"/>
+          <w:sz w:val="16"/>
+        </w:rPr>
+      </w:pPr>
+    </w:p>
+    <w:p>
+      <w:pPr>
+        <w:keepLines/>
+        <w:spacing w:after="0" w:line="260" w:lineRule="exact"/>
+        <w:rPr>
+          <w:rFonts w:ascii="Arial" w:hAnsi="Arial" w:cs="Arial"/>
+          <w:color w:val="696F80"/>
+          <w:spacing w:val="14"/>
+          <w:sz w:val="16"/>
+        </w:rPr>
+      </w:pPr>
     </w:p>
     <w:p>
       <w:pPr>
@@ -200,14 +399,32 @@
       </w:pPr>
       <w:bookmarkStart w:id="0" w:name="table-of-contents"/>
       <w:bookmarkStart w:id="1" w:name="business-requirements-document-brd"/>
+      <w:proofErr w:type="spellStart"/>
       <w:r>
         <w:lastRenderedPageBreak/>
-        <w:t>Table of contents</w:t>
-      </w:r>
+        <w:t>Table</w:t>
+      </w:r>
+      <w:proofErr w:type="spellEnd"/>
+      <w:r>
+        <w:t xml:space="preserve"> </w:t>
+      </w:r>
+      <w:proofErr w:type="spellStart"/>
+      <w:r>
+        <w:t>of</w:t>
+      </w:r>
+      <w:proofErr w:type="spellEnd"/>
+      <w:r>
+        <w:t xml:space="preserve"> </w:t>
+      </w:r>
+      <w:proofErr w:type="spellStart"/>
+      <w:r>
+        <w:t>contents</w:t>
+      </w:r>
+      <w:proofErr w:type="spellEnd"/>
     </w:p>
     <w:sdt>
       <w:sdtPr>
-        <w:id w:val="-729155996"/>
+        <w:id w:val="985201298"/>
         <w:docPartObj>
           <w:docPartGallery w:val="Table of Contents"/>
           <w:docPartUnique/>
@@ -232,7 +449,7 @@
           <w:r>
             <w:fldChar w:fldCharType="separate"/>
           </w:r>
-          <w:hyperlink w:anchor="_Toc243850402" w:history="1">
+          <w:hyperlink w:anchor="_Toc244034958" w:history="1">
             <w:r>
               <w:rPr>
                 <w:rStyle w:val="Hyperlink"/>
@@ -259,7 +476,7 @@
                 <w:noProof/>
                 <w:webHidden/>
               </w:rPr>
-              <w:instrText xml:space="preserve"> PAGEREF _Toc243850402 \h </w:instrText>
+              <w:instrText xml:space="preserve"> PAGEREF _Toc244034958 \h </w:instrText>
             </w:r>
             <w:r>
               <w:rPr>
@@ -298,7 +515,7 @@
               <w:lang w:val="en-ID" w:eastAsia="en-US"/>
             </w:rPr>
           </w:pPr>
-          <w:hyperlink w:anchor="_Toc243850403" w:history="1">
+          <w:hyperlink w:anchor="_Toc244034959" w:history="1">
             <w:r>
               <w:rPr>
                 <w:rStyle w:val="Hyperlink"/>
@@ -325,7 +542,7 @@
                 <w:noProof/>
                 <w:webHidden/>
               </w:rPr>
-              <w:instrText xml:space="preserve"> PAGEREF _Toc243850403 \h </w:instrText>
+              <w:instrText xml:space="preserve"> PAGEREF _Toc244034959 \h </w:instrText>
             </w:r>
             <w:r>
               <w:rPr>
@@ -364,7 +581,7 @@
               <w:lang w:val="en-ID" w:eastAsia="en-US"/>
             </w:rPr>
           </w:pPr>
-          <w:hyperlink w:anchor="_Toc243850404" w:history="1">
+          <w:hyperlink w:anchor="_Toc244034960" w:history="1">
             <w:r>
               <w:rPr>
                 <w:rStyle w:val="Hyperlink"/>
@@ -391,7 +608,7 @@
                 <w:noProof/>
                 <w:webHidden/>
               </w:rPr>
-              <w:instrText xml:space="preserve"> PAGEREF _Toc243850404 \h </w:instrText>
+              <w:instrText xml:space="preserve"> PAGEREF _Toc244034960 \h </w:instrText>
             </w:r>
             <w:r>
               <w:rPr>
@@ -430,7 +647,7 @@
               <w:lang w:val="en-ID" w:eastAsia="en-US"/>
             </w:rPr>
           </w:pPr>
-          <w:hyperlink w:anchor="_Toc243850405" w:history="1">
+          <w:hyperlink w:anchor="_Toc244034961" w:history="1">
             <w:r>
               <w:rPr>
                 <w:rStyle w:val="Hyperlink"/>
@@ -457,7 +674,7 @@
                 <w:noProof/>
                 <w:webHidden/>
               </w:rPr>
-              <w:instrText xml:space="preserve"> PAGEREF _Toc243850405 \h </w:instrText>
+              <w:instrText xml:space="preserve"> PAGEREF _Toc244034961 \h </w:instrText>
             </w:r>
             <w:r>
               <w:rPr>
@@ -496,7 +713,7 @@
               <w:lang w:val="en-ID" w:eastAsia="en-US"/>
             </w:rPr>
           </w:pPr>
-          <w:hyperlink w:anchor="_Toc243850406" w:history="1">
+          <w:hyperlink w:anchor="_Toc244034962" w:history="1">
             <w:r>
               <w:rPr>
                 <w:rStyle w:val="Hyperlink"/>
@@ -523,7 +740,7 @@
                 <w:noProof/>
                 <w:webHidden/>
               </w:rPr>
-              <w:instrText xml:space="preserve"> PAGEREF _Toc243850406 \h </w:instrText>
+              <w:instrText xml:space="preserve"> PAGEREF _Toc244034962 \h </w:instrText>
             </w:r>
             <w:r>
               <w:rPr>
@@ -562,7 +779,7 @@
               <w:lang w:val="en-ID" w:eastAsia="en-US"/>
             </w:rPr>
           </w:pPr>
-          <w:hyperlink w:anchor="_Toc243850407" w:history="1">
+          <w:hyperlink w:anchor="_Toc244034963" w:history="1">
             <w:r>
               <w:rPr>
                 <w:rStyle w:val="Hyperlink"/>
@@ -589,7 +806,7 @@
                 <w:noProof/>
                 <w:webHidden/>
               </w:rPr>
-              <w:instrText xml:space="preserve"> PAGEREF _Toc243850407 \h </w:instrText>
+              <w:instrText xml:space="preserve"> PAGEREF _Toc244034963 \h </w:instrText>
             </w:r>
             <w:r>
               <w:rPr>
@@ -628,7 +845,7 @@
               <w:lang w:val="en-ID" w:eastAsia="en-US"/>
             </w:rPr>
           </w:pPr>
-          <w:hyperlink w:anchor="_Toc243850408" w:history="1">
+          <w:hyperlink w:anchor="_Toc244034964" w:history="1">
             <w:r>
               <w:rPr>
                 <w:rStyle w:val="Hyperlink"/>
@@ -655,7 +872,7 @@
                 <w:noProof/>
                 <w:webHidden/>
               </w:rPr>
-              <w:instrText xml:space="preserve"> PAGEREF _Toc243850408 \h </w:instrText>
+              <w:instrText xml:space="preserve"> PAGEREF _Toc244034964 \h </w:instrText>
             </w:r>
             <w:r>
               <w:rPr>
@@ -694,7 +911,7 @@
               <w:lang w:val="en-ID" w:eastAsia="en-US"/>
             </w:rPr>
           </w:pPr>
-          <w:hyperlink w:anchor="_Toc243850409" w:history="1">
+          <w:hyperlink w:anchor="_Toc244034965" w:history="1">
             <w:r>
               <w:rPr>
                 <w:rStyle w:val="Hyperlink"/>
@@ -721,7 +938,7 @@
                 <w:noProof/>
                 <w:webHidden/>
               </w:rPr>
-              <w:instrText xml:space="preserve"> PAGEREF _Toc243850409 \h </w:instrText>
+              <w:instrText xml:space="preserve"> PAGEREF _Toc244034965 \h </w:instrText>
             </w:r>
             <w:r>
               <w:rPr>
@@ -760,7 +977,7 @@
               <w:lang w:val="en-ID" w:eastAsia="en-US"/>
             </w:rPr>
           </w:pPr>
-          <w:hyperlink w:anchor="_Toc243850410" w:history="1">
+          <w:hyperlink w:anchor="_Toc244034966" w:history="1">
             <w:r>
               <w:rPr>
                 <w:rStyle w:val="Hyperlink"/>
@@ -787,7 +1004,7 @@
                 <w:noProof/>
                 <w:webHidden/>
               </w:rPr>
-              <w:instrText xml:space="preserve"> PAGEREF _Toc243850410 \h </w:instrText>
+              <w:instrText xml:space="preserve"> PAGEREF _Toc244034966 \h </w:instrText>
             </w:r>
             <w:r>
               <w:rPr>
@@ -826,7 +1043,7 @@
               <w:lang w:val="en-ID" w:eastAsia="en-US"/>
             </w:rPr>
           </w:pPr>
-          <w:hyperlink w:anchor="_Toc243850411" w:history="1">
+          <w:hyperlink w:anchor="_Toc244034967" w:history="1">
             <w:r>
               <w:rPr>
                 <w:rStyle w:val="Hyperlink"/>
@@ -853,7 +1070,7 @@
                 <w:noProof/>
                 <w:webHidden/>
               </w:rPr>
-              <w:instrText xml:space="preserve"> PAGEREF _Toc243850411 \h </w:instrText>
+              <w:instrText xml:space="preserve"> PAGEREF _Toc244034967 \h </w:instrText>
             </w:r>
             <w:r>
               <w:rPr>
@@ -892,7 +1109,7 @@
               <w:lang w:val="en-ID" w:eastAsia="en-US"/>
             </w:rPr>
           </w:pPr>
-          <w:hyperlink w:anchor="_Toc243850412" w:history="1">
+          <w:hyperlink w:anchor="_Toc244034968" w:history="1">
             <w:r>
               <w:rPr>
                 <w:rStyle w:val="Hyperlink"/>
@@ -919,7 +1136,7 @@
                 <w:noProof/>
                 <w:webHidden/>
               </w:rPr>
-              <w:instrText xml:space="preserve"> PAGEREF _Toc243850412 \h </w:instrText>
+              <w:instrText xml:space="preserve"> PAGEREF _Toc244034968 \h </w:instrText>
             </w:r>
             <w:r>
               <w:rPr>
@@ -958,7 +1175,7 @@
               <w:lang w:val="en-ID" w:eastAsia="en-US"/>
             </w:rPr>
           </w:pPr>
-          <w:hyperlink w:anchor="_Toc243850413" w:history="1">
+          <w:hyperlink w:anchor="_Toc244034969" w:history="1">
             <w:r>
               <w:rPr>
                 <w:rStyle w:val="Hyperlink"/>
@@ -985,7 +1202,7 @@
                 <w:noProof/>
                 <w:webHidden/>
               </w:rPr>
-              <w:instrText xml:space="preserve"> PAGEREF _Toc243850413 \h </w:instrText>
+              <w:instrText xml:space="preserve"> PAGEREF _Toc244034969 \h </w:instrText>
             </w:r>
             <w:r>
               <w:rPr>
@@ -1024,7 +1241,7 @@
               <w:lang w:val="en-ID" w:eastAsia="en-US"/>
             </w:rPr>
           </w:pPr>
-          <w:hyperlink w:anchor="_Toc243850414" w:history="1">
+          <w:hyperlink w:anchor="_Toc244034970" w:history="1">
             <w:r>
               <w:rPr>
                 <w:rStyle w:val="Hyperlink"/>
@@ -1051,7 +1268,7 @@
                 <w:noProof/>
                 <w:webHidden/>
               </w:rPr>
-              <w:instrText xml:space="preserve"> PAGEREF _Toc243850414 \h </w:instrText>
+              <w:instrText xml:space="preserve"> PAGEREF _Toc244034970 \h </w:instrText>
             </w:r>
             <w:r>
               <w:rPr>
@@ -1090,7 +1307,7 @@
               <w:lang w:val="en-ID" w:eastAsia="en-US"/>
             </w:rPr>
           </w:pPr>
-          <w:hyperlink w:anchor="_Toc243850415" w:history="1">
+          <w:hyperlink w:anchor="_Toc244034971" w:history="1">
             <w:r>
               <w:rPr>
                 <w:rStyle w:val="Hyperlink"/>
@@ -1117,7 +1334,7 @@
                 <w:noProof/>
                 <w:webHidden/>
               </w:rPr>
-              <w:instrText xml:space="preserve"> PAGEREF _Toc243850415 \h </w:instrText>
+              <w:instrText xml:space="preserve"> PAGEREF _Toc244034971 \h </w:instrText>
             </w:r>
             <w:r>
               <w:rPr>
@@ -1156,7 +1373,7 @@
               <w:lang w:val="en-ID" w:eastAsia="en-US"/>
             </w:rPr>
           </w:pPr>
-          <w:hyperlink w:anchor="_Toc243850416" w:history="1">
+          <w:hyperlink w:anchor="_Toc244034972" w:history="1">
             <w:r>
               <w:rPr>
                 <w:rStyle w:val="Hyperlink"/>
@@ -1183,7 +1400,7 @@
                 <w:noProof/>
                 <w:webHidden/>
               </w:rPr>
-              <w:instrText xml:space="preserve"> PAGEREF _Toc243850416 \h </w:instrText>
+              <w:instrText xml:space="preserve"> PAGEREF _Toc244034972 \h </w:instrText>
             </w:r>
             <w:r>
               <w:rPr>
@@ -1222,7 +1439,7 @@
               <w:lang w:val="en-ID" w:eastAsia="en-US"/>
             </w:rPr>
           </w:pPr>
-          <w:hyperlink w:anchor="_Toc243850417" w:history="1">
+          <w:hyperlink w:anchor="_Toc244034973" w:history="1">
             <w:r>
               <w:rPr>
                 <w:rStyle w:val="Hyperlink"/>
@@ -1249,7 +1466,7 @@
                 <w:noProof/>
                 <w:webHidden/>
               </w:rPr>
-              <w:instrText xml:space="preserve"> PAGEREF _Toc243850417 \h </w:instrText>
+              <w:instrText xml:space="preserve"> PAGEREF _Toc244034973 \h </w:instrText>
             </w:r>
             <w:r>
               <w:rPr>
@@ -1270,6 +1487,72 @@
                 <w:webHidden/>
               </w:rPr>
               <w:t>6</w:t>
+            </w:r>
+            <w:r>
+              <w:rPr>
+                <w:noProof/>
+                <w:webHidden/>
+              </w:rPr>
+              <w:fldChar w:fldCharType="end"/>
+            </w:r>
+          </w:hyperlink>
+        </w:p>
+        <w:p>
+          <w:pPr>
+            <w:pStyle w:val="TOC2"/>
+            <w:rPr>
+              <w:noProof/>
+              <w:lang w:val="en-ID" w:eastAsia="en-US"/>
+            </w:rPr>
+          </w:pPr>
+          <w:hyperlink w:anchor="_Toc244034974" w:history="1">
+            <w:r>
+              <w:rPr>
+                <w:rStyle w:val="Hyperlink"/>
+                <w:noProof/>
+              </w:rPr>
+              <w:t>5.3. Entity Relationship Diagram</w:t>
+            </w:r>
+            <w:r>
+              <w:rPr>
+                <w:noProof/>
+                <w:webHidden/>
+              </w:rPr>
+              <w:tab/>
+            </w:r>
+            <w:r>
+              <w:rPr>
+                <w:noProof/>
+                <w:webHidden/>
+              </w:rPr>
+              <w:fldChar w:fldCharType="begin"/>
+            </w:r>
+            <w:r>
+              <w:rPr>
+                <w:noProof/>
+                <w:webHidden/>
+              </w:rPr>
+              <w:instrText xml:space="preserve"> PAGEREF _Toc244034974 \h </w:instrText>
+            </w:r>
+            <w:r>
+              <w:rPr>
+                <w:noProof/>
+                <w:webHidden/>
+              </w:rPr>
+            </w:r>
+            <w:r>
+              <w:rPr>
+                <w:noProof/>
+                <w:webHidden/>
+              </w:rPr>
+              <w:fldChar w:fldCharType="separate"/>
+            </w:r>
+            <w:r>
+              <w:rPr>
+                <w:noProof/>
+                <w:webHidden/>
+              </w:rPr>
+              <w:t>7</w:t>
             </w:r>
             <w:r>
               <w:rPr>
@@ -1288,7 +1571,7 @@
               <w:lang w:val="en-ID" w:eastAsia="en-US"/>
             </w:rPr>
           </w:pPr>
-          <w:hyperlink w:anchor="_Toc243850418" w:history="1">
+          <w:hyperlink w:anchor="_Toc244034975" w:history="1">
             <w:r>
               <w:rPr>
                 <w:rStyle w:val="Hyperlink"/>
@@ -1315,7 +1598,7 @@
                 <w:noProof/>
                 <w:webHidden/>
               </w:rPr>
-              <w:instrText xml:space="preserve"> PAGEREF _Toc243850418 \h </w:instrText>
+              <w:instrText xml:space="preserve"> PAGEREF _Toc244034975 \h </w:instrText>
             </w:r>
             <w:r>
               <w:rPr>
@@ -1335,7 +1618,7 @@
                 <w:noProof/>
                 <w:webHidden/>
               </w:rPr>
-              <w:t>7</w:t>
+              <w:t>8</w:t>
             </w:r>
             <w:r>
               <w:rPr>
@@ -1354,7 +1637,7 @@
               <w:lang w:val="en-ID" w:eastAsia="en-US"/>
             </w:rPr>
           </w:pPr>
-          <w:hyperlink w:anchor="_Toc243850419" w:history="1">
+          <w:hyperlink w:anchor="_Toc244034976" w:history="1">
             <w:r>
               <w:rPr>
                 <w:rStyle w:val="Hyperlink"/>
@@ -1381,7 +1664,7 @@
                 <w:noProof/>
                 <w:webHidden/>
               </w:rPr>
-              <w:instrText xml:space="preserve"> PAGEREF _Toc243850419 \h </w:instrText>
+              <w:instrText xml:space="preserve"> PAGEREF _Toc244034976 \h </w:instrText>
             </w:r>
             <w:r>
               <w:rPr>
@@ -1401,7 +1684,7 @@
                 <w:noProof/>
                 <w:webHidden/>
               </w:rPr>
-              <w:t>7</w:t>
+              <w:t>8</w:t>
             </w:r>
             <w:r>
               <w:rPr>
@@ -1420,7 +1703,7 @@
               <w:lang w:val="en-ID" w:eastAsia="en-US"/>
             </w:rPr>
           </w:pPr>
-          <w:hyperlink w:anchor="_Toc243850420" w:history="1">
+          <w:hyperlink w:anchor="_Toc244034977" w:history="1">
             <w:r>
               <w:rPr>
                 <w:rStyle w:val="Hyperlink"/>
@@ -1447,7 +1730,7 @@
                 <w:noProof/>
                 <w:webHidden/>
               </w:rPr>
-              <w:instrText xml:space="preserve"> PAGEREF _Toc243850420 \h </w:instrText>
+              <w:instrText xml:space="preserve"> PAGEREF _Toc244034977 \h </w:instrText>
             </w:r>
             <w:r>
               <w:rPr>
@@ -1467,7 +1750,7 @@
                 <w:noProof/>
                 <w:webHidden/>
               </w:rPr>
-              <w:t>7</w:t>
+              <w:t>8</w:t>
             </w:r>
             <w:r>
               <w:rPr>
@@ -1494,16 +1777,26 @@
         <w:pageBreakBefore/>
       </w:pPr>
       <w:bookmarkStart w:id="2" w:name="business-requirements-definition"/>
-      <w:bookmarkStart w:id="3" w:name="_Toc243850402"/>
+      <w:bookmarkStart w:id="3" w:name="_Toc244034958"/>
       <w:bookmarkEnd w:id="0"/>
       <w:r>
         <w:lastRenderedPageBreak/>
-        <w:t>1</w:t>
-      </w:r>
-      <w:r>
-        <w:t>. Business Requirements Definition</w:t>
+        <w:t xml:space="preserve">1. Business </w:t>
+      </w:r>
+      <w:proofErr w:type="spellStart"/>
+      <w:r>
+        <w:t>Requirements</w:t>
+      </w:r>
+      <w:proofErr w:type="spellEnd"/>
+      <w:r>
+        <w:t xml:space="preserve"> </w:t>
+      </w:r>
+      <w:proofErr w:type="spellStart"/>
+      <w:r>
+        <w:t>Definition</w:t>
       </w:r>
       <w:bookmarkEnd w:id="3"/>
+      <w:proofErr w:type="spellEnd"/>
     </w:p>
     <w:tbl>
       <w:tblPr>
@@ -1543,8 +1836,13 @@
               <w:pStyle w:val="Compact"/>
             </w:pPr>
             <w:r>
-              <w:t>Project information</w:t>
-            </w:r>
+              <w:t xml:space="preserve">Project </w:t>
+            </w:r>
+            <w:proofErr w:type="spellStart"/>
+            <w:r>
+              <w:t>information</w:t>
+            </w:r>
+            <w:proofErr w:type="spellEnd"/>
           </w:p>
         </w:tc>
         <w:tc>
@@ -1561,9 +1859,11 @@
             <w:pPr>
               <w:pStyle w:val="Compact"/>
             </w:pPr>
+            <w:proofErr w:type="spellStart"/>
             <w:r>
               <w:t>Description</w:t>
             </w:r>
+            <w:proofErr w:type="spellEnd"/>
           </w:p>
         </w:tc>
       </w:tr>
@@ -1623,8 +1923,13 @@
               <w:pStyle w:val="Compact"/>
             </w:pPr>
             <w:r>
-              <w:t>Project name</w:t>
-            </w:r>
+              <w:t xml:space="preserve">Project </w:t>
+            </w:r>
+            <w:proofErr w:type="spellStart"/>
+            <w:r>
+              <w:t>name</w:t>
+            </w:r>
+            <w:proofErr w:type="spellEnd"/>
           </w:p>
         </w:tc>
         <w:tc>
@@ -1641,8 +1946,13 @@
             <w:pPr>
               <w:pStyle w:val="Compact"/>
             </w:pPr>
-            <w:r>
-              <w:t>Perpus Merah Putih</w:t>
+            <w:proofErr w:type="spellStart"/>
+            <w:r>
+              <w:t>Perpus</w:t>
+            </w:r>
+            <w:proofErr w:type="spellEnd"/>
+            <w:r>
+              <w:t xml:space="preserve"> Merah Putih</w:t>
             </w:r>
           </w:p>
         </w:tc>
@@ -1662,9 +1972,11 @@
             <w:pPr>
               <w:pStyle w:val="Compact"/>
             </w:pPr>
+            <w:proofErr w:type="spellStart"/>
             <w:r>
               <w:t>Requester</w:t>
             </w:r>
+            <w:proofErr w:type="spellEnd"/>
           </w:p>
         </w:tc>
         <w:tc>
@@ -1703,8 +2015,13 @@
               <w:pStyle w:val="Compact"/>
             </w:pPr>
             <w:r>
-              <w:t>System / Application</w:t>
-            </w:r>
+              <w:t xml:space="preserve">System / </w:t>
+            </w:r>
+            <w:proofErr w:type="spellStart"/>
+            <w:r>
+              <w:t>Application</w:t>
+            </w:r>
+            <w:proofErr w:type="spellEnd"/>
           </w:p>
         </w:tc>
         <w:tc>
@@ -1742,9 +2059,11 @@
             <w:pPr>
               <w:pStyle w:val="Compact"/>
             </w:pPr>
+            <w:proofErr w:type="spellStart"/>
             <w:r>
               <w:t>Users</w:t>
             </w:r>
+            <w:proofErr w:type="spellEnd"/>
           </w:p>
         </w:tc>
         <w:tc>
@@ -1782,8 +2101,13 @@
             <w:pPr>
               <w:pStyle w:val="Compact"/>
             </w:pPr>
-            <w:r>
-              <w:t>Document status</w:t>
+            <w:proofErr w:type="spellStart"/>
+            <w:r>
+              <w:t>Document</w:t>
+            </w:r>
+            <w:proofErr w:type="spellEnd"/>
+            <w:r>
+              <w:t xml:space="preserve"> status</w:t>
             </w:r>
           </w:p>
         </w:tc>
@@ -1848,9 +2172,11 @@
             <w:pPr>
               <w:pStyle w:val="Compact"/>
             </w:pPr>
+            <w:proofErr w:type="spellStart"/>
             <w:r>
               <w:t>Version</w:t>
             </w:r>
+            <w:proofErr w:type="spellEnd"/>
           </w:p>
         </w:tc>
         <w:tc>
@@ -1886,9 +2212,19 @@
             <w:pPr>
               <w:pStyle w:val="Compact"/>
             </w:pPr>
-            <w:r>
-              <w:t>Version summary</w:t>
-            </w:r>
+            <w:proofErr w:type="spellStart"/>
+            <w:r>
+              <w:t>Version</w:t>
+            </w:r>
+            <w:proofErr w:type="spellEnd"/>
+            <w:r>
+              <w:t xml:space="preserve"> </w:t>
+            </w:r>
+            <w:proofErr w:type="spellStart"/>
+            <w:r>
+              <w:t>summary</w:t>
+            </w:r>
+            <w:proofErr w:type="spellEnd"/>
           </w:p>
         </w:tc>
       </w:tr>
@@ -2123,10 +2459,15 @@
               <w:pStyle w:val="Compact"/>
             </w:pPr>
             <w:r>
-              <w:t>Satu buku fisik per judul, ISBN wajib dan unik, serta penghapusan pencatatan eksemplar dan fit</w:t>
-            </w:r>
-            <w:r>
-              <w:t>ur perpanjangan pinjaman.</w:t>
+              <w:t xml:space="preserve">Satu buku fisik per judul, ISBN wajib dan unik, serta penghapusan pencatatan eksemplar dan </w:t>
+            </w:r>
+            <w:proofErr w:type="spellStart"/>
+            <w:r>
+              <w:t>fitur</w:t>
+            </w:r>
+            <w:proofErr w:type="spellEnd"/>
+            <w:r>
+              <w:t xml:space="preserve"> perpanjangan pinjaman.</w:t>
             </w:r>
           </w:p>
         </w:tc>
@@ -2137,31 +2478,46 @@
         <w:pStyle w:val="Heading1"/>
       </w:pPr>
       <w:bookmarkStart w:id="4" w:name="introduction"/>
-      <w:bookmarkStart w:id="5" w:name="_Toc243850403"/>
+      <w:bookmarkStart w:id="5" w:name="_Toc244034959"/>
       <w:bookmarkEnd w:id="2"/>
       <w:r>
-        <w:t>2. Introduction</w:t>
+        <w:t xml:space="preserve">2. </w:t>
+      </w:r>
+      <w:proofErr w:type="spellStart"/>
+      <w:r>
+        <w:t>Introduction</w:t>
       </w:r>
       <w:bookmarkEnd w:id="5"/>
+      <w:proofErr w:type="spellEnd"/>
     </w:p>
     <w:p>
       <w:pPr>
         <w:pStyle w:val="Heading2"/>
       </w:pPr>
       <w:bookmarkStart w:id="6" w:name="background"/>
-      <w:bookmarkStart w:id="7" w:name="_Toc243850404"/>
-      <w:r>
-        <w:t>2.1. Background</w:t>
+      <w:bookmarkStart w:id="7" w:name="_Toc244034960"/>
+      <w:r>
+        <w:t xml:space="preserve">2.1. </w:t>
+      </w:r>
+      <w:proofErr w:type="spellStart"/>
+      <w:r>
+        <w:t>Background</w:t>
       </w:r>
       <w:bookmarkEnd w:id="7"/>
+      <w:proofErr w:type="spellEnd"/>
     </w:p>
     <w:p>
       <w:pPr>
         <w:pStyle w:val="FirstParagraph"/>
       </w:pPr>
       <w:r>
-        <w:t>Perpustakaan kampus membutuhkan aplikasi untuk mencatat koleksi buku, memproses pengajuan pinjaman, dan memantau pengembalian. Mahasiswa dapat mencari buku serta mengajukan peminjaman secara online</w:t>
-      </w:r>
+        <w:t xml:space="preserve">Perpustakaan kampus membutuhkan aplikasi untuk mencatat koleksi buku, memproses pengajuan pinjaman, dan memantau pengembalian. Mahasiswa dapat mencari buku serta mengajukan peminjaman secara </w:t>
+      </w:r>
+      <w:proofErr w:type="spellStart"/>
+      <w:r>
+        <w:t>online</w:t>
+      </w:r>
+      <w:proofErr w:type="spellEnd"/>
       <w:r>
         <w:t>. Pustakawan dapat mengelola koleksi dan mencatat transaksi dalam satu sistem.</w:t>
       </w:r>
@@ -2171,12 +2527,33 @@
         <w:pStyle w:val="Heading2"/>
       </w:pPr>
       <w:bookmarkStart w:id="8" w:name="objective-expected-improvements"/>
-      <w:bookmarkStart w:id="9" w:name="_Toc243850405"/>
+      <w:bookmarkStart w:id="9" w:name="_Toc244034961"/>
       <w:bookmarkEnd w:id="6"/>
       <w:r>
-        <w:t>2.2. Objective &amp; Expected Improvements</w:t>
+        <w:t xml:space="preserve">2.2. </w:t>
+      </w:r>
+      <w:proofErr w:type="spellStart"/>
+      <w:r>
+        <w:t>Objective</w:t>
+      </w:r>
+      <w:proofErr w:type="spellEnd"/>
+      <w:r>
+        <w:t xml:space="preserve"> &amp; </w:t>
+      </w:r>
+      <w:proofErr w:type="spellStart"/>
+      <w:r>
+        <w:t>Expected</w:t>
+      </w:r>
+      <w:proofErr w:type="spellEnd"/>
+      <w:r>
+        <w:t xml:space="preserve"> </w:t>
+      </w:r>
+      <w:proofErr w:type="spellStart"/>
+      <w:r>
+        <w:t>Improvements</w:t>
       </w:r>
       <w:bookmarkEnd w:id="9"/>
+      <w:proofErr w:type="spellEnd"/>
     </w:p>
     <w:p>
       <w:pPr>
@@ -2223,7 +2600,15 @@
         </w:numPr>
       </w:pPr>
       <w:r>
-        <w:t>Menertibkan antrean reservasi dan pencatatan denda.</w:t>
+        <w:t xml:space="preserve">Menertibkan antrean </w:t>
+      </w:r>
+      <w:proofErr w:type="spellStart"/>
+      <w:r>
+        <w:t>reservasi</w:t>
+      </w:r>
+      <w:proofErr w:type="spellEnd"/>
+      <w:r>
+        <w:t xml:space="preserve"> dan pencatatan denda.</w:t>
       </w:r>
     </w:p>
     <w:p>
@@ -2235,10 +2620,7 @@
         </w:numPr>
       </w:pPr>
       <w:r>
-        <w:t>Memungkinkan pustakawan mengubah aturan peminjaman sesuai kebutuha</w:t>
-      </w:r>
-      <w:r>
-        <w:t>n.</w:t>
+        <w:t>Memungkinkan pustakawan mengubah aturan peminjaman sesuai kebutuhan.</w:t>
       </w:r>
     </w:p>
     <w:p>
@@ -2246,23 +2628,33 @@
         <w:pStyle w:val="Heading2"/>
       </w:pPr>
       <w:bookmarkStart w:id="10" w:name="business-process-overview"/>
-      <w:bookmarkStart w:id="11" w:name="_Toc243850406"/>
+      <w:bookmarkStart w:id="11" w:name="_Toc244034962"/>
       <w:bookmarkEnd w:id="8"/>
       <w:r>
         <w:lastRenderedPageBreak/>
-        <w:t>2.3. Business Process Overview</w:t>
+        <w:t xml:space="preserve">2.3. Business </w:t>
+      </w:r>
+      <w:proofErr w:type="spellStart"/>
+      <w:r>
+        <w:t>Process</w:t>
+      </w:r>
+      <w:proofErr w:type="spellEnd"/>
+      <w:r>
+        <w:t xml:space="preserve"> </w:t>
+      </w:r>
+      <w:proofErr w:type="spellStart"/>
+      <w:r>
+        <w:t>Overview</w:t>
       </w:r>
       <w:bookmarkEnd w:id="11"/>
+      <w:proofErr w:type="spellEnd"/>
     </w:p>
     <w:p>
       <w:pPr>
         <w:pStyle w:val="FirstParagraph"/>
       </w:pPr>
       <w:r>
-        <w:t xml:space="preserve">Mahasiswa masuk ke aplikasi, mencari buku, lalu mengajukan pinjaman. Sistem menempatkan pengajuan pada daftar tunggu atau antrean sesuai ketersediaan. Pustakawan memeriksa pengajuan berdasarkan urutan masuk dan menyiapkan </w:t>
-      </w:r>
-      <w:r>
-        <w:t>buku yang disetujui.</w:t>
+        <w:t>Mahasiswa masuk ke aplikasi, mencari buku, lalu mengajukan pinjaman. Sistem menempatkan pengajuan pada daftar tunggu atau antrean sesuai ketersediaan. Pustakawan memeriksa pengajuan berdasarkan urutan masuk dan menyiapkan buku yang disetujui.</w:t>
       </w:r>
     </w:p>
     <w:p>
@@ -2278,21 +2670,31 @@
         <w:pStyle w:val="Heading3"/>
       </w:pPr>
       <w:bookmarkStart w:id="12" w:name="current-business-process"/>
-      <w:bookmarkStart w:id="13" w:name="_Toc243850407"/>
-      <w:r>
-        <w:t>2.3.1. Current Business Process</w:t>
+      <w:bookmarkStart w:id="13" w:name="_Toc244034963"/>
+      <w:r>
+        <w:t xml:space="preserve">2.3.1. </w:t>
+      </w:r>
+      <w:proofErr w:type="spellStart"/>
+      <w:r>
+        <w:t>Current</w:t>
+      </w:r>
+      <w:proofErr w:type="spellEnd"/>
+      <w:r>
+        <w:t xml:space="preserve"> Business </w:t>
+      </w:r>
+      <w:proofErr w:type="spellStart"/>
+      <w:r>
+        <w:t>Process</w:t>
       </w:r>
       <w:bookmarkEnd w:id="13"/>
+      <w:proofErr w:type="spellEnd"/>
     </w:p>
     <w:p>
       <w:pPr>
         <w:pStyle w:val="FirstParagraph"/>
       </w:pPr>
       <w:r>
-        <w:t>Proses</w:t>
-      </w:r>
-      <w:r>
-        <w:t xml:space="preserve"> yang digunakan perpustakaan saat ini belum dikonfirmasi melalui observasi. Pencatatan manual, seperti pemeriksaan buku di rak dan pencatatan transaksi oleh pustakawan, hanya menjadi gambaran pembanding bagi rancangan aplikasi.</w:t>
+        <w:t>Proses yang digunakan perpustakaan saat ini belum dikonfirmasi melalui observasi. Pencatatan manual, seperti pemeriksaan buku di rak dan pencatatan transaksi oleh pustakawan, hanya menjadi gambaran pembanding bagi rancangan aplikasi.</w:t>
       </w:r>
     </w:p>
     <w:p>
@@ -2300,25 +2702,35 @@
         <w:pStyle w:val="Heading1"/>
       </w:pPr>
       <w:bookmarkStart w:id="14" w:name="scope"/>
-      <w:bookmarkStart w:id="15" w:name="_Toc243850408"/>
+      <w:bookmarkStart w:id="15" w:name="_Toc244034964"/>
+      <w:bookmarkEnd w:id="4"/>
+      <w:bookmarkEnd w:id="10"/>
       <w:bookmarkEnd w:id="12"/>
-      <w:bookmarkEnd w:id="10"/>
-      <w:bookmarkEnd w:id="4"/>
-      <w:r>
-        <w:t>3. Scope</w:t>
+      <w:r>
+        <w:t xml:space="preserve">3. </w:t>
+      </w:r>
+      <w:proofErr w:type="spellStart"/>
+      <w:r>
+        <w:t>Scope</w:t>
       </w:r>
       <w:bookmarkEnd w:id="15"/>
+      <w:proofErr w:type="spellEnd"/>
     </w:p>
     <w:p>
       <w:pPr>
         <w:pStyle w:val="Heading2"/>
       </w:pPr>
       <w:bookmarkStart w:id="16" w:name="in-scope"/>
-      <w:bookmarkStart w:id="17" w:name="_Toc243850409"/>
-      <w:r>
-        <w:t>3.1. In Scope</w:t>
+      <w:bookmarkStart w:id="17" w:name="_Toc244034965"/>
+      <w:r>
+        <w:t xml:space="preserve">3.1. In </w:t>
+      </w:r>
+      <w:proofErr w:type="spellStart"/>
+      <w:r>
+        <w:t>Scope</w:t>
       </w:r>
       <w:bookmarkEnd w:id="17"/>
+      <w:proofErr w:type="spellEnd"/>
     </w:p>
     <w:p>
       <w:pPr>
@@ -2329,10 +2741,7 @@
         </w:numPr>
       </w:pPr>
       <w:r>
-        <w:t xml:space="preserve">Akun </w:t>
-      </w:r>
-      <w:r>
-        <w:t>mahasiswa dan pustakawan dengan hak akses berbeda.</w:t>
+        <w:t>Akun mahasiswa dan pustakawan dengan hak akses berbeda.</w:t>
       </w:r>
     </w:p>
     <w:p>
@@ -2368,7 +2777,23 @@
         </w:numPr>
       </w:pPr>
       <w:r>
-        <w:t>Pengajuan pinjaman online, persetujuan, pembatalan, dan antrean reservasi.</w:t>
+        <w:t xml:space="preserve">Pengajuan pinjaman </w:t>
+      </w:r>
+      <w:proofErr w:type="spellStart"/>
+      <w:r>
+        <w:t>online</w:t>
+      </w:r>
+      <w:proofErr w:type="spellEnd"/>
+      <w:r>
+        <w:t xml:space="preserve">, persetujuan, pembatalan, dan antrean </w:t>
+      </w:r>
+      <w:proofErr w:type="spellStart"/>
+      <w:r>
+        <w:t>reservasi</w:t>
+      </w:r>
+      <w:proofErr w:type="spellEnd"/>
+      <w:r>
+        <w:t>.</w:t>
       </w:r>
     </w:p>
     <w:p>
@@ -2380,10 +2805,7 @@
         </w:numPr>
       </w:pPr>
       <w:r>
-        <w:t>Pencatatan pengam</w:t>
-      </w:r>
-      <w:r>
-        <w:t>bilan buku, pengembalian, serta riwayat pinjaman.</w:t>
+        <w:t>Pencatatan pengambilan buku, pengembalian, serta riwayat pinjaman.</w:t>
       </w:r>
     </w:p>
     <w:p>
@@ -2415,12 +2837,33 @@
         <w:pStyle w:val="Heading2"/>
       </w:pPr>
       <w:bookmarkStart w:id="18" w:name="out-of-scope"/>
-      <w:bookmarkStart w:id="19" w:name="_Toc243850410"/>
+      <w:bookmarkStart w:id="19" w:name="_Toc244034966"/>
       <w:bookmarkEnd w:id="16"/>
       <w:r>
-        <w:t>3.2. Out of Scope</w:t>
+        <w:t xml:space="preserve">3.2. </w:t>
+      </w:r>
+      <w:proofErr w:type="spellStart"/>
+      <w:r>
+        <w:t>Out</w:t>
+      </w:r>
+      <w:proofErr w:type="spellEnd"/>
+      <w:r>
+        <w:t xml:space="preserve"> </w:t>
+      </w:r>
+      <w:proofErr w:type="spellStart"/>
+      <w:r>
+        <w:t>of</w:t>
+      </w:r>
+      <w:proofErr w:type="spellEnd"/>
+      <w:r>
+        <w:t xml:space="preserve"> </w:t>
+      </w:r>
+      <w:proofErr w:type="spellStart"/>
+      <w:r>
+        <w:t>Scope</w:t>
       </w:r>
       <w:bookmarkEnd w:id="19"/>
+      <w:proofErr w:type="spellEnd"/>
     </w:p>
     <w:p>
       <w:pPr>
@@ -2431,7 +2874,15 @@
         </w:numPr>
       </w:pPr>
       <w:r>
-        <w:t>Aplikasi seluler native, buku elektronik, dan layanan lintas perpustakaan.</w:t>
+        <w:t xml:space="preserve">Aplikasi seluler </w:t>
+      </w:r>
+      <w:proofErr w:type="spellStart"/>
+      <w:r>
+        <w:t>native</w:t>
+      </w:r>
+      <w:proofErr w:type="spellEnd"/>
+      <w:r>
+        <w:t>, buku elektronik, dan layanan lintas perpustakaan.</w:t>
       </w:r>
     </w:p>
     <w:p>
@@ -2443,10 +2894,23 @@
         </w:numPr>
       </w:pPr>
       <w:r>
-        <w:t>Inte</w:t>
-      </w:r>
-      <w:r>
-        <w:t>grasi sistem akademik, SSO kampus, RFID, dan payment gateway.</w:t>
+        <w:t xml:space="preserve">Integrasi sistem akademik, SSO kampus, RFID, dan </w:t>
+      </w:r>
+      <w:proofErr w:type="spellStart"/>
+      <w:r>
+        <w:t>payment</w:t>
+      </w:r>
+      <w:proofErr w:type="spellEnd"/>
+      <w:r>
+        <w:t xml:space="preserve"> </w:t>
+      </w:r>
+      <w:proofErr w:type="spellStart"/>
+      <w:r>
+        <w:t>gateway</w:t>
+      </w:r>
+      <w:proofErr w:type="spellEnd"/>
+      <w:r>
+        <w:t>.</w:t>
       </w:r>
     </w:p>
     <w:p>
@@ -2458,7 +2922,15 @@
         </w:numPr>
       </w:pPr>
       <w:r>
-        <w:t>Pembayaran online, cicilan, serta penghapusan denda.</w:t>
+        <w:t xml:space="preserve">Pembayaran </w:t>
+      </w:r>
+      <w:proofErr w:type="spellStart"/>
+      <w:r>
+        <w:t>online</w:t>
+      </w:r>
+      <w:proofErr w:type="spellEnd"/>
+      <w:r>
+        <w:t>, cicilan, serta penghapusan denda.</w:t>
       </w:r>
     </w:p>
     <w:p>
@@ -2482,7 +2954,15 @@
         </w:numPr>
       </w:pPr>
       <w:r>
-        <w:t>Notifikasi melalui email, SMS, atau WhatsApp. Status tersedia dalam aplikasi.</w:t>
+        <w:t xml:space="preserve">Notifikasi melalui email, SMS, atau </w:t>
+      </w:r>
+      <w:proofErr w:type="spellStart"/>
+      <w:r>
+        <w:t>WhatsApp</w:t>
+      </w:r>
+      <w:proofErr w:type="spellEnd"/>
+      <w:r>
+        <w:t>. Status tersedia dalam aplikasi.</w:t>
       </w:r>
     </w:p>
     <w:p>
@@ -2502,24 +2982,34 @@
         <w:pStyle w:val="Heading1"/>
       </w:pPr>
       <w:bookmarkStart w:id="20" w:name="system-perspective"/>
-      <w:bookmarkStart w:id="21" w:name="_Toc243850411"/>
+      <w:bookmarkStart w:id="21" w:name="_Toc244034967"/>
+      <w:bookmarkEnd w:id="14"/>
       <w:bookmarkEnd w:id="18"/>
-      <w:bookmarkEnd w:id="14"/>
-      <w:r>
-        <w:t>4. System Perspective</w:t>
+      <w:r>
+        <w:t xml:space="preserve">4. System </w:t>
+      </w:r>
+      <w:proofErr w:type="spellStart"/>
+      <w:r>
+        <w:t>Perspective</w:t>
       </w:r>
       <w:bookmarkEnd w:id="21"/>
+      <w:proofErr w:type="spellEnd"/>
     </w:p>
     <w:p>
       <w:pPr>
         <w:pStyle w:val="Heading2"/>
       </w:pPr>
       <w:bookmarkStart w:id="22" w:name="assumptions"/>
-      <w:bookmarkStart w:id="23" w:name="_Toc243850412"/>
-      <w:r>
-        <w:t>4.1. Assumptions</w:t>
+      <w:bookmarkStart w:id="23" w:name="_Toc244034968"/>
+      <w:r>
+        <w:t xml:space="preserve">4.1. </w:t>
+      </w:r>
+      <w:proofErr w:type="spellStart"/>
+      <w:r>
+        <w:t>Assumptions</w:t>
       </w:r>
       <w:bookmarkEnd w:id="23"/>
+      <w:proofErr w:type="spellEnd"/>
     </w:p>
     <w:p>
       <w:pPr>
@@ -2566,10 +3056,7 @@
         </w:numPr>
       </w:pPr>
       <w:r>
-        <w:t>Akun mahasiswa dikelola pustakawan. Akun pustakawan pertama disiapk</w:t>
-      </w:r>
-      <w:r>
-        <w:t>an pengelola teknis.</w:t>
+        <w:t>Akun mahasiswa dikelola pustakawan. Akun pustakawan pertama disiapkan pengelola teknis.</w:t>
       </w:r>
     </w:p>
     <w:p>
@@ -2590,22 +3077,24 @@
         <w:pStyle w:val="Heading2"/>
       </w:pPr>
       <w:bookmarkStart w:id="24" w:name="exclusions"/>
-      <w:bookmarkStart w:id="25" w:name="_Toc243850413"/>
+      <w:bookmarkStart w:id="25" w:name="_Toc244034969"/>
       <w:bookmarkEnd w:id="22"/>
       <w:r>
-        <w:t>4.2. Exclusions</w:t>
+        <w:t xml:space="preserve">4.2. </w:t>
+      </w:r>
+      <w:proofErr w:type="spellStart"/>
+      <w:r>
+        <w:t>Exclusions</w:t>
       </w:r>
       <w:bookmarkEnd w:id="25"/>
+      <w:proofErr w:type="spellEnd"/>
     </w:p>
     <w:p>
       <w:pPr>
         <w:pStyle w:val="FirstParagraph"/>
       </w:pPr>
       <w:r>
-        <w:t>Pemeriksaan fisik buku dan penerimaan pembayaran tetap dilakukan pustakawan. Aplikasi hanya mencatat hasilnya. Pembayaran denda dilakukan di lua</w:t>
-      </w:r>
-      <w:r>
-        <w:t>r aplikasi dan dicatat setelah lunas. Migrasi data lama serta pemeliharaan perangkat keras tidak termasuk dalam proyek awal.</w:t>
+        <w:t>Pemeriksaan fisik buku dan penerimaan pembayaran tetap dilakukan pustakawan. Aplikasi hanya mencatat hasilnya. Pembayaran denda dilakukan di luar aplikasi dan dicatat setelah lunas. Migrasi data lama serta pemeliharaan perangkat keras tidak termasuk dalam proyek awal.</w:t>
       </w:r>
     </w:p>
     <w:p>
@@ -2613,12 +3102,17 @@
         <w:pStyle w:val="Heading2"/>
       </w:pPr>
       <w:bookmarkStart w:id="26" w:name="constraints"/>
-      <w:bookmarkStart w:id="27" w:name="_Toc243850414"/>
+      <w:bookmarkStart w:id="27" w:name="_Toc244034970"/>
       <w:bookmarkEnd w:id="24"/>
       <w:r>
-        <w:t>4.3. Constraints</w:t>
+        <w:t xml:space="preserve">4.3. </w:t>
+      </w:r>
+      <w:proofErr w:type="spellStart"/>
+      <w:r>
+        <w:t>Constraints</w:t>
       </w:r>
       <w:bookmarkEnd w:id="27"/>
+      <w:proofErr w:type="spellEnd"/>
     </w:p>
     <w:p>
       <w:pPr>
@@ -2641,10 +3135,7 @@
         </w:numPr>
       </w:pPr>
       <w:r>
-        <w:t>Satu data buku mewakili satu buku fisik deng</w:t>
-      </w:r>
-      <w:r>
-        <w:t>an ISBN wajib dan unik. Setiap pengajuan memuat satu buku dan menghasilkan paling banyak satu pinjaman.</w:t>
+        <w:t>Satu data buku mewakili satu buku fisik dengan ISBN wajib dan unik. Setiap pengajuan memuat satu buku dan menghasilkan paling banyak satu pinjaman.</w:t>
       </w:r>
     </w:p>
     <w:p>
@@ -2676,27 +3167,42 @@
         <w:pStyle w:val="Heading1"/>
       </w:pPr>
       <w:bookmarkStart w:id="28" w:name="business-requirements"/>
-      <w:bookmarkStart w:id="29" w:name="_Toc243850415"/>
+      <w:bookmarkStart w:id="29" w:name="_Toc244034971"/>
+      <w:bookmarkEnd w:id="20"/>
       <w:bookmarkEnd w:id="26"/>
-      <w:bookmarkEnd w:id="20"/>
-      <w:r>
-        <w:t>5. Business Req</w:t>
-      </w:r>
-      <w:r>
-        <w:t>uirements</w:t>
+      <w:r>
+        <w:t xml:space="preserve">5. Business </w:t>
+      </w:r>
+      <w:proofErr w:type="spellStart"/>
+      <w:r>
+        <w:t>Requirements</w:t>
       </w:r>
       <w:bookmarkEnd w:id="29"/>
+      <w:proofErr w:type="spellEnd"/>
     </w:p>
     <w:p>
       <w:pPr>
         <w:pStyle w:val="Heading2"/>
       </w:pPr>
       <w:bookmarkStart w:id="30" w:name="functional-requirements"/>
-      <w:bookmarkStart w:id="31" w:name="_Toc243850416"/>
-      <w:r>
-        <w:t>5.1. Functional Requirements</w:t>
+      <w:bookmarkStart w:id="31" w:name="_Toc244034972"/>
+      <w:r>
+        <w:t xml:space="preserve">5.1. </w:t>
+      </w:r>
+      <w:proofErr w:type="spellStart"/>
+      <w:r>
+        <w:t>Functional</w:t>
+      </w:r>
+      <w:proofErr w:type="spellEnd"/>
+      <w:r>
+        <w:t xml:space="preserve"> </w:t>
+      </w:r>
+      <w:proofErr w:type="spellStart"/>
+      <w:r>
+        <w:t>Requirements</w:t>
       </w:r>
       <w:bookmarkEnd w:id="31"/>
+      <w:proofErr w:type="spellEnd"/>
     </w:p>
     <w:p>
       <w:pPr>
@@ -2711,7 +3217,23 @@
           <w:b/>
           <w:bCs/>
         </w:rPr>
-        <w:t>FR-01. Autentikasi.</w:t>
+        <w:t xml:space="preserve">FR-01. </w:t>
+      </w:r>
+      <w:proofErr w:type="spellStart"/>
+      <w:r>
+        <w:rPr>
+          <w:b/>
+          <w:bCs/>
+        </w:rPr>
+        <w:t>Autentikasi</w:t>
+      </w:r>
+      <w:proofErr w:type="spellEnd"/>
+      <w:r>
+        <w:rPr>
+          <w:b/>
+          <w:bCs/>
+        </w:rPr>
+        <w:t>.</w:t>
       </w:r>
       <w:r>
         <w:t xml:space="preserve"> Pengguna dapat masuk dan keluar. Akses dibatasi berdasarkan peran, status akun, dan kepemilikan transaksi.</w:t>
@@ -2733,10 +3255,7 @@
         <w:t>FR-02. Data mahasiswa.</w:t>
       </w:r>
       <w:r>
-        <w:t xml:space="preserve"> Pustakawan dapat menambah, memperbarui, dan menonaktifkan akun maha</w:t>
-      </w:r>
-      <w:r>
-        <w:t>siswa. NIM dan email harus unik.</w:t>
+        <w:t xml:space="preserve"> Pustakawan dapat menambah, memperbarui, dan menonaktifkan akun mahasiswa. NIM dan email harus unik.</w:t>
       </w:r>
     </w:p>
     <w:p>
@@ -2774,10 +3293,7 @@
         <w:t>FR-04. Ketersediaan buku.</w:t>
       </w:r>
       <w:r>
-        <w:t xml:space="preserve"> Satu judul hanya memil</w:t>
-      </w:r>
-      <w:r>
-        <w:t>iki satu buku fisik. Buku tersedia jika aktif, belum disiapkan untuk pengambilan, dan tidak sedang dipinjam. Tidak ada tabel eksemplar, kode inventaris, atau jumlah stok.</w:t>
+        <w:t xml:space="preserve"> Satu judul hanya memiliki satu buku fisik. Buku tersedia jika aktif, belum disiapkan untuk pengambilan, dan tidak sedang dipinjam. Tidak ada tabel eksemplar, kode inventaris, atau jumlah stok.</w:t>
       </w:r>
     </w:p>
     <w:p>
@@ -2796,10 +3312,7 @@
         <w:t>FR-05. Katalog.</w:t>
       </w:r>
       <w:r>
-        <w:t xml:space="preserve"> Pengguna dapat mencari buku dan melihat status tersedia, siap diambil</w:t>
-      </w:r>
-      <w:r>
-        <w:t>, dipinjam, atau nonaktif.</w:t>
+        <w:t xml:space="preserve"> Pengguna dapat mencari buku dan melihat status tersedia, siap diambil, dipinjam, atau nonaktif.</w:t>
       </w:r>
     </w:p>
     <w:p>
@@ -2815,7 +3328,23 @@
           <w:b/>
           <w:bCs/>
         </w:rPr>
-        <w:t>FR-06. Pengajuan online.</w:t>
+        <w:t xml:space="preserve">FR-06. Pengajuan </w:t>
+      </w:r>
+      <w:proofErr w:type="spellStart"/>
+      <w:r>
+        <w:rPr>
+          <w:b/>
+          <w:bCs/>
+        </w:rPr>
+        <w:t>online</w:t>
+      </w:r>
+      <w:proofErr w:type="spellEnd"/>
+      <w:r>
+        <w:rPr>
+          <w:b/>
+          <w:bCs/>
+        </w:rPr>
+        <w:t>.</w:t>
       </w:r>
       <w:r>
         <w:t xml:space="preserve"> Mahasiswa dapat mengajukan pinjaman dan melihat status pengajuannya.</w:t>
@@ -2834,7 +3363,23 @@
           <w:b/>
           <w:bCs/>
         </w:rPr>
-        <w:t>FR-07. Antrean reservasi.</w:t>
+        <w:t xml:space="preserve">FR-07. Antrean </w:t>
+      </w:r>
+      <w:proofErr w:type="spellStart"/>
+      <w:r>
+        <w:rPr>
+          <w:b/>
+          <w:bCs/>
+        </w:rPr>
+        <w:t>reservasi</w:t>
+      </w:r>
+      <w:proofErr w:type="spellEnd"/>
+      <w:r>
+        <w:rPr>
+          <w:b/>
+          <w:bCs/>
+        </w:rPr>
+        <w:t>.</w:t>
       </w:r>
       <w:r>
         <w:t xml:space="preserve"> Sistem mengurutkan pengajuan per judul berdasarkan waktu masuk.</w:t>
@@ -2856,10 +3401,7 @@
         <w:t>FR-08. Persetujuan.</w:t>
       </w:r>
       <w:r>
-        <w:t xml:space="preserve"> Pustakawan dapat menyetuj</w:t>
-      </w:r>
-      <w:r>
-        <w:t>ui atau menolak pengajuan dengan alasan yang jelas.</w:t>
+        <w:t xml:space="preserve"> Pustakawan dapat menyetujui atau menolak pengajuan dengan alasan yang jelas.</w:t>
       </w:r>
     </w:p>
     <w:p>
@@ -2897,10 +3439,7 @@
         <w:t>FR-10. Penyerahan.</w:t>
       </w:r>
       <w:r>
-        <w:t xml:space="preserve"> Pustakawan mencatat pengambilan buku</w:t>
-      </w:r>
-      <w:r>
-        <w:t>. Sistem membuat pinjaman dan menetapkan tanggal jatuh tempo.</w:t>
+        <w:t xml:space="preserve"> Pustakawan mencatat pengambilan buku. Sistem membuat pinjaman dan menetapkan tanggal jatuh tempo.</w:t>
       </w:r>
     </w:p>
     <w:p>
@@ -2939,10 +3478,7 @@
         <w:t>FR-12. Denda.</w:t>
       </w:r>
       <w:r>
-        <w:t xml:space="preserve"> Sistem menghitung denda keterlambatan. Pustakawan mencatat pelunasan penuh beserta </w:t>
-      </w:r>
-      <w:r>
-        <w:t>referensi pembayaran.</w:t>
+        <w:t xml:space="preserve"> Sistem menghitung denda keterlambatan. Pustakawan mencatat pelunasan penuh beserta referensi pembayaran.</w:t>
       </w:r>
     </w:p>
     <w:p>
@@ -2980,10 +3516,7 @@
         <w:t>FR-14. Ringkasan dan riwayat.</w:t>
       </w:r>
       <w:r>
-        <w:t xml:space="preserve"> </w:t>
-      </w:r>
-      <w:r>
-        <w:t>Pustakawan dapat melihat seluruh transaksi. Mahasiswa hanya dapat melihat transaksi miliknya.</w:t>
+        <w:t xml:space="preserve"> Pustakawan dapat melihat seluruh transaksi. Mahasiswa hanya dapat melihat transaksi miliknya.</w:t>
       </w:r>
     </w:p>
     <w:p>
@@ -3032,8 +3565,13 @@
               <w:pStyle w:val="Compact"/>
             </w:pPr>
             <w:r>
-              <w:t>Business rule</w:t>
-            </w:r>
+              <w:t xml:space="preserve">Business </w:t>
+            </w:r>
+            <w:proofErr w:type="spellStart"/>
+            <w:r>
+              <w:t>rule</w:t>
+            </w:r>
+            <w:proofErr w:type="spellEnd"/>
           </w:p>
         </w:tc>
         <w:tc>
@@ -3050,9 +3588,19 @@
             <w:pPr>
               <w:pStyle w:val="Compact"/>
             </w:pPr>
-            <w:r>
-              <w:t>Initial value</w:t>
-            </w:r>
+            <w:proofErr w:type="spellStart"/>
+            <w:r>
+              <w:t>Initial</w:t>
+            </w:r>
+            <w:proofErr w:type="spellEnd"/>
+            <w:r>
+              <w:t xml:space="preserve"> </w:t>
+            </w:r>
+            <w:proofErr w:type="spellStart"/>
+            <w:r>
+              <w:t>value</w:t>
+            </w:r>
+            <w:proofErr w:type="spellEnd"/>
           </w:p>
         </w:tc>
       </w:tr>
@@ -3131,10 +3679,7 @@
               <w:pStyle w:val="Compact"/>
             </w:pPr>
             <w:r>
-              <w:t>5 hari kalender sejak penyerah</w:t>
-            </w:r>
-            <w:r>
-              <w:t>an</w:t>
+              <w:t>5 hari kalender sejak penyerahan</w:t>
             </w:r>
           </w:p>
         </w:tc>
@@ -3225,10 +3770,7 @@
         <w:pStyle w:val="BodyText"/>
       </w:pPr>
       <w:r>
-        <w:t xml:space="preserve">Kuota terpakai mencakup buku yang sedang dipinjam dan buku yang sudah disiapkan. Pengajuan yang masih menunggu atau mengantre belum memakai kuota. Akun nonaktif, pinjaman terlambat, denda belum lunas, kuota penuh, atau pengajuan ganda menghalangi pinjaman </w:t>
-      </w:r>
-      <w:r>
-        <w:t>baru. Sistem memeriksa ulang kelayakan saat persetujuan dan penyerahan.</w:t>
+        <w:t>Kuota terpakai mencakup buku yang sedang dipinjam dan buku yang sudah disiapkan. Pengajuan yang masih menunggu atau mengantre belum memakai kuota. Akun nonaktif, pinjaman terlambat, denda belum lunas, kuota penuh, atau pengajuan ganda menghalangi pinjaman baru. Sistem memeriksa ulang kelayakan saat persetujuan dan penyerahan.</w:t>
       </w:r>
     </w:p>
     <w:p>
@@ -3236,7 +3778,15 @@
         <w:pStyle w:val="BodyText"/>
       </w:pPr>
       <w:r>
-        <w:t>Batas pengambilan dan jatuh tempo berlaku sampai akhir tanggal yang ditetapkan dalam WIB. Fitur perpanjangan pinjaman tidak termasuk dalam rancangan ini.</w:t>
+        <w:t xml:space="preserve">Batas pengambilan dan jatuh tempo berlaku sampai akhir tanggal yang ditetapkan dalam WIB. </w:t>
+      </w:r>
+      <w:proofErr w:type="spellStart"/>
+      <w:r>
+        <w:t>Fitur</w:t>
+      </w:r>
+      <w:proofErr w:type="spellEnd"/>
+      <w:r>
+        <w:t xml:space="preserve"> perpanjangan pinjaman tidak termasuk dalam rancangan ini.</w:t>
       </w:r>
     </w:p>
     <w:p>
@@ -3244,15 +3794,25 @@
         <w:pStyle w:val="Heading2"/>
       </w:pPr>
       <w:bookmarkStart w:id="32" w:name="non-functional-requirements"/>
-      <w:bookmarkStart w:id="33" w:name="_Toc243850417"/>
+      <w:bookmarkStart w:id="33" w:name="_Toc244034973"/>
       <w:bookmarkEnd w:id="30"/>
       <w:r>
-        <w:t>5.2. Non-functional Requiremen</w:t>
-      </w:r>
-      <w:r>
-        <w:t>ts</w:t>
+        <w:t>5.2. Non-</w:t>
+      </w:r>
+      <w:proofErr w:type="spellStart"/>
+      <w:r>
+        <w:t>functional</w:t>
+      </w:r>
+      <w:proofErr w:type="spellEnd"/>
+      <w:r>
+        <w:t xml:space="preserve"> </w:t>
+      </w:r>
+      <w:proofErr w:type="spellStart"/>
+      <w:r>
+        <w:t>Requirements</w:t>
       </w:r>
       <w:bookmarkEnd w:id="33"/>
+      <w:proofErr w:type="spellEnd"/>
     </w:p>
     <w:p>
       <w:pPr>
@@ -3270,7 +3830,23 @@
         <w:t>NFR-01. Keamanan.</w:t>
       </w:r>
       <w:r>
-        <w:t xml:space="preserve"> Kata sandi disimpan sebagai hash. Sistem memeriksa hak akses pada server dan menggunakan HTTPS saat digunakan secara online.</w:t>
+        <w:t xml:space="preserve"> Kata sandi disimpan sebagai </w:t>
+      </w:r>
+      <w:proofErr w:type="spellStart"/>
+      <w:r>
+        <w:t>hash</w:t>
+      </w:r>
+      <w:proofErr w:type="spellEnd"/>
+      <w:r>
+        <w:t xml:space="preserve">. Sistem memeriksa hak akses pada server dan menggunakan HTTPS saat digunakan secara </w:t>
+      </w:r>
+      <w:proofErr w:type="spellStart"/>
+      <w:r>
+        <w:t>online</w:t>
+      </w:r>
+      <w:proofErr w:type="spellEnd"/>
+      <w:r>
+        <w:t>.</w:t>
       </w:r>
     </w:p>
     <w:p>
@@ -3289,10 +3865,7 @@
         <w:t>NFR-02. Integritas data.</w:t>
       </w:r>
       <w:r>
-        <w:t xml:space="preserve"> Satu buku tidak dapat disiapkan atau dipinjam oleh dua mahasiswa bersamaan. ISBN waji</w:t>
-      </w:r>
-      <w:r>
-        <w:t>b unik. Pengiriman ulang transaksi tidak menggandakan pencatatan.</w:t>
+        <w:t xml:space="preserve"> Satu buku tidak dapat disiapkan atau dipinjam oleh dua mahasiswa bersamaan. ISBN wajib unik. Pengiriman ulang transaksi tidak menggandakan pencatatan.</w:t>
       </w:r>
     </w:p>
     <w:p>
@@ -3327,14 +3900,7 @@
           <w:b/>
           <w:bCs/>
         </w:rPr>
-        <w:t>NFR-04. Kemudah</w:t>
-      </w:r>
-      <w:r>
-        <w:rPr>
-          <w:b/>
-          <w:bCs/>
-        </w:rPr>
-        <w:t>an penggunaan.</w:t>
+        <w:t>NFR-04. Kemudahan penggunaan.</w:t>
       </w:r>
       <w:r>
         <w:t xml:space="preserve"> Tampilan dapat digunakan pada komputer dan ponsel, dengan formulir berlabel serta pesan kesalahan yang jelas.</w:t>
@@ -3375,10 +3941,7 @@
         <w:t>NFR-06. Ketepatan waktu.</w:t>
       </w:r>
       <w:r>
-        <w:t xml:space="preserve"> Perhitungan</w:t>
-      </w:r>
-      <w:r>
-        <w:t xml:space="preserve"> jatuh tempo, pengambilan, dan keterlambatan konsisten dalam zona waktu Asia/Jakarta.</w:t>
+        <w:t xml:space="preserve"> Perhitungan jatuh tempo, pengambilan, dan keterlambatan konsisten dalam zona waktu Asia/Jakarta.</w:t>
       </w:r>
     </w:p>
     <w:p>
@@ -3405,36 +3968,251 @@
         <w:pStyle w:val="FirstParagraph"/>
       </w:pPr>
       <w:r>
-        <w:t>Target tersebut menjadi acuan pengujian saat implementasi.</w:t>
-      </w:r>
-      <w:r>
-        <w:t xml:space="preserve"> Aplikasi belum dibangun atau diuji. Rincian aturan, skenario penerimaan, dan hubungan kebutuhan dengan diagram tersedia pada dokumen Spesifikasi-detail.md. ERD dan diagram sequence disediakan terpisah.</w:t>
+        <w:t>Target tersebut menjadi acuan pengujian saat implementasi. Aplikasi belum dibangun atau diuji. ERD lengkap tersedia pada bagian 5.3.</w:t>
+      </w:r>
+    </w:p>
+    <w:p>
+      <w:pPr>
+        <w:pStyle w:val="Heading2"/>
+      </w:pPr>
+      <w:bookmarkStart w:id="34" w:name="entity-relationship-diagram"/>
+      <w:bookmarkStart w:id="35" w:name="_Toc244034974"/>
+      <w:bookmarkEnd w:id="32"/>
+      <w:r>
+        <w:lastRenderedPageBreak/>
+        <w:t xml:space="preserve">5.3. </w:t>
+      </w:r>
+      <w:proofErr w:type="spellStart"/>
+      <w:r>
+        <w:t>Entity</w:t>
+      </w:r>
+      <w:proofErr w:type="spellEnd"/>
+      <w:r>
+        <w:t xml:space="preserve"> </w:t>
+      </w:r>
+      <w:proofErr w:type="spellStart"/>
+      <w:r>
+        <w:t>Relationship</w:t>
+      </w:r>
+      <w:proofErr w:type="spellEnd"/>
+      <w:r>
+        <w:t xml:space="preserve"> Diagram</w:t>
+      </w:r>
+      <w:bookmarkEnd w:id="35"/>
+    </w:p>
+    <w:p>
+      <w:pPr>
+        <w:pStyle w:val="FirstParagraph"/>
+      </w:pPr>
+      <w:r>
+        <w:t xml:space="preserve">ERD berikut menggabungkan seluruh 7 tabel dan 12 relasi dalam satu diagram. Setiap tabel menampilkan seluruh atribut, tipe data, dan kuncinya. PK adalah </w:t>
+      </w:r>
+      <w:proofErr w:type="spellStart"/>
+      <w:r>
+        <w:t>primary</w:t>
+      </w:r>
+      <w:proofErr w:type="spellEnd"/>
+      <w:r>
+        <w:t xml:space="preserve"> </w:t>
+      </w:r>
+      <w:proofErr w:type="spellStart"/>
+      <w:r>
+        <w:t>key</w:t>
+      </w:r>
+      <w:proofErr w:type="spellEnd"/>
+      <w:r>
+        <w:t xml:space="preserve">, FK adalah </w:t>
+      </w:r>
+      <w:proofErr w:type="spellStart"/>
+      <w:r>
+        <w:t>foreign</w:t>
+      </w:r>
+      <w:proofErr w:type="spellEnd"/>
+      <w:r>
+        <w:t xml:space="preserve"> </w:t>
+      </w:r>
+      <w:proofErr w:type="spellStart"/>
+      <w:r>
+        <w:t>key</w:t>
+      </w:r>
+      <w:proofErr w:type="spellEnd"/>
+      <w:r>
+        <w:t xml:space="preserve">, UK adalah </w:t>
+      </w:r>
+      <w:proofErr w:type="spellStart"/>
+      <w:r>
+        <w:t>unique</w:t>
+      </w:r>
+      <w:proofErr w:type="spellEnd"/>
+      <w:r>
+        <w:t xml:space="preserve"> </w:t>
+      </w:r>
+      <w:proofErr w:type="spellStart"/>
+      <w:r>
+        <w:t>key</w:t>
+      </w:r>
+      <w:proofErr w:type="spellEnd"/>
+      <w:r>
+        <w:t xml:space="preserve">, dan tanda ? menunjukkan nilai yang boleh kosong. Simbol </w:t>
+      </w:r>
+      <w:proofErr w:type="spellStart"/>
+      <w:r>
+        <w:t>Crow’s</w:t>
+      </w:r>
+      <w:proofErr w:type="spellEnd"/>
+      <w:r>
+        <w:t xml:space="preserve"> </w:t>
+      </w:r>
+      <w:proofErr w:type="spellStart"/>
+      <w:r>
+        <w:t>Foot</w:t>
+      </w:r>
+      <w:proofErr w:type="spellEnd"/>
+      <w:r>
+        <w:t xml:space="preserve"> menunjukkan tepat satu, nol atau satu, serta nol atau banyak.</w:t>
+      </w:r>
+    </w:p>
+    <w:p>
+      <w:pPr>
+        <w:pStyle w:val="BodyText"/>
+      </w:pPr>
+      <w:r>
+        <w:t xml:space="preserve">Satu data buku mewakili satu buku fisik dengan ISBN wajib dan unik. Setiap pengajuan menghasilkan paling banyak satu pinjaman dan setiap pinjaman memiliki paling banyak satu denda. Kebijakan disimpan per versi. </w:t>
+      </w:r>
+      <w:proofErr w:type="spellStart"/>
+      <w:r>
+        <w:t>Foreign</w:t>
+      </w:r>
+      <w:proofErr w:type="spellEnd"/>
+      <w:r>
+        <w:t xml:space="preserve"> </w:t>
+      </w:r>
+      <w:proofErr w:type="spellStart"/>
+      <w:r>
+        <w:t>key</w:t>
+      </w:r>
+      <w:proofErr w:type="spellEnd"/>
+      <w:r>
+        <w:t xml:space="preserve"> petugas merujuk pengguna dengan peran </w:t>
+      </w:r>
+      <w:r>
+        <w:rPr>
+          <w:rStyle w:val="VerbatimChar"/>
+        </w:rPr>
+        <w:t>LIBRARIAN</w:t>
+      </w:r>
+      <w:r>
+        <w:t>.</w:t>
+      </w:r>
+    </w:p>
+    <w:p>
+      <w:pPr>
+        <w:pStyle w:val="BodyText"/>
+      </w:pPr>
+    </w:p>
+    <w:p>
+      <w:pPr>
+        <w:pStyle w:val="BodyText"/>
+        <w:sectPr>
+          <w:footnotePr>
+            <w:numRestart w:val="eachSect"/>
+          </w:footnotePr>
+          <w:pgSz w:w="11906" w:h="16838"/>
+          <w:pgMar w:top="1440" w:right="1440" w:bottom="1440" w:left="1440" w:header="720" w:footer="720" w:gutter="0"/>
+          <w:cols w:space="720"/>
+        </w:sectPr>
+      </w:pPr>
+      <w:r>
+        <w:rPr>
+          <w:noProof/>
+        </w:rPr>
+        <w:drawing>
+          <wp:inline distT="0" distB="0" distL="0" distR="0" wp14:anchorId="68DBAC49" wp14:editId="4B4FA5A5">
+            <wp:extent cx="5731510" cy="3988828"/>
+            <wp:effectExtent l="0" t="0" r="0" b="0"/>
+            <wp:docPr id="26" name="Picture" descr="ERD lengkap. Seluruh tabel dan relasi"/>
+            <wp:cNvGraphicFramePr/>
+            <a:graphic xmlns:a="http://schemas.openxmlformats.org/drawingml/2006/main">
+              <a:graphicData uri="http://schemas.openxmlformats.org/drawingml/2006/picture">
+                <pic:pic xmlns:pic="http://schemas.openxmlformats.org/drawingml/2006/picture">
+                  <pic:nvPicPr>
+                    <pic:cNvPr id="27" name="Picture" descr="diagrams/01-erd-lengkap.png"/>
+                    <pic:cNvPicPr>
+                      <a:picLocks noChangeAspect="1" noChangeArrowheads="1"/>
+                    </pic:cNvPicPr>
+                  </pic:nvPicPr>
+                  <pic:blipFill rotWithShape="1">
+                    <a:blip r:embed="rId6"/>
+                    <a:srcRect l="2" t="10364" r="-5" b="8957"/>
+                    <a:stretch/>
+                  </pic:blipFill>
+                  <pic:spPr bwMode="auto">
+                    <a:xfrm>
+                      <a:off x="0" y="0"/>
+                      <a:ext cx="5731510" cy="3988828"/>
+                    </a:xfrm>
+                    <a:prstGeom prst="rect">
+                      <a:avLst/>
+                    </a:prstGeom>
+                    <a:noFill/>
+                    <a:ln>
+                      <a:noFill/>
+                    </a:ln>
+                    <a:extLst>
+                      <a:ext uri="{53640926-AAD7-44D8-BBD7-CCE9431645EC}">
+                        <a14:shadowObscured xmlns:a14="http://schemas.microsoft.com/office/drawing/2010/main"/>
+                      </a:ext>
+                    </a:extLst>
+                  </pic:spPr>
+                </pic:pic>
+              </a:graphicData>
+            </a:graphic>
+          </wp:inline>
+        </w:drawing>
       </w:r>
     </w:p>
     <w:p>
       <w:pPr>
         <w:pStyle w:val="Heading1"/>
       </w:pPr>
-      <w:bookmarkStart w:id="34" w:name="acknowledgement-approval"/>
-      <w:bookmarkStart w:id="35" w:name="_Toc243850418"/>
-      <w:bookmarkEnd w:id="32"/>
+      <w:bookmarkStart w:id="36" w:name="acknowledgement-approval"/>
+      <w:bookmarkStart w:id="37" w:name="_Toc244034975"/>
       <w:bookmarkEnd w:id="28"/>
+      <w:bookmarkEnd w:id="34"/>
       <w:r>
         <w:lastRenderedPageBreak/>
-        <w:t>6. Acknowledgement &amp; Approval</w:t>
-      </w:r>
-      <w:bookmarkEnd w:id="35"/>
+        <w:t xml:space="preserve">6. </w:t>
+      </w:r>
+      <w:proofErr w:type="spellStart"/>
+      <w:r>
+        <w:t>Acknowledgement</w:t>
+      </w:r>
+      <w:proofErr w:type="spellEnd"/>
+      <w:r>
+        <w:t xml:space="preserve"> &amp; </w:t>
+      </w:r>
+      <w:proofErr w:type="spellStart"/>
+      <w:r>
+        <w:t>Approval</w:t>
+      </w:r>
+      <w:bookmarkEnd w:id="37"/>
+      <w:proofErr w:type="spellEnd"/>
     </w:p>
     <w:p>
       <w:pPr>
         <w:pStyle w:val="Heading2"/>
       </w:pPr>
-      <w:bookmarkStart w:id="36" w:name="acknowledgement"/>
-      <w:bookmarkStart w:id="37" w:name="_Toc243850419"/>
-      <w:r>
-        <w:t>6.1. Acknowledgement</w:t>
-      </w:r>
-      <w:bookmarkEnd w:id="37"/>
+      <w:bookmarkStart w:id="38" w:name="acknowledgement"/>
+      <w:bookmarkStart w:id="39" w:name="_Toc244034976"/>
+      <w:r>
+        <w:t xml:space="preserve">6.1. </w:t>
+      </w:r>
+      <w:proofErr w:type="spellStart"/>
+      <w:r>
+        <w:t>Acknowledgement</w:t>
+      </w:r>
+      <w:bookmarkEnd w:id="39"/>
+      <w:proofErr w:type="spellEnd"/>
     </w:p>
     <w:tbl>
       <w:tblPr>
@@ -3475,9 +4253,11 @@
             <w:pPr>
               <w:pStyle w:val="Compact"/>
             </w:pPr>
+            <w:proofErr w:type="spellStart"/>
             <w:r>
               <w:t>Name</w:t>
             </w:r>
+            <w:proofErr w:type="spellEnd"/>
           </w:p>
         </w:tc>
         <w:tc>
@@ -3494,9 +4274,11 @@
             <w:pPr>
               <w:pStyle w:val="Compact"/>
             </w:pPr>
+            <w:proofErr w:type="spellStart"/>
             <w:r>
               <w:t>Role</w:t>
             </w:r>
+            <w:proofErr w:type="spellEnd"/>
           </w:p>
         </w:tc>
         <w:tc>
@@ -3532,9 +4314,11 @@
             <w:pPr>
               <w:pStyle w:val="Compact"/>
             </w:pPr>
+            <w:proofErr w:type="spellStart"/>
             <w:r>
               <w:t>Signature</w:t>
             </w:r>
+            <w:proofErr w:type="spellEnd"/>
           </w:p>
         </w:tc>
       </w:tr>
@@ -3699,13 +4483,18 @@
       <w:pPr>
         <w:pStyle w:val="Heading2"/>
       </w:pPr>
-      <w:bookmarkStart w:id="38" w:name="approval"/>
-      <w:bookmarkStart w:id="39" w:name="_Toc243850420"/>
-      <w:bookmarkEnd w:id="36"/>
-      <w:r>
-        <w:t>6.2. Approval</w:t>
-      </w:r>
-      <w:bookmarkEnd w:id="39"/>
+      <w:bookmarkStart w:id="40" w:name="approval"/>
+      <w:bookmarkStart w:id="41" w:name="_Toc244034977"/>
+      <w:bookmarkEnd w:id="38"/>
+      <w:r>
+        <w:t xml:space="preserve">6.2. </w:t>
+      </w:r>
+      <w:proofErr w:type="spellStart"/>
+      <w:r>
+        <w:t>Approval</w:t>
+      </w:r>
+      <w:bookmarkEnd w:id="41"/>
+      <w:proofErr w:type="spellEnd"/>
     </w:p>
     <w:tbl>
       <w:tblPr>
@@ -3746,9 +4535,11 @@
             <w:pPr>
               <w:pStyle w:val="Compact"/>
             </w:pPr>
+            <w:proofErr w:type="spellStart"/>
             <w:r>
               <w:t>Name</w:t>
             </w:r>
+            <w:proofErr w:type="spellEnd"/>
           </w:p>
         </w:tc>
         <w:tc>
@@ -3765,9 +4556,11 @@
             <w:pPr>
               <w:pStyle w:val="Compact"/>
             </w:pPr>
+            <w:proofErr w:type="spellStart"/>
             <w:r>
               <w:t>Role</w:t>
             </w:r>
+            <w:proofErr w:type="spellEnd"/>
           </w:p>
         </w:tc>
         <w:tc>
@@ -3803,9 +4596,11 @@
             <w:pPr>
               <w:pStyle w:val="Compact"/>
             </w:pPr>
+            <w:proofErr w:type="spellStart"/>
             <w:r>
               <w:t>Signature</w:t>
             </w:r>
+            <w:proofErr w:type="spellEnd"/>
           </w:p>
         </w:tc>
       </w:tr>
@@ -3970,13 +4765,18 @@
       <w:pPr>
         <w:pStyle w:val="BodyText"/>
       </w:pPr>
-      <w:r>
-        <w:t>Fitur dan angka kebijakan telah dikonfirmasi pemilik proyek melalui percakapan. Persetujuan formal dokumen belum diberikan.</w:t>
-      </w:r>
-    </w:p>
-    <w:bookmarkEnd w:id="38"/>
-    <w:bookmarkEnd w:id="34"/>
-    <w:bookmarkEnd w:id="1"/>
+      <w:proofErr w:type="spellStart"/>
+      <w:r>
+        <w:t>Fitur</w:t>
+      </w:r>
+      <w:proofErr w:type="spellEnd"/>
+      <w:r>
+        <w:t xml:space="preserve"> dan angka kebijakan telah dikonfirmasi pemilik proyek melalui percakapan. Persetujuan formal dokumen belum diberikan.</w:t>
+      </w:r>
+      <w:bookmarkEnd w:id="1"/>
+      <w:bookmarkEnd w:id="36"/>
+      <w:bookmarkEnd w:id="40"/>
+    </w:p>
     <w:sectPr>
       <w:footnotePr>
         <w:numRestart w:val="eachSect"/>
@@ -3994,7 +4794,7 @@
   <w:abstractNum w:abstractNumId="0" w15:restartNumberingAfterBreak="0">
     <w:nsid w:val="0000A990"/>
     <w:multiLevelType w:val="multilevel"/>
-    <w:tmpl w:val="F7B217F0"/>
+    <w:tmpl w:val="F624560C"/>
     <w:lvl w:ilvl="0">
       <w:numFmt w:val="bullet"/>
       <w:lvlText w:val=" "/>
@@ -4071,7 +4871,7 @@
   <w:abstractNum w:abstractNumId="1" w15:restartNumberingAfterBreak="0">
     <w:nsid w:val="00A99411"/>
     <w:multiLevelType w:val="multilevel"/>
-    <w:tmpl w:val="BEA8D494"/>
+    <w:tmpl w:val="6AFE2844"/>
     <w:lvl w:ilvl="0">
       <w:start w:val="1"/>
       <w:numFmt w:val="decimal"/>
@@ -4555,6 +5355,13 @@
     <w:lsdException w:name="Placeholder Text" w:semiHidden="1"/>
     <w:lsdException w:name="Light Shading"/>
     <w:lsdException w:name="Light List"/>
+    <w:lsdException w:name="Light Grid"/>
+    <w:lsdException w:name="Medium Shading 1"/>
+    <w:lsdException w:name="Medium Shading 2"/>
+    <w:lsdException w:name="Medium List 1"/>
+    <w:lsdException w:name="Medium List 2"/>
+    <w:lsdException w:name="Medium Grid 1"/>
+    <w:lsdException w:name="Medium Grid 2"/>
     <w:lsdException w:name="Medium Grid 3"/>
     <w:lsdException w:name="Dark List"/>
     <w:lsdException w:name="Colorful Shading"/>
@@ -6025,4 +6832,16 @@
     </a:ext>
   </a:extLst>
 </a:theme>
+</file>
+
+<file path=customXml/item1.xml><?xml version="1.0" encoding="utf-8"?>
+<b:Sources xmlns:b="http://schemas.openxmlformats.org/officeDocument/2006/bibliography" xmlns="http://schemas.openxmlformats.org/officeDocument/2006/bibliography" SelectedStyle="/APASixthEditionOfficeOnline.xsl" StyleName="APA" Version="6"/>
+</file>
+
+<file path=customXml/itemProps1.xml><?xml version="1.0" encoding="utf-8"?>
+<ds:datastoreItem xmlns:ds="http://schemas.openxmlformats.org/officeDocument/2006/customXml" ds:itemID="{CD52E64E-2E2B-6C49-9C74-C12F20D1F45F}">
+  <ds:schemaRefs>
+    <ds:schemaRef ds:uri="http://schemas.openxmlformats.org/officeDocument/2006/bibliography"/>
+  </ds:schemaRefs>
+</ds:datastoreItem>
 </file>
</xml_diff>

<commit_message>
docs: remove outdated design and specification exports
- Retain the updated BRD Word document while removing superseded documentation and design artifacts
</commit_message>
<xml_diff>
--- a/docs/BRD-perpus-merah-putih.docx
+++ b/docs/BRD-perpus-merah-putih.docx
@@ -32,7 +32,7 @@
           <w:spacing w:val="36"/>
           <w:sz w:val="20"/>
         </w:rPr>
-        <w:t>PROJECT DOCUMENT</w:t>
+        <w:t>DOKUMEN PROYEK</w:t>
       </w:r>
     </w:p>
     <w:p>
@@ -40,7 +40,6 @@
         <w:keepLines/>
         <w:spacing w:after="440" w:line="1080" w:lineRule="exact"/>
       </w:pPr>
-      <w:proofErr w:type="spellStart"/>
       <w:r>
         <w:rPr>
           <w:rFonts w:ascii="Arial" w:hAnsi="Arial" w:cs="Arial"/>
@@ -50,7 +49,6 @@
         </w:rPr>
         <w:t>Perpus</w:t>
       </w:r>
-      <w:proofErr w:type="spellEnd"/>
       <w:r>
         <w:rPr>
           <w:rFonts w:ascii="Arial" w:hAnsi="Arial" w:cs="Arial"/>
@@ -80,7 +78,7 @@
           <w:color w:val="696F80"/>
         </w:rPr>
         <w:br/>
-        <w:t>dan layanan peminjaman perpustakaan kampus.</w:t>
+        <w:t>dan peminjaman di perpustakaan kampus.</w:t>
       </w:r>
     </w:p>
     <w:p>
@@ -96,7 +94,7 @@
           <w:spacing w:val="8"/>
           <w:sz w:val="34"/>
         </w:rPr>
-        <w:t>BUSINESS REQUIREMENTS</w:t>
+        <w:t>DOKUMEN KEBUTUHAN</w:t>
       </w:r>
       <w:r>
         <w:rPr>
@@ -107,7 +105,7 @@
           <w:sz w:val="34"/>
         </w:rPr>
         <w:br/>
-        <w:t>DOCUMENT</w:t>
+        <w:t>BISNIS</w:t>
       </w:r>
     </w:p>
     <w:p>
@@ -125,7 +123,7 @@
           <w:spacing w:val="10"/>
           <w:sz w:val="18"/>
         </w:rPr>
-        <w:t>SCOPE  /  BOOK MANAGEMENT &amp; BORROWING</w:t>
+        <w:t>LINGKUP  /  PENGELOLAAN BUKU DAN PEMINJAMAN</w:t>
       </w:r>
     </w:p>
     <w:p>
@@ -136,23 +134,13 @@
         </w:tabs>
         <w:spacing w:after="180" w:line="360" w:lineRule="exact"/>
       </w:pPr>
-      <w:proofErr w:type="spellStart"/>
       <w:r>
         <w:rPr>
           <w:rFonts w:ascii="Arial" w:hAnsi="Arial" w:cs="Arial"/>
           <w:color w:val="003E51"/>
           <w:sz w:val="22"/>
         </w:rPr>
-        <w:t>Version</w:t>
-      </w:r>
-      <w:proofErr w:type="spellEnd"/>
-      <w:r>
-        <w:rPr>
-          <w:rFonts w:ascii="Arial" w:hAnsi="Arial" w:cs="Arial"/>
-          <w:color w:val="003E51"/>
-          <w:sz w:val="22"/>
-        </w:rPr>
-        <w:t xml:space="preserve"> 1.</w:t>
+        <w:t>Versi 1.</w:t>
       </w:r>
       <w:r>
         <w:rPr>
@@ -389,7 +377,7 @@
           <w:spacing w:val="14"/>
           <w:sz w:val="16"/>
         </w:rPr>
-        <w:t>BUSINESS REQUIREMENTS DOCUMENT   /   BRD</w:t>
+        <w:t>DOKUMEN KEBUTUHAN BISNIS   /   BRD</w:t>
       </w:r>
     </w:p>
     <w:p>
@@ -399,28 +387,10 @@
       </w:pPr>
       <w:bookmarkStart w:id="0" w:name="table-of-contents"/>
       <w:bookmarkStart w:id="1" w:name="business-requirements-document-brd"/>
-      <w:proofErr w:type="spellStart"/>
       <w:r>
         <w:lastRenderedPageBreak/>
-        <w:t>Table</w:t>
-      </w:r>
-      <w:proofErr w:type="spellEnd"/>
-      <w:r>
-        <w:t xml:space="preserve"> </w:t>
-      </w:r>
-      <w:proofErr w:type="spellStart"/>
-      <w:r>
-        <w:t>of</w:t>
-      </w:r>
-      <w:proofErr w:type="spellEnd"/>
-      <w:r>
-        <w:t xml:space="preserve"> </w:t>
-      </w:r>
-      <w:proofErr w:type="spellStart"/>
-      <w:r>
-        <w:t>contents</w:t>
-      </w:r>
-      <w:proofErr w:type="spellEnd"/>
+        <w:t>Daftar isi</w:t>
+      </w:r>
     </w:p>
     <w:sdt>
       <w:sdtPr>
@@ -449,13 +419,13 @@
           <w:r>
             <w:fldChar w:fldCharType="separate"/>
           </w:r>
-          <w:hyperlink w:anchor="_Toc244034958" w:history="1">
+          <w:hyperlink w:anchor="_Toc244116506" w:history="1">
             <w:r>
               <w:rPr>
                 <w:rStyle w:val="Hyperlink"/>
                 <w:noProof/>
               </w:rPr>
-              <w:t>1. Business Requirements Definition</w:t>
+              <w:t>1. Definisi kebutuhan bisnis</w:t>
             </w:r>
             <w:r>
               <w:rPr>
@@ -476,7 +446,7 @@
                 <w:noProof/>
                 <w:webHidden/>
               </w:rPr>
-              <w:instrText xml:space="preserve"> PAGEREF _Toc244034958 \h </w:instrText>
+              <w:instrText xml:space="preserve"> PAGEREF _Toc244116506 \h </w:instrText>
             </w:r>
             <w:r>
               <w:rPr>
@@ -515,13 +485,13 @@
               <w:lang w:val="en-ID" w:eastAsia="en-US"/>
             </w:rPr>
           </w:pPr>
-          <w:hyperlink w:anchor="_Toc244034959" w:history="1">
+          <w:hyperlink w:anchor="_Toc244116507" w:history="1">
             <w:r>
               <w:rPr>
                 <w:rStyle w:val="Hyperlink"/>
                 <w:noProof/>
               </w:rPr>
-              <w:t>2. Introduction</w:t>
+              <w:t>2. Pengantar</w:t>
             </w:r>
             <w:r>
               <w:rPr>
@@ -542,7 +512,7 @@
                 <w:noProof/>
                 <w:webHidden/>
               </w:rPr>
-              <w:instrText xml:space="preserve"> PAGEREF _Toc244034959 \h </w:instrText>
+              <w:instrText xml:space="preserve"> PAGEREF _Toc244116507 \h </w:instrText>
             </w:r>
             <w:r>
               <w:rPr>
@@ -581,13 +551,13 @@
               <w:lang w:val="en-ID" w:eastAsia="en-US"/>
             </w:rPr>
           </w:pPr>
-          <w:hyperlink w:anchor="_Toc244034960" w:history="1">
+          <w:hyperlink w:anchor="_Toc244116508" w:history="1">
             <w:r>
               <w:rPr>
                 <w:rStyle w:val="Hyperlink"/>
                 <w:noProof/>
               </w:rPr>
-              <w:t>2.1. Background</w:t>
+              <w:t>2.1. Latar belakang</w:t>
             </w:r>
             <w:r>
               <w:rPr>
@@ -608,7 +578,7 @@
                 <w:noProof/>
                 <w:webHidden/>
               </w:rPr>
-              <w:instrText xml:space="preserve"> PAGEREF _Toc244034960 \h </w:instrText>
+              <w:instrText xml:space="preserve"> PAGEREF _Toc244116508 \h </w:instrText>
             </w:r>
             <w:r>
               <w:rPr>
@@ -647,13 +617,13 @@
               <w:lang w:val="en-ID" w:eastAsia="en-US"/>
             </w:rPr>
           </w:pPr>
-          <w:hyperlink w:anchor="_Toc244034961" w:history="1">
+          <w:hyperlink w:anchor="_Toc244116509" w:history="1">
             <w:r>
               <w:rPr>
                 <w:rStyle w:val="Hyperlink"/>
                 <w:noProof/>
               </w:rPr>
-              <w:t>2.2. Objective &amp; Expected Improvements</w:t>
+              <w:t>2.2. Tujuan dan perbaikan yang diharapkan</w:t>
             </w:r>
             <w:r>
               <w:rPr>
@@ -674,7 +644,7 @@
                 <w:noProof/>
                 <w:webHidden/>
               </w:rPr>
-              <w:instrText xml:space="preserve"> PAGEREF _Toc244034961 \h </w:instrText>
+              <w:instrText xml:space="preserve"> PAGEREF _Toc244116509 \h </w:instrText>
             </w:r>
             <w:r>
               <w:rPr>
@@ -713,13 +683,13 @@
               <w:lang w:val="en-ID" w:eastAsia="en-US"/>
             </w:rPr>
           </w:pPr>
-          <w:hyperlink w:anchor="_Toc244034962" w:history="1">
+          <w:hyperlink w:anchor="_Toc244116510" w:history="1">
             <w:r>
               <w:rPr>
                 <w:rStyle w:val="Hyperlink"/>
                 <w:noProof/>
               </w:rPr>
-              <w:t>2.3. Business Process Overview</w:t>
+              <w:t>2.3. Gambaran proses bisnis</w:t>
             </w:r>
             <w:r>
               <w:rPr>
@@ -740,7 +710,7 @@
                 <w:noProof/>
                 <w:webHidden/>
               </w:rPr>
-              <w:instrText xml:space="preserve"> PAGEREF _Toc244034962 \h </w:instrText>
+              <w:instrText xml:space="preserve"> PAGEREF _Toc244116510 \h </w:instrText>
             </w:r>
             <w:r>
               <w:rPr>
@@ -779,13 +749,13 @@
               <w:lang w:val="en-ID" w:eastAsia="en-US"/>
             </w:rPr>
           </w:pPr>
-          <w:hyperlink w:anchor="_Toc244034963" w:history="1">
+          <w:hyperlink w:anchor="_Toc244116511" w:history="1">
             <w:r>
               <w:rPr>
                 <w:rStyle w:val="Hyperlink"/>
                 <w:noProof/>
               </w:rPr>
-              <w:t>2.3.1. Current Business Process</w:t>
+              <w:t>2.3.1. Proses bisnis saat ini</w:t>
             </w:r>
             <w:r>
               <w:rPr>
@@ -806,7 +776,7 @@
                 <w:noProof/>
                 <w:webHidden/>
               </w:rPr>
-              <w:instrText xml:space="preserve"> PAGEREF _Toc244034963 \h </w:instrText>
+              <w:instrText xml:space="preserve"> PAGEREF _Toc244116511 \h </w:instrText>
             </w:r>
             <w:r>
               <w:rPr>
@@ -845,13 +815,13 @@
               <w:lang w:val="en-ID" w:eastAsia="en-US"/>
             </w:rPr>
           </w:pPr>
-          <w:hyperlink w:anchor="_Toc244034964" w:history="1">
+          <w:hyperlink w:anchor="_Toc244116512" w:history="1">
             <w:r>
               <w:rPr>
                 <w:rStyle w:val="Hyperlink"/>
                 <w:noProof/>
               </w:rPr>
-              <w:t>3. Scope</w:t>
+              <w:t>3. Ruang lingkup</w:t>
             </w:r>
             <w:r>
               <w:rPr>
@@ -872,7 +842,7 @@
                 <w:noProof/>
                 <w:webHidden/>
               </w:rPr>
-              <w:instrText xml:space="preserve"> PAGEREF _Toc244034964 \h </w:instrText>
+              <w:instrText xml:space="preserve"> PAGEREF _Toc244116512 \h </w:instrText>
             </w:r>
             <w:r>
               <w:rPr>
@@ -911,13 +881,13 @@
               <w:lang w:val="en-ID" w:eastAsia="en-US"/>
             </w:rPr>
           </w:pPr>
-          <w:hyperlink w:anchor="_Toc244034965" w:history="1">
+          <w:hyperlink w:anchor="_Toc244116513" w:history="1">
             <w:r>
               <w:rPr>
                 <w:rStyle w:val="Hyperlink"/>
                 <w:noProof/>
               </w:rPr>
-              <w:t>3.1. In Scope</w:t>
+              <w:t>3.1. Yang termasuk dalam proyek</w:t>
             </w:r>
             <w:r>
               <w:rPr>
@@ -938,7 +908,7 @@
                 <w:noProof/>
                 <w:webHidden/>
               </w:rPr>
-              <w:instrText xml:space="preserve"> PAGEREF _Toc244034965 \h </w:instrText>
+              <w:instrText xml:space="preserve"> PAGEREF _Toc244116513 \h </w:instrText>
             </w:r>
             <w:r>
               <w:rPr>
@@ -977,13 +947,13 @@
               <w:lang w:val="en-ID" w:eastAsia="en-US"/>
             </w:rPr>
           </w:pPr>
-          <w:hyperlink w:anchor="_Toc244034966" w:history="1">
+          <w:hyperlink w:anchor="_Toc244116514" w:history="1">
             <w:r>
               <w:rPr>
                 <w:rStyle w:val="Hyperlink"/>
                 <w:noProof/>
               </w:rPr>
-              <w:t>3.2. Out of Scope</w:t>
+              <w:t>3.2. Yang tidak termasuk dalam proyek</w:t>
             </w:r>
             <w:r>
               <w:rPr>
@@ -1004,7 +974,7 @@
                 <w:noProof/>
                 <w:webHidden/>
               </w:rPr>
-              <w:instrText xml:space="preserve"> PAGEREF _Toc244034966 \h </w:instrText>
+              <w:instrText xml:space="preserve"> PAGEREF _Toc244116514 \h </w:instrText>
             </w:r>
             <w:r>
               <w:rPr>
@@ -1043,13 +1013,13 @@
               <w:lang w:val="en-ID" w:eastAsia="en-US"/>
             </w:rPr>
           </w:pPr>
-          <w:hyperlink w:anchor="_Toc244034967" w:history="1">
+          <w:hyperlink w:anchor="_Toc244116515" w:history="1">
             <w:r>
               <w:rPr>
                 <w:rStyle w:val="Hyperlink"/>
                 <w:noProof/>
               </w:rPr>
-              <w:t>4. System Perspective</w:t>
+              <w:t>4. Gambaran sistem</w:t>
             </w:r>
             <w:r>
               <w:rPr>
@@ -1070,7 +1040,7 @@
                 <w:noProof/>
                 <w:webHidden/>
               </w:rPr>
-              <w:instrText xml:space="preserve"> PAGEREF _Toc244034967 \h </w:instrText>
+              <w:instrText xml:space="preserve"> PAGEREF _Toc244116515 \h </w:instrText>
             </w:r>
             <w:r>
               <w:rPr>
@@ -1090,7 +1060,7 @@
                 <w:noProof/>
                 <w:webHidden/>
               </w:rPr>
-              <w:t>4</w:t>
+              <w:t>5</w:t>
             </w:r>
             <w:r>
               <w:rPr>
@@ -1109,13 +1079,13 @@
               <w:lang w:val="en-ID" w:eastAsia="en-US"/>
             </w:rPr>
           </w:pPr>
-          <w:hyperlink w:anchor="_Toc244034968" w:history="1">
+          <w:hyperlink w:anchor="_Toc244116516" w:history="1">
             <w:r>
               <w:rPr>
                 <w:rStyle w:val="Hyperlink"/>
                 <w:noProof/>
               </w:rPr>
-              <w:t>4.1. Assumptions</w:t>
+              <w:t>4.1. Asumsi</w:t>
             </w:r>
             <w:r>
               <w:rPr>
@@ -1136,7 +1106,7 @@
                 <w:noProof/>
                 <w:webHidden/>
               </w:rPr>
-              <w:instrText xml:space="preserve"> PAGEREF _Toc244034968 \h </w:instrText>
+              <w:instrText xml:space="preserve"> PAGEREF _Toc244116516 \h </w:instrText>
             </w:r>
             <w:r>
               <w:rPr>
@@ -1156,7 +1126,7 @@
                 <w:noProof/>
                 <w:webHidden/>
               </w:rPr>
-              <w:t>4</w:t>
+              <w:t>5</w:t>
             </w:r>
             <w:r>
               <w:rPr>
@@ -1175,13 +1145,13 @@
               <w:lang w:val="en-ID" w:eastAsia="en-US"/>
             </w:rPr>
           </w:pPr>
-          <w:hyperlink w:anchor="_Toc244034969" w:history="1">
+          <w:hyperlink w:anchor="_Toc244116517" w:history="1">
             <w:r>
               <w:rPr>
                 <w:rStyle w:val="Hyperlink"/>
                 <w:noProof/>
               </w:rPr>
-              <w:t>4.2. Exclusions</w:t>
+              <w:t>4.2. Hal di luar tanggung jawab aplikasi</w:t>
             </w:r>
             <w:r>
               <w:rPr>
@@ -1202,7 +1172,7 @@
                 <w:noProof/>
                 <w:webHidden/>
               </w:rPr>
-              <w:instrText xml:space="preserve"> PAGEREF _Toc244034969 \h </w:instrText>
+              <w:instrText xml:space="preserve"> PAGEREF _Toc244116517 \h </w:instrText>
             </w:r>
             <w:r>
               <w:rPr>
@@ -1241,13 +1211,13 @@
               <w:lang w:val="en-ID" w:eastAsia="en-US"/>
             </w:rPr>
           </w:pPr>
-          <w:hyperlink w:anchor="_Toc244034970" w:history="1">
+          <w:hyperlink w:anchor="_Toc244116518" w:history="1">
             <w:r>
               <w:rPr>
                 <w:rStyle w:val="Hyperlink"/>
                 <w:noProof/>
               </w:rPr>
-              <w:t>4.3. Constraints</w:t>
+              <w:t>4.3. Batasan</w:t>
             </w:r>
             <w:r>
               <w:rPr>
@@ -1268,7 +1238,7 @@
                 <w:noProof/>
                 <w:webHidden/>
               </w:rPr>
-              <w:instrText xml:space="preserve"> PAGEREF _Toc244034970 \h </w:instrText>
+              <w:instrText xml:space="preserve"> PAGEREF _Toc244116518 \h </w:instrText>
             </w:r>
             <w:r>
               <w:rPr>
@@ -1307,13 +1277,13 @@
               <w:lang w:val="en-ID" w:eastAsia="en-US"/>
             </w:rPr>
           </w:pPr>
-          <w:hyperlink w:anchor="_Toc244034971" w:history="1">
+          <w:hyperlink w:anchor="_Toc244116519" w:history="1">
             <w:r>
               <w:rPr>
                 <w:rStyle w:val="Hyperlink"/>
                 <w:noProof/>
               </w:rPr>
-              <w:t>5. Business Requirements</w:t>
+              <w:t>5. Kebutuhan bisnis</w:t>
             </w:r>
             <w:r>
               <w:rPr>
@@ -1334,7 +1304,7 @@
                 <w:noProof/>
                 <w:webHidden/>
               </w:rPr>
-              <w:instrText xml:space="preserve"> PAGEREF _Toc244034971 \h </w:instrText>
+              <w:instrText xml:space="preserve"> PAGEREF _Toc244116519 \h </w:instrText>
             </w:r>
             <w:r>
               <w:rPr>
@@ -1373,13 +1343,13 @@
               <w:lang w:val="en-ID" w:eastAsia="en-US"/>
             </w:rPr>
           </w:pPr>
-          <w:hyperlink w:anchor="_Toc244034972" w:history="1">
+          <w:hyperlink w:anchor="_Toc244116520" w:history="1">
             <w:r>
               <w:rPr>
                 <w:rStyle w:val="Hyperlink"/>
                 <w:noProof/>
               </w:rPr>
-              <w:t>5.1. Functional Requirements</w:t>
+              <w:t>5.1. Kebutuhan fungsional</w:t>
             </w:r>
             <w:r>
               <w:rPr>
@@ -1400,7 +1370,7 @@
                 <w:noProof/>
                 <w:webHidden/>
               </w:rPr>
-              <w:instrText xml:space="preserve"> PAGEREF _Toc244034972 \h </w:instrText>
+              <w:instrText xml:space="preserve"> PAGEREF _Toc244116520 \h </w:instrText>
             </w:r>
             <w:r>
               <w:rPr>
@@ -1439,13 +1409,13 @@
               <w:lang w:val="en-ID" w:eastAsia="en-US"/>
             </w:rPr>
           </w:pPr>
-          <w:hyperlink w:anchor="_Toc244034973" w:history="1">
+          <w:hyperlink w:anchor="_Toc244116521" w:history="1">
             <w:r>
               <w:rPr>
                 <w:rStyle w:val="Hyperlink"/>
                 <w:noProof/>
               </w:rPr>
-              <w:t>5.2. Non-functional Requirements</w:t>
+              <w:t>5.2. Kebutuhan nonfungsional</w:t>
             </w:r>
             <w:r>
               <w:rPr>
@@ -1466,7 +1436,7 @@
                 <w:noProof/>
                 <w:webHidden/>
               </w:rPr>
-              <w:instrText xml:space="preserve"> PAGEREF _Toc244034973 \h </w:instrText>
+              <w:instrText xml:space="preserve"> PAGEREF _Toc244116521 \h </w:instrText>
             </w:r>
             <w:r>
               <w:rPr>
@@ -1505,13 +1475,13 @@
               <w:lang w:val="en-ID" w:eastAsia="en-US"/>
             </w:rPr>
           </w:pPr>
-          <w:hyperlink w:anchor="_Toc244034974" w:history="1">
+          <w:hyperlink w:anchor="_Toc244116522" w:history="1">
             <w:r>
               <w:rPr>
                 <w:rStyle w:val="Hyperlink"/>
                 <w:noProof/>
               </w:rPr>
-              <w:t>5.3. Entity Relationship Diagram</w:t>
+              <w:t>5.3. Diagram relasi entitas (ERD)</w:t>
             </w:r>
             <w:r>
               <w:rPr>
@@ -1532,7 +1502,7 @@
                 <w:noProof/>
                 <w:webHidden/>
               </w:rPr>
-              <w:instrText xml:space="preserve"> PAGEREF _Toc244034974 \h </w:instrText>
+              <w:instrText xml:space="preserve"> PAGEREF _Toc244116522 \h </w:instrText>
             </w:r>
             <w:r>
               <w:rPr>
@@ -1571,13 +1541,13 @@
               <w:lang w:val="en-ID" w:eastAsia="en-US"/>
             </w:rPr>
           </w:pPr>
-          <w:hyperlink w:anchor="_Toc244034975" w:history="1">
+          <w:hyperlink w:anchor="_Toc244116523" w:history="1">
             <w:r>
               <w:rPr>
                 <w:rStyle w:val="Hyperlink"/>
                 <w:noProof/>
               </w:rPr>
-              <w:t>6. Acknowledgement &amp; Approval</w:t>
+              <w:t>6. Pernyataan mengetahui dan persetujuan</w:t>
             </w:r>
             <w:r>
               <w:rPr>
@@ -1598,7 +1568,7 @@
                 <w:noProof/>
                 <w:webHidden/>
               </w:rPr>
-              <w:instrText xml:space="preserve"> PAGEREF _Toc244034975 \h </w:instrText>
+              <w:instrText xml:space="preserve"> PAGEREF _Toc244116523 \h </w:instrText>
             </w:r>
             <w:r>
               <w:rPr>
@@ -1618,7 +1588,7 @@
                 <w:noProof/>
                 <w:webHidden/>
               </w:rPr>
-              <w:t>8</w:t>
+              <w:t>9</w:t>
             </w:r>
             <w:r>
               <w:rPr>
@@ -1637,13 +1607,13 @@
               <w:lang w:val="en-ID" w:eastAsia="en-US"/>
             </w:rPr>
           </w:pPr>
-          <w:hyperlink w:anchor="_Toc244034976" w:history="1">
+          <w:hyperlink w:anchor="_Toc244116524" w:history="1">
             <w:r>
               <w:rPr>
                 <w:rStyle w:val="Hyperlink"/>
                 <w:noProof/>
               </w:rPr>
-              <w:t>6.1. Acknowledgement</w:t>
+              <w:t>6.1. Pernyataan mengetahui</w:t>
             </w:r>
             <w:r>
               <w:rPr>
@@ -1664,7 +1634,7 @@
                 <w:noProof/>
                 <w:webHidden/>
               </w:rPr>
-              <w:instrText xml:space="preserve"> PAGEREF _Toc244034976 \h </w:instrText>
+              <w:instrText xml:space="preserve"> PAGEREF _Toc244116524 \h </w:instrText>
             </w:r>
             <w:r>
               <w:rPr>
@@ -1684,7 +1654,7 @@
                 <w:noProof/>
                 <w:webHidden/>
               </w:rPr>
-              <w:t>8</w:t>
+              <w:t>9</w:t>
             </w:r>
             <w:r>
               <w:rPr>
@@ -1703,13 +1673,13 @@
               <w:lang w:val="en-ID" w:eastAsia="en-US"/>
             </w:rPr>
           </w:pPr>
-          <w:hyperlink w:anchor="_Toc244034977" w:history="1">
+          <w:hyperlink w:anchor="_Toc244116525" w:history="1">
             <w:r>
               <w:rPr>
                 <w:rStyle w:val="Hyperlink"/>
                 <w:noProof/>
               </w:rPr>
-              <w:t>6.2. Approval</w:t>
+              <w:t>6.2. Persetujuan dokumen</w:t>
             </w:r>
             <w:r>
               <w:rPr>
@@ -1730,7 +1700,7 @@
                 <w:noProof/>
                 <w:webHidden/>
               </w:rPr>
-              <w:instrText xml:space="preserve"> PAGEREF _Toc244034977 \h </w:instrText>
+              <w:instrText xml:space="preserve"> PAGEREF _Toc244116525 \h </w:instrText>
             </w:r>
             <w:r>
               <w:rPr>
@@ -1750,7 +1720,7 @@
                 <w:noProof/>
                 <w:webHidden/>
               </w:rPr>
-              <w:t>8</w:t>
+              <w:t>9</w:t>
             </w:r>
             <w:r>
               <w:rPr>
@@ -1777,26 +1747,13 @@
         <w:pageBreakBefore/>
       </w:pPr>
       <w:bookmarkStart w:id="2" w:name="business-requirements-definition"/>
-      <w:bookmarkStart w:id="3" w:name="_Toc244034958"/>
+      <w:bookmarkStart w:id="3" w:name="_Toc244116506"/>
       <w:bookmarkEnd w:id="0"/>
       <w:r>
         <w:lastRenderedPageBreak/>
-        <w:t xml:space="preserve">1. Business </w:t>
-      </w:r>
-      <w:proofErr w:type="spellStart"/>
-      <w:r>
-        <w:t>Requirements</w:t>
-      </w:r>
-      <w:proofErr w:type="spellEnd"/>
-      <w:r>
-        <w:t xml:space="preserve"> </w:t>
-      </w:r>
-      <w:proofErr w:type="spellStart"/>
-      <w:r>
-        <w:t>Definition</w:t>
+        <w:t>1. Definisi kebutuhan bisnis</w:t>
       </w:r>
       <w:bookmarkEnd w:id="3"/>
-      <w:proofErr w:type="spellEnd"/>
     </w:p>
     <w:tbl>
       <w:tblPr>
@@ -1813,7 +1770,7 @@
         <w:tblLook w:val="0020" w:firstRow="1" w:lastRow="0" w:firstColumn="0" w:lastColumn="0" w:noHBand="0" w:noVBand="0"/>
       </w:tblPr>
       <w:tblGrid>
-        <w:gridCol w:w="2349"/>
+        <w:gridCol w:w="1950"/>
         <w:gridCol w:w="3963"/>
       </w:tblGrid>
       <w:tr>
@@ -1836,13 +1793,8 @@
               <w:pStyle w:val="Compact"/>
             </w:pPr>
             <w:r>
-              <w:t xml:space="preserve">Project </w:t>
-            </w:r>
-            <w:proofErr w:type="spellStart"/>
-            <w:r>
-              <w:t>information</w:t>
-            </w:r>
-            <w:proofErr w:type="spellEnd"/>
+              <w:t>Informasi proyek</w:t>
+            </w:r>
           </w:p>
         </w:tc>
         <w:tc>
@@ -1859,11 +1811,9 @@
             <w:pPr>
               <w:pStyle w:val="Compact"/>
             </w:pPr>
-            <w:proofErr w:type="spellStart"/>
-            <w:r>
-              <w:t>Description</w:t>
-            </w:r>
-            <w:proofErr w:type="spellEnd"/>
+            <w:r>
+              <w:t>Keterangan</w:t>
+            </w:r>
           </w:p>
         </w:tc>
       </w:tr>
@@ -1883,7 +1833,7 @@
               <w:pStyle w:val="Compact"/>
             </w:pPr>
             <w:r>
-              <w:t>Project ID</w:t>
+              <w:t>ID proyek</w:t>
             </w:r>
           </w:p>
         </w:tc>
@@ -1923,13 +1873,8 @@
               <w:pStyle w:val="Compact"/>
             </w:pPr>
             <w:r>
-              <w:t xml:space="preserve">Project </w:t>
-            </w:r>
-            <w:proofErr w:type="spellStart"/>
-            <w:r>
-              <w:t>name</w:t>
-            </w:r>
-            <w:proofErr w:type="spellEnd"/>
+              <w:t>Nama proyek</w:t>
+            </w:r>
           </w:p>
         </w:tc>
         <w:tc>
@@ -1946,13 +1891,8 @@
             <w:pPr>
               <w:pStyle w:val="Compact"/>
             </w:pPr>
-            <w:proofErr w:type="spellStart"/>
-            <w:r>
-              <w:t>Perpus</w:t>
-            </w:r>
-            <w:proofErr w:type="spellEnd"/>
-            <w:r>
-              <w:t xml:space="preserve"> Merah Putih</w:t>
+            <w:r>
+              <w:t>Perpus Merah Putih</w:t>
             </w:r>
           </w:p>
         </w:tc>
@@ -1972,11 +1912,9 @@
             <w:pPr>
               <w:pStyle w:val="Compact"/>
             </w:pPr>
-            <w:proofErr w:type="spellStart"/>
-            <w:r>
-              <w:t>Requester</w:t>
-            </w:r>
-            <w:proofErr w:type="spellEnd"/>
+            <w:r>
+              <w:t>Pemohon</w:t>
+            </w:r>
           </w:p>
         </w:tc>
         <w:tc>
@@ -2015,13 +1953,8 @@
               <w:pStyle w:val="Compact"/>
             </w:pPr>
             <w:r>
-              <w:t xml:space="preserve">System / </w:t>
-            </w:r>
-            <w:proofErr w:type="spellStart"/>
-            <w:r>
-              <w:t>Application</w:t>
-            </w:r>
-            <w:proofErr w:type="spellEnd"/>
+              <w:t>Sistem / aplikasi</w:t>
+            </w:r>
           </w:p>
         </w:tc>
         <w:tc>
@@ -2059,11 +1992,9 @@
             <w:pPr>
               <w:pStyle w:val="Compact"/>
             </w:pPr>
-            <w:proofErr w:type="spellStart"/>
-            <w:r>
-              <w:t>Users</w:t>
-            </w:r>
-            <w:proofErr w:type="spellEnd"/>
+            <w:r>
+              <w:t>Pengguna</w:t>
+            </w:r>
           </w:p>
         </w:tc>
         <w:tc>
@@ -2101,13 +2032,8 @@
             <w:pPr>
               <w:pStyle w:val="Compact"/>
             </w:pPr>
-            <w:proofErr w:type="spellStart"/>
-            <w:r>
-              <w:t>Document</w:t>
-            </w:r>
-            <w:proofErr w:type="spellEnd"/>
-            <w:r>
-              <w:t xml:space="preserve"> status</w:t>
+            <w:r>
+              <w:t>Status dokumen</w:t>
             </w:r>
           </w:p>
         </w:tc>
@@ -2172,11 +2098,9 @@
             <w:pPr>
               <w:pStyle w:val="Compact"/>
             </w:pPr>
-            <w:proofErr w:type="spellStart"/>
-            <w:r>
-              <w:t>Version</w:t>
-            </w:r>
-            <w:proofErr w:type="spellEnd"/>
+            <w:r>
+              <w:t>Versi</w:t>
+            </w:r>
           </w:p>
         </w:tc>
         <w:tc>
@@ -2194,7 +2118,7 @@
               <w:pStyle w:val="Compact"/>
             </w:pPr>
             <w:r>
-              <w:t>Date</w:t>
+              <w:t>Tanggal</w:t>
             </w:r>
           </w:p>
         </w:tc>
@@ -2212,19 +2136,9 @@
             <w:pPr>
               <w:pStyle w:val="Compact"/>
             </w:pPr>
-            <w:proofErr w:type="spellStart"/>
-            <w:r>
-              <w:t>Version</w:t>
-            </w:r>
-            <w:proofErr w:type="spellEnd"/>
-            <w:r>
-              <w:t xml:space="preserve"> </w:t>
-            </w:r>
-            <w:proofErr w:type="spellStart"/>
-            <w:r>
-              <w:t>summary</w:t>
-            </w:r>
-            <w:proofErr w:type="spellEnd"/>
+            <w:r>
+              <w:t>Ringkasan perubahan</w:t>
+            </w:r>
           </w:p>
         </w:tc>
       </w:tr>
@@ -2282,7 +2196,7 @@
               <w:pStyle w:val="Compact"/>
             </w:pPr>
             <w:r>
-              <w:t>Penyusunan kebutuhan awal.</w:t>
+              <w:t>Menyusun kebutuhan awal.</w:t>
             </w:r>
           </w:p>
         </w:tc>
@@ -2341,7 +2255,7 @@
               <w:pStyle w:val="Compact"/>
             </w:pPr>
             <w:r>
-              <w:t>Penyederhanaan BRD mengikuti struktur referensi.</w:t>
+              <w:t>Menyederhanakan BRD dengan mengikuti struktur dokumen referensi.</w:t>
             </w:r>
           </w:p>
         </w:tc>
@@ -2400,7 +2314,7 @@
               <w:pStyle w:val="Compact"/>
             </w:pPr>
             <w:r>
-              <w:t>Judul bagian berbahasa Inggris dan seluruh tabel diberi garis lengkap.</w:t>
+              <w:t>Menggunakan judul bagian berbahasa Inggris dan menambahkan garis lengkap pada semua tabel.</w:t>
             </w:r>
           </w:p>
         </w:tc>
@@ -2459,15 +2373,7 @@
               <w:pStyle w:val="Compact"/>
             </w:pPr>
             <w:r>
-              <w:t xml:space="preserve">Satu buku fisik per judul, ISBN wajib dan unik, serta penghapusan pencatatan eksemplar dan </w:t>
-            </w:r>
-            <w:proofErr w:type="spellStart"/>
-            <w:r>
-              <w:t>fitur</w:t>
-            </w:r>
-            <w:proofErr w:type="spellEnd"/>
-            <w:r>
-              <w:t xml:space="preserve"> perpanjangan pinjaman.</w:t>
+              <w:t>Menetapkan satu buku fisik per judul dengan ISBN wajib dan unik. Pencatatan eksemplar dan fitur perpanjangan pinjaman dihapus.</w:t>
             </w:r>
           </w:p>
         </w:tc>
@@ -2478,48 +2384,30 @@
         <w:pStyle w:val="Heading1"/>
       </w:pPr>
       <w:bookmarkStart w:id="4" w:name="introduction"/>
-      <w:bookmarkStart w:id="5" w:name="_Toc244034959"/>
+      <w:bookmarkStart w:id="5" w:name="_Toc244116507"/>
       <w:bookmarkEnd w:id="2"/>
       <w:r>
-        <w:t xml:space="preserve">2. </w:t>
-      </w:r>
-      <w:proofErr w:type="spellStart"/>
-      <w:r>
-        <w:t>Introduction</w:t>
+        <w:t>2. Pengantar</w:t>
       </w:r>
       <w:bookmarkEnd w:id="5"/>
-      <w:proofErr w:type="spellEnd"/>
     </w:p>
     <w:p>
       <w:pPr>
         <w:pStyle w:val="Heading2"/>
       </w:pPr>
       <w:bookmarkStart w:id="6" w:name="background"/>
-      <w:bookmarkStart w:id="7" w:name="_Toc244034960"/>
-      <w:r>
-        <w:t xml:space="preserve">2.1. </w:t>
-      </w:r>
-      <w:proofErr w:type="spellStart"/>
-      <w:r>
-        <w:t>Background</w:t>
+      <w:bookmarkStart w:id="7" w:name="_Toc244116508"/>
+      <w:r>
+        <w:t>2.1. Latar belakang</w:t>
       </w:r>
       <w:bookmarkEnd w:id="7"/>
-      <w:proofErr w:type="spellEnd"/>
     </w:p>
     <w:p>
       <w:pPr>
         <w:pStyle w:val="FirstParagraph"/>
       </w:pPr>
       <w:r>
-        <w:t xml:space="preserve">Perpustakaan kampus membutuhkan aplikasi untuk mencatat koleksi buku, memproses pengajuan pinjaman, dan memantau pengembalian. Mahasiswa dapat mencari buku serta mengajukan peminjaman secara </w:t>
-      </w:r>
-      <w:proofErr w:type="spellStart"/>
-      <w:r>
-        <w:t>online</w:t>
-      </w:r>
-      <w:proofErr w:type="spellEnd"/>
-      <w:r>
-        <w:t>. Pustakawan dapat mengelola koleksi dan mencatat transaksi dalam satu sistem.</w:t>
+        <w:t>Perpustakaan kampus membutuhkan aplikasi untuk mencatat koleksi buku, memproses pengajuan pinjaman, dan memantau pengembalian buku. Mahasiswa bisa mencari buku dan mengajukan pinjaman secara online. Pustakawan bisa mengelola koleksi dan mencatat transaksi di aplikasi yang sama.</w:t>
       </w:r>
     </w:p>
     <w:p>
@@ -2527,33 +2415,12 @@
         <w:pStyle w:val="Heading2"/>
       </w:pPr>
       <w:bookmarkStart w:id="8" w:name="objective-expected-improvements"/>
-      <w:bookmarkStart w:id="9" w:name="_Toc244034961"/>
+      <w:bookmarkStart w:id="9" w:name="_Toc244116509"/>
       <w:bookmarkEnd w:id="6"/>
       <w:r>
-        <w:t xml:space="preserve">2.2. </w:t>
-      </w:r>
-      <w:proofErr w:type="spellStart"/>
-      <w:r>
-        <w:t>Objective</w:t>
-      </w:r>
-      <w:proofErr w:type="spellEnd"/>
-      <w:r>
-        <w:t xml:space="preserve"> &amp; </w:t>
-      </w:r>
-      <w:proofErr w:type="spellStart"/>
-      <w:r>
-        <w:t>Expected</w:t>
-      </w:r>
-      <w:proofErr w:type="spellEnd"/>
-      <w:r>
-        <w:t xml:space="preserve"> </w:t>
-      </w:r>
-      <w:proofErr w:type="spellStart"/>
-      <w:r>
-        <w:t>Improvements</w:t>
+        <w:t>2.2. Tujuan dan perbaikan yang diharapkan</w:t>
       </w:r>
       <w:bookmarkEnd w:id="9"/>
-      <w:proofErr w:type="spellEnd"/>
     </w:p>
     <w:p>
       <w:pPr>
@@ -2564,7 +2431,7 @@
         </w:numPr>
       </w:pPr>
       <w:r>
-        <w:t>Memudahkan pencarian buku dan pemeriksaan ketersediaannya.</w:t>
+        <w:t>Memudahkan pengguna mencari buku dan mengecek ketersediaannya.</w:t>
       </w:r>
     </w:p>
     <w:p>
@@ -2576,7 +2443,7 @@
         </w:numPr>
       </w:pPr>
       <w:r>
-        <w:t>Memudahkan mahasiswa mengajukan pinjaman dan melihat statusnya.</w:t>
+        <w:t>Memudahkan mahasiswa mengajukan pinjaman dan mengecek status pengajuannya.</w:t>
       </w:r>
     </w:p>
     <w:p>
@@ -2588,7 +2455,7 @@
         </w:numPr>
       </w:pPr>
       <w:r>
-        <w:t>Membantu pustakawan mencatat penyerahan, pengembalian, dan keterlambatan.</w:t>
+        <w:t>Membantu pustakawan mencatat penyerahan buku, pengembalian, dan keterlambatan.</w:t>
       </w:r>
     </w:p>
     <w:p>
@@ -2600,15 +2467,8 @@
         </w:numPr>
       </w:pPr>
       <w:r>
-        <w:t xml:space="preserve">Menertibkan antrean </w:t>
-      </w:r>
-      <w:proofErr w:type="spellStart"/>
-      <w:r>
-        <w:t>reservasi</w:t>
-      </w:r>
-      <w:proofErr w:type="spellEnd"/>
-      <w:r>
-        <w:t xml:space="preserve"> dan pencatatan denda.</w:t>
+        <w:lastRenderedPageBreak/>
+        <w:t>Membantu pustakawan mengatur antrean reservasi dan mencatat denda.</w:t>
       </w:r>
     </w:p>
     <w:p>
@@ -2620,7 +2480,7 @@
         </w:numPr>
       </w:pPr>
       <w:r>
-        <w:t>Memungkinkan pustakawan mengubah aturan peminjaman sesuai kebutuhan.</w:t>
+        <w:t>Memberi pustakawan akses untuk mengubah aturan peminjaman sesuai kebutuhan.</w:t>
       </w:r>
     </w:p>
     <w:p>
@@ -2628,33 +2488,19 @@
         <w:pStyle w:val="Heading2"/>
       </w:pPr>
       <w:bookmarkStart w:id="10" w:name="business-process-overview"/>
-      <w:bookmarkStart w:id="11" w:name="_Toc244034962"/>
+      <w:bookmarkStart w:id="11" w:name="_Toc244116510"/>
       <w:bookmarkEnd w:id="8"/>
       <w:r>
-        <w:lastRenderedPageBreak/>
-        <w:t xml:space="preserve">2.3. Business </w:t>
-      </w:r>
-      <w:proofErr w:type="spellStart"/>
-      <w:r>
-        <w:t>Process</w:t>
-      </w:r>
-      <w:proofErr w:type="spellEnd"/>
-      <w:r>
-        <w:t xml:space="preserve"> </w:t>
-      </w:r>
-      <w:proofErr w:type="spellStart"/>
-      <w:r>
-        <w:t>Overview</w:t>
+        <w:t>2.3. Gambaran proses bisnis</w:t>
       </w:r>
       <w:bookmarkEnd w:id="11"/>
-      <w:proofErr w:type="spellEnd"/>
     </w:p>
     <w:p>
       <w:pPr>
         <w:pStyle w:val="FirstParagraph"/>
       </w:pPr>
       <w:r>
-        <w:t>Mahasiswa masuk ke aplikasi, mencari buku, lalu mengajukan pinjaman. Sistem menempatkan pengajuan pada daftar tunggu atau antrean sesuai ketersediaan. Pustakawan memeriksa pengajuan berdasarkan urutan masuk dan menyiapkan buku yang disetujui.</w:t>
+        <w:t>Mahasiswa masuk ke aplikasi, mencari buku, lalu mengajukan pinjaman. Sistem memasukkan pengajuan ke daftar tunggu atau antrean sesuai ketersediaan buku. Pustakawan memeriksa pengajuan sesuai urutan masuk, lalu menyiapkan buku untuk pengajuan yang disetujui.</w:t>
       </w:r>
     </w:p>
     <w:p>
@@ -2662,7 +2508,7 @@
         <w:pStyle w:val="BodyText"/>
       </w:pPr>
       <w:r>
-        <w:t>Mahasiswa mengambil buku di perpustakaan. Masa pinjam dimulai ketika pustakawan mencatat penyerahan. Saat buku kembali, pustakawan mencatat pengembalian dan sistem menghitung denda jika terlambat.</w:t>
+        <w:t>Mahasiswa mengambil buku di perpustakaan. Masa pinjam mulai dihitung saat pustakawan mencatat penyerahan buku. Saat buku dikembalikan, pustakawan mencatat pengembalian dan sistem menghitung denda jika ada keterlambatan.</w:t>
       </w:r>
     </w:p>
     <w:p>
@@ -2670,31 +2516,18 @@
         <w:pStyle w:val="Heading3"/>
       </w:pPr>
       <w:bookmarkStart w:id="12" w:name="current-business-process"/>
-      <w:bookmarkStart w:id="13" w:name="_Toc244034963"/>
-      <w:r>
-        <w:t xml:space="preserve">2.3.1. </w:t>
-      </w:r>
-      <w:proofErr w:type="spellStart"/>
-      <w:r>
-        <w:t>Current</w:t>
-      </w:r>
-      <w:proofErr w:type="spellEnd"/>
-      <w:r>
-        <w:t xml:space="preserve"> Business </w:t>
-      </w:r>
-      <w:proofErr w:type="spellStart"/>
-      <w:r>
-        <w:t>Process</w:t>
+      <w:bookmarkStart w:id="13" w:name="_Toc244116511"/>
+      <w:r>
+        <w:t>2.3.1. Proses bisnis saat ini</w:t>
       </w:r>
       <w:bookmarkEnd w:id="13"/>
-      <w:proofErr w:type="spellEnd"/>
     </w:p>
     <w:p>
       <w:pPr>
         <w:pStyle w:val="FirstParagraph"/>
       </w:pPr>
       <w:r>
-        <w:t>Proses yang digunakan perpustakaan saat ini belum dikonfirmasi melalui observasi. Pencatatan manual, seperti pemeriksaan buku di rak dan pencatatan transaksi oleh pustakawan, hanya menjadi gambaran pembanding bagi rancangan aplikasi.</w:t>
+        <w:t>Proses yang berjalan di perpustakaan saat ini belum dikonfirmasi melalui observasi. Pemeriksaan buku di rak dan pencatatan transaksi secara manual oleh pustakawan hanya digunakan sebagai pembanding untuk rancangan aplikasi.</w:t>
       </w:r>
     </w:p>
     <w:p>
@@ -2702,35 +2535,25 @@
         <w:pStyle w:val="Heading1"/>
       </w:pPr>
       <w:bookmarkStart w:id="14" w:name="scope"/>
-      <w:bookmarkStart w:id="15" w:name="_Toc244034964"/>
+      <w:bookmarkStart w:id="15" w:name="_Toc244116512"/>
       <w:bookmarkEnd w:id="4"/>
       <w:bookmarkEnd w:id="10"/>
       <w:bookmarkEnd w:id="12"/>
       <w:r>
-        <w:t xml:space="preserve">3. </w:t>
-      </w:r>
-      <w:proofErr w:type="spellStart"/>
-      <w:r>
-        <w:t>Scope</w:t>
+        <w:t>3. Ruang lingkup</w:t>
       </w:r>
       <w:bookmarkEnd w:id="15"/>
-      <w:proofErr w:type="spellEnd"/>
     </w:p>
     <w:p>
       <w:pPr>
         <w:pStyle w:val="Heading2"/>
       </w:pPr>
       <w:bookmarkStart w:id="16" w:name="in-scope"/>
-      <w:bookmarkStart w:id="17" w:name="_Toc244034965"/>
-      <w:r>
-        <w:t xml:space="preserve">3.1. In </w:t>
-      </w:r>
-      <w:proofErr w:type="spellStart"/>
-      <w:r>
-        <w:t>Scope</w:t>
+      <w:bookmarkStart w:id="17" w:name="_Toc244116513"/>
+      <w:r>
+        <w:t>3.1. Yang termasuk dalam proyek</w:t>
       </w:r>
       <w:bookmarkEnd w:id="17"/>
-      <w:proofErr w:type="spellEnd"/>
     </w:p>
     <w:p>
       <w:pPr>
@@ -2741,7 +2564,7 @@
         </w:numPr>
       </w:pPr>
       <w:r>
-        <w:t>Akun mahasiswa dan pustakawan dengan hak akses berbeda.</w:t>
+        <w:t>Akun mahasiswa dan pustakawan dengan hak akses yang berbeda.</w:t>
       </w:r>
     </w:p>
     <w:p>
@@ -2753,7 +2576,7 @@
         </w:numPr>
       </w:pPr>
       <w:r>
-        <w:t>Pengelolaan mahasiswa, kategori, dan buku dengan ISBN unik.</w:t>
+        <w:t>Pengelolaan data mahasiswa, kategori, dan buku dengan ISBN unik.</w:t>
       </w:r>
     </w:p>
     <w:p>
@@ -2765,7 +2588,7 @@
         </w:numPr>
       </w:pPr>
       <w:r>
-        <w:t>Katalog buku, pencarian, dan informasi ketersediaan.</w:t>
+        <w:t>Katalog untuk mencari buku dan mengecek ketersediaannya.</w:t>
       </w:r>
     </w:p>
     <w:p>
@@ -2777,23 +2600,7 @@
         </w:numPr>
       </w:pPr>
       <w:r>
-        <w:t xml:space="preserve">Pengajuan pinjaman </w:t>
-      </w:r>
-      <w:proofErr w:type="spellStart"/>
-      <w:r>
-        <w:t>online</w:t>
-      </w:r>
-      <w:proofErr w:type="spellEnd"/>
-      <w:r>
-        <w:t xml:space="preserve">, persetujuan, pembatalan, dan antrean </w:t>
-      </w:r>
-      <w:proofErr w:type="spellStart"/>
-      <w:r>
-        <w:t>reservasi</w:t>
-      </w:r>
-      <w:proofErr w:type="spellEnd"/>
-      <w:r>
-        <w:t>.</w:t>
+        <w:t>Pengajuan pinjaman secara online, persetujuan, pembatalan, dan antrean reservasi.</w:t>
       </w:r>
     </w:p>
     <w:p>
@@ -2805,7 +2612,7 @@
         </w:numPr>
       </w:pPr>
       <w:r>
-        <w:t>Pencatatan pengambilan buku, pengembalian, serta riwayat pinjaman.</w:t>
+        <w:t>Pencatatan pengambilan dan pengembalian buku, serta riwayat pinjaman.</w:t>
       </w:r>
     </w:p>
     <w:p>
@@ -2817,7 +2624,7 @@
         </w:numPr>
       </w:pPr>
       <w:r>
-        <w:t>Denda keterlambatan dan pencatatan pelunasan.</w:t>
+        <w:t>Perhitungan denda keterlambatan dan pencatatan pelunasannya.</w:t>
       </w:r>
     </w:p>
     <w:p>
@@ -2829,7 +2636,7 @@
         </w:numPr>
       </w:pPr>
       <w:r>
-        <w:t>Pengaturan aturan pinjam dan ringkasan transaksi perpustakaan.</w:t>
+        <w:t>Pengaturan aturan peminjaman dan tampilan ringkasan transaksi perpustakaan.</w:t>
       </w:r>
     </w:p>
     <w:p>
@@ -2837,33 +2644,12 @@
         <w:pStyle w:val="Heading2"/>
       </w:pPr>
       <w:bookmarkStart w:id="18" w:name="out-of-scope"/>
-      <w:bookmarkStart w:id="19" w:name="_Toc244034966"/>
+      <w:bookmarkStart w:id="19" w:name="_Toc244116514"/>
       <w:bookmarkEnd w:id="16"/>
       <w:r>
-        <w:t xml:space="preserve">3.2. </w:t>
-      </w:r>
-      <w:proofErr w:type="spellStart"/>
-      <w:r>
-        <w:t>Out</w:t>
-      </w:r>
-      <w:proofErr w:type="spellEnd"/>
-      <w:r>
-        <w:t xml:space="preserve"> </w:t>
-      </w:r>
-      <w:proofErr w:type="spellStart"/>
-      <w:r>
-        <w:t>of</w:t>
-      </w:r>
-      <w:proofErr w:type="spellEnd"/>
-      <w:r>
-        <w:t xml:space="preserve"> </w:t>
-      </w:r>
-      <w:proofErr w:type="spellStart"/>
-      <w:r>
-        <w:t>Scope</w:t>
+        <w:t>3.2. Yang tidak termasuk dalam proyek</w:t>
       </w:r>
       <w:bookmarkEnd w:id="19"/>
-      <w:proofErr w:type="spellEnd"/>
     </w:p>
     <w:p>
       <w:pPr>
@@ -2874,15 +2660,7 @@
         </w:numPr>
       </w:pPr>
       <w:r>
-        <w:t xml:space="preserve">Aplikasi seluler </w:t>
-      </w:r>
-      <w:proofErr w:type="spellStart"/>
-      <w:r>
-        <w:t>native</w:t>
-      </w:r>
-      <w:proofErr w:type="spellEnd"/>
-      <w:r>
-        <w:t>, buku elektronik, dan layanan lintas perpustakaan.</w:t>
+        <w:t>Aplikasi mobile native, buku elektronik, dan layanan antarperpustakaan.</w:t>
       </w:r>
     </w:p>
     <w:p>
@@ -2894,23 +2672,7 @@
         </w:numPr>
       </w:pPr>
       <w:r>
-        <w:t xml:space="preserve">Integrasi sistem akademik, SSO kampus, RFID, dan </w:t>
-      </w:r>
-      <w:proofErr w:type="spellStart"/>
-      <w:r>
-        <w:t>payment</w:t>
-      </w:r>
-      <w:proofErr w:type="spellEnd"/>
-      <w:r>
-        <w:t xml:space="preserve"> </w:t>
-      </w:r>
-      <w:proofErr w:type="spellStart"/>
-      <w:r>
-        <w:t>gateway</w:t>
-      </w:r>
-      <w:proofErr w:type="spellEnd"/>
-      <w:r>
-        <w:t>.</w:t>
+        <w:t>Integrasi dengan sistem akademik, SSO kampus, RFID, dan payment gateway.</w:t>
       </w:r>
     </w:p>
     <w:p>
@@ -2922,15 +2684,7 @@
         </w:numPr>
       </w:pPr>
       <w:r>
-        <w:t xml:space="preserve">Pembayaran </w:t>
-      </w:r>
-      <w:proofErr w:type="spellStart"/>
-      <w:r>
-        <w:t>online</w:t>
-      </w:r>
-      <w:proofErr w:type="spellEnd"/>
-      <w:r>
-        <w:t>, cicilan, serta penghapusan denda.</w:t>
+        <w:t>Pembayaran secara online, cicilan, dan penghapusan denda.</w:t>
       </w:r>
     </w:p>
     <w:p>
@@ -2942,7 +2696,7 @@
         </w:numPr>
       </w:pPr>
       <w:r>
-        <w:t>Penggantian buku hilang atau rusak dan pengadaan koleksi.</w:t>
+        <w:t>Penggantian buku yang hilang atau rusak, serta pengadaan koleksi buku.</w:t>
       </w:r>
     </w:p>
     <w:p>
@@ -2954,15 +2708,7 @@
         </w:numPr>
       </w:pPr>
       <w:r>
-        <w:t xml:space="preserve">Notifikasi melalui email, SMS, atau </w:t>
-      </w:r>
-      <w:proofErr w:type="spellStart"/>
-      <w:r>
-        <w:t>WhatsApp</w:t>
-      </w:r>
-      <w:proofErr w:type="spellEnd"/>
-      <w:r>
-        <w:t>. Status tersedia dalam aplikasi.</w:t>
+        <w:t>Notifikasi melalui email, SMS, atau WhatsApp. Status bisa dilihat di aplikasi.</w:t>
       </w:r>
     </w:p>
     <w:p>
@@ -2974,7 +2720,7 @@
         </w:numPr>
       </w:pPr>
       <w:r>
-        <w:t>Perpanjangan pinjaman.</w:t>
+        <w:t>Perpanjangan masa pinjam.</w:t>
       </w:r>
     </w:p>
     <w:p>
@@ -2982,34 +2728,25 @@
         <w:pStyle w:val="Heading1"/>
       </w:pPr>
       <w:bookmarkStart w:id="20" w:name="system-perspective"/>
-      <w:bookmarkStart w:id="21" w:name="_Toc244034967"/>
+      <w:bookmarkStart w:id="21" w:name="_Toc244116515"/>
       <w:bookmarkEnd w:id="14"/>
       <w:bookmarkEnd w:id="18"/>
       <w:r>
-        <w:t xml:space="preserve">4. System </w:t>
-      </w:r>
-      <w:proofErr w:type="spellStart"/>
-      <w:r>
-        <w:t>Perspective</w:t>
+        <w:lastRenderedPageBreak/>
+        <w:t>4. Gambaran sistem</w:t>
       </w:r>
       <w:bookmarkEnd w:id="21"/>
-      <w:proofErr w:type="spellEnd"/>
     </w:p>
     <w:p>
       <w:pPr>
         <w:pStyle w:val="Heading2"/>
       </w:pPr>
       <w:bookmarkStart w:id="22" w:name="assumptions"/>
-      <w:bookmarkStart w:id="23" w:name="_Toc244034968"/>
-      <w:r>
-        <w:t xml:space="preserve">4.1. </w:t>
-      </w:r>
-      <w:proofErr w:type="spellStart"/>
-      <w:r>
-        <w:t>Assumptions</w:t>
+      <w:bookmarkStart w:id="23" w:name="_Toc244116516"/>
+      <w:r>
+        <w:t>4.1. Asumsi</w:t>
       </w:r>
       <w:bookmarkEnd w:id="23"/>
-      <w:proofErr w:type="spellEnd"/>
     </w:p>
     <w:p>
       <w:pPr>
@@ -3020,7 +2757,7 @@
         </w:numPr>
       </w:pPr>
       <w:r>
-        <w:t>Sistem digunakan oleh satu perpustakaan kampus untuk koleksi fisik.</w:t>
+        <w:t>Sistem digunakan oleh satu perpustakaan kampus untuk mengelola koleksi buku fisik.</w:t>
       </w:r>
     </w:p>
     <w:p>
@@ -3044,7 +2781,7 @@
         </w:numPr>
       </w:pPr>
       <w:r>
-        <w:t>Pustakawan memverifikasi identitas mahasiswa dan kondisi buku.</w:t>
+        <w:t>Pustakawan memeriksa identitas mahasiswa dan kondisi buku.</w:t>
       </w:r>
     </w:p>
     <w:p>
@@ -3056,7 +2793,7 @@
         </w:numPr>
       </w:pPr>
       <w:r>
-        <w:t>Akun mahasiswa dikelola pustakawan. Akun pustakawan pertama disiapkan pengelola teknis.</w:t>
+        <w:t>Pustakawan mengelola akun mahasiswa. Pengelola teknis menyiapkan akun pustakawan pertama.</w:t>
       </w:r>
     </w:p>
     <w:p>
@@ -3068,8 +2805,7 @@
         </w:numPr>
       </w:pPr>
       <w:r>
-        <w:lastRenderedPageBreak/>
-        <w:t>Perhitungan waktu menggunakan hari kalender dalam zona waktu Asia/Jakarta.</w:t>
+        <w:t>Waktu dihitung berdasarkan hari kalender dengan zona waktu Asia/Jakarta.</w:t>
       </w:r>
     </w:p>
     <w:p>
@@ -3077,24 +2813,19 @@
         <w:pStyle w:val="Heading2"/>
       </w:pPr>
       <w:bookmarkStart w:id="24" w:name="exclusions"/>
-      <w:bookmarkStart w:id="25" w:name="_Toc244034969"/>
+      <w:bookmarkStart w:id="25" w:name="_Toc244116517"/>
       <w:bookmarkEnd w:id="22"/>
       <w:r>
-        <w:t xml:space="preserve">4.2. </w:t>
-      </w:r>
-      <w:proofErr w:type="spellStart"/>
-      <w:r>
-        <w:t>Exclusions</w:t>
+        <w:t>4.2. Hal di luar tanggung jawab aplikasi</w:t>
       </w:r>
       <w:bookmarkEnd w:id="25"/>
-      <w:proofErr w:type="spellEnd"/>
     </w:p>
     <w:p>
       <w:pPr>
         <w:pStyle w:val="FirstParagraph"/>
       </w:pPr>
       <w:r>
-        <w:t>Pemeriksaan fisik buku dan penerimaan pembayaran tetap dilakukan pustakawan. Aplikasi hanya mencatat hasilnya. Pembayaran denda dilakukan di luar aplikasi dan dicatat setelah lunas. Migrasi data lama serta pemeliharaan perangkat keras tidak termasuk dalam proyek awal.</w:t>
+        <w:t>Pustakawan tetap memeriksa kondisi fisik buku dan menerima pembayaran. Aplikasi hanya mencatat hasilnya. Denda dibayar di luar aplikasi, lalu dicatat setelah lunas. Migrasi data lama dan pemeliharaan perangkat keras tidak termasuk dalam proyek awal.</w:t>
       </w:r>
     </w:p>
     <w:p>
@@ -3102,17 +2833,12 @@
         <w:pStyle w:val="Heading2"/>
       </w:pPr>
       <w:bookmarkStart w:id="26" w:name="constraints"/>
-      <w:bookmarkStart w:id="27" w:name="_Toc244034970"/>
+      <w:bookmarkStart w:id="27" w:name="_Toc244116518"/>
       <w:bookmarkEnd w:id="24"/>
       <w:r>
-        <w:t xml:space="preserve">4.3. </w:t>
-      </w:r>
-      <w:proofErr w:type="spellStart"/>
-      <w:r>
-        <w:t>Constraints</w:t>
+        <w:t>4.3. Batasan</w:t>
       </w:r>
       <w:bookmarkEnd w:id="27"/>
-      <w:proofErr w:type="spellEnd"/>
     </w:p>
     <w:p>
       <w:pPr>
@@ -3123,7 +2849,7 @@
         </w:numPr>
       </w:pPr>
       <w:r>
-        <w:t>Pengembangan dibatasi pada dua peran, yaitu mahasiswa dan pustakawan.</w:t>
+        <w:t>Sistem dikembangkan untuk dua peran, yaitu mahasiswa dan pustakawan.</w:t>
       </w:r>
     </w:p>
     <w:p>
@@ -3135,7 +2861,7 @@
         </w:numPr>
       </w:pPr>
       <w:r>
-        <w:t>Satu data buku mewakili satu buku fisik dengan ISBN wajib dan unik. Setiap pengajuan memuat satu buku dan menghasilkan paling banyak satu pinjaman.</w:t>
+        <w:t>Setiap data buku mewakili satu buku fisik dengan ISBN yang wajib diisi dan harus unik. Satu pengajuan hanya memuat satu buku dan bisa menghasilkan paling banyak satu pinjaman.</w:t>
       </w:r>
     </w:p>
     <w:p>
@@ -3147,7 +2873,7 @@
         </w:numPr>
       </w:pPr>
       <w:r>
-        <w:t>Jadwal, anggaran, dan teknologi implementasi belum ditetapkan.</w:t>
+        <w:t>Jadwal, anggaran, dan teknologi yang akan digunakan belum ditetapkan.</w:t>
       </w:r>
     </w:p>
     <w:p>
@@ -3159,7 +2885,7 @@
         </w:numPr>
       </w:pPr>
       <w:r>
-        <w:t>Ketersediaan aplikasi bergantung pada server dan jaringan yang digunakan.</w:t>
+        <w:t>Ketersediaan aplikasi bergantung pada kondisi server dan jaringan yang digunakan.</w:t>
       </w:r>
     </w:p>
     <w:p>
@@ -3167,42 +2893,24 @@
         <w:pStyle w:val="Heading1"/>
       </w:pPr>
       <w:bookmarkStart w:id="28" w:name="business-requirements"/>
-      <w:bookmarkStart w:id="29" w:name="_Toc244034971"/>
+      <w:bookmarkStart w:id="29" w:name="_Toc244116519"/>
       <w:bookmarkEnd w:id="20"/>
       <w:bookmarkEnd w:id="26"/>
       <w:r>
-        <w:t xml:space="preserve">5. Business </w:t>
-      </w:r>
-      <w:proofErr w:type="spellStart"/>
-      <w:r>
-        <w:t>Requirements</w:t>
+        <w:t>5. Kebutuhan bisnis</w:t>
       </w:r>
       <w:bookmarkEnd w:id="29"/>
-      <w:proofErr w:type="spellEnd"/>
     </w:p>
     <w:p>
       <w:pPr>
         <w:pStyle w:val="Heading2"/>
       </w:pPr>
       <w:bookmarkStart w:id="30" w:name="functional-requirements"/>
-      <w:bookmarkStart w:id="31" w:name="_Toc244034972"/>
-      <w:r>
-        <w:t xml:space="preserve">5.1. </w:t>
-      </w:r>
-      <w:proofErr w:type="spellStart"/>
-      <w:r>
-        <w:t>Functional</w:t>
-      </w:r>
-      <w:proofErr w:type="spellEnd"/>
-      <w:r>
-        <w:t xml:space="preserve"> </w:t>
-      </w:r>
-      <w:proofErr w:type="spellStart"/>
-      <w:r>
-        <w:t>Requirements</w:t>
+      <w:bookmarkStart w:id="31" w:name="_Toc244116520"/>
+      <w:r>
+        <w:t>5.1. Kebutuhan fungsional</w:t>
       </w:r>
       <w:bookmarkEnd w:id="31"/>
-      <w:proofErr w:type="spellEnd"/>
     </w:p>
     <w:p>
       <w:pPr>
@@ -3217,26 +2925,10 @@
           <w:b/>
           <w:bCs/>
         </w:rPr>
-        <w:t xml:space="preserve">FR-01. </w:t>
-      </w:r>
-      <w:proofErr w:type="spellStart"/>
-      <w:r>
-        <w:rPr>
-          <w:b/>
-          <w:bCs/>
-        </w:rPr>
-        <w:t>Autentikasi</w:t>
-      </w:r>
-      <w:proofErr w:type="spellEnd"/>
-      <w:r>
-        <w:rPr>
-          <w:b/>
-          <w:bCs/>
-        </w:rPr>
-        <w:t>.</w:t>
-      </w:r>
-      <w:r>
-        <w:t xml:space="preserve"> Pengguna dapat masuk dan keluar. Akses dibatasi berdasarkan peran, status akun, dan kepemilikan transaksi.</w:t>
+        <w:t>FR-01. Autentikasi.</w:t>
+      </w:r>
+      <w:r>
+        <w:t xml:space="preserve"> Pengguna bisa masuk dan keluar dari aplikasi. Hak akses mengikuti peran, status akun, dan kepemilikan transaksi.</w:t>
       </w:r>
     </w:p>
     <w:p>
@@ -3255,7 +2947,7 @@
         <w:t>FR-02. Data mahasiswa.</w:t>
       </w:r>
       <w:r>
-        <w:t xml:space="preserve"> Pustakawan dapat menambah, memperbarui, dan menonaktifkan akun mahasiswa. NIM dan email harus unik.</w:t>
+        <w:t xml:space="preserve"> Pustakawan bisa menambah, memperbarui, dan menonaktifkan akun mahasiswa. Setiap akun harus memiliki NIM dan email yang unik.</w:t>
       </w:r>
     </w:p>
     <w:p>
@@ -3274,7 +2966,7 @@
         <w:t>FR-03. Data buku.</w:t>
       </w:r>
       <w:r>
-        <w:t xml:space="preserve"> Pustakawan dapat mengelola kategori, judul, penulis, ISBN wajib dan unik, penerbit, serta tahun terbit. ISBN yang sama tidak boleh dibuat sebagai buku lain.</w:t>
+        <w:t xml:space="preserve"> Pustakawan bisa mengelola kategori, judul, penulis, ISBN, penerbit, dan tahun terbit. ISBN wajib diisi dan harus unik. Buku lain tidak boleh menggunakan ISBN yang sama.</w:t>
       </w:r>
     </w:p>
     <w:p>
@@ -3293,7 +2985,7 @@
         <w:t>FR-04. Ketersediaan buku.</w:t>
       </w:r>
       <w:r>
-        <w:t xml:space="preserve"> Satu judul hanya memiliki satu buku fisik. Buku tersedia jika aktif, belum disiapkan untuk pengambilan, dan tidak sedang dipinjam. Tidak ada tabel eksemplar, kode inventaris, atau jumlah stok.</w:t>
+        <w:t xml:space="preserve"> Setiap judul hanya memiliki satu buku fisik. Buku tersedia jika statusnya aktif, belum disiapkan untuk diambil, dan tidak sedang dipinjam. Sistem tidak menggunakan tabel eksemplar, kode inventaris, atau jumlah stok.</w:t>
       </w:r>
     </w:p>
     <w:p>
@@ -3312,7 +3004,7 @@
         <w:t>FR-05. Katalog.</w:t>
       </w:r>
       <w:r>
-        <w:t xml:space="preserve"> Pengguna dapat mencari buku dan melihat status tersedia, siap diambil, dipinjam, atau nonaktif.</w:t>
+        <w:t xml:space="preserve"> Pengguna bisa mencari buku dan melihat statusnya, yaitu tersedia, siap diambil, dipinjam, atau nonaktif.</w:t>
       </w:r>
     </w:p>
     <w:p>
@@ -3328,26 +3020,11 @@
           <w:b/>
           <w:bCs/>
         </w:rPr>
-        <w:t xml:space="preserve">FR-06. Pengajuan </w:t>
-      </w:r>
-      <w:proofErr w:type="spellStart"/>
-      <w:r>
-        <w:rPr>
-          <w:b/>
-          <w:bCs/>
-        </w:rPr>
-        <w:t>online</w:t>
-      </w:r>
-      <w:proofErr w:type="spellEnd"/>
-      <w:r>
-        <w:rPr>
-          <w:b/>
-          <w:bCs/>
-        </w:rPr>
-        <w:t>.</w:t>
-      </w:r>
-      <w:r>
-        <w:t xml:space="preserve"> Mahasiswa dapat mengajukan pinjaman dan melihat status pengajuannya.</w:t>
+        <w:lastRenderedPageBreak/>
+        <w:t>FR-06. Pengajuan online.</w:t>
+      </w:r>
+      <w:r>
+        <w:t xml:space="preserve"> Mahasiswa bisa mengajukan pinjaman dan mengecek status pengajuannya.</w:t>
       </w:r>
     </w:p>
     <w:p>
@@ -3363,26 +3040,10 @@
           <w:b/>
           <w:bCs/>
         </w:rPr>
-        <w:t xml:space="preserve">FR-07. Antrean </w:t>
-      </w:r>
-      <w:proofErr w:type="spellStart"/>
-      <w:r>
-        <w:rPr>
-          <w:b/>
-          <w:bCs/>
-        </w:rPr>
-        <w:t>reservasi</w:t>
-      </w:r>
-      <w:proofErr w:type="spellEnd"/>
-      <w:r>
-        <w:rPr>
-          <w:b/>
-          <w:bCs/>
-        </w:rPr>
-        <w:t>.</w:t>
-      </w:r>
-      <w:r>
-        <w:t xml:space="preserve"> Sistem mengurutkan pengajuan per judul berdasarkan waktu masuk.</w:t>
+        <w:t>FR-07. Antrean reservasi.</w:t>
+      </w:r>
+      <w:r>
+        <w:t xml:space="preserve"> Sistem mengurutkan pengajuan untuk setiap judul berdasarkan waktu pengajuan masuk.</w:t>
       </w:r>
     </w:p>
     <w:p>
@@ -3401,7 +3062,7 @@
         <w:t>FR-08. Persetujuan.</w:t>
       </w:r>
       <w:r>
-        <w:t xml:space="preserve"> Pustakawan dapat menyetujui atau menolak pengajuan dengan alasan yang jelas.</w:t>
+        <w:t xml:space="preserve"> Pustakawan bisa menyetujui atau menolak pengajuan dengan alasan yang jelas.</w:t>
       </w:r>
     </w:p>
     <w:p>
@@ -3420,7 +3081,7 @@
         <w:t>FR-09. Pembatalan.</w:t>
       </w:r>
       <w:r>
-        <w:t xml:space="preserve"> Mahasiswa dapat membatalkan pengajuan sebelum penyerahan. Pengajuan yang melewati batas pengambilan kedaluwarsa dan melepas buku.</w:t>
+        <w:t xml:space="preserve"> Mahasiswa bisa membatalkan pengajuan sebelum buku diserahkan. Jika batas waktu pengambilan terlewati, pengajuan menjadi kedaluwarsa dan buku tidak lagi ditahan untuk pengajuan tersebut.</w:t>
       </w:r>
     </w:p>
     <w:p>
@@ -3439,7 +3100,7 @@
         <w:t>FR-10. Penyerahan.</w:t>
       </w:r>
       <w:r>
-        <w:t xml:space="preserve"> Pustakawan mencatat pengambilan buku. Sistem membuat pinjaman dan menetapkan tanggal jatuh tempo.</w:t>
+        <w:t xml:space="preserve"> Pustakawan mencatat pengambilan buku. Setelah itu, sistem membuat pinjaman dan menentukan tanggal jatuh tempo.</w:t>
       </w:r>
     </w:p>
     <w:p>
@@ -3458,7 +3119,7 @@
         <w:t>FR-11. Pengembalian.</w:t>
       </w:r>
       <w:r>
-        <w:t xml:space="preserve"> Pustakawan mencatat waktu kembali, kondisi buku, dan penyelesaian pinjaman.</w:t>
+        <w:t xml:space="preserve"> Pustakawan mencatat waktu pengembalian, kondisi buku, dan penyelesaian pinjaman.</w:t>
       </w:r>
     </w:p>
     <w:p>
@@ -3474,11 +3135,10 @@
           <w:b/>
           <w:bCs/>
         </w:rPr>
-        <w:lastRenderedPageBreak/>
         <w:t>FR-12. Denda.</w:t>
       </w:r>
       <w:r>
-        <w:t xml:space="preserve"> Sistem menghitung denda keterlambatan. Pustakawan mencatat pelunasan penuh beserta referensi pembayaran.</w:t>
+        <w:t xml:space="preserve"> Sistem menghitung denda keterlambatan. Pustakawan mencatat pelunasan denda secara penuh beserta referensi pembayarannya.</w:t>
       </w:r>
     </w:p>
     <w:p>
@@ -3497,7 +3157,7 @@
         <w:t>FR-13. Pengaturan.</w:t>
       </w:r>
       <w:r>
-        <w:t xml:space="preserve"> Pustakawan dapat mengubah angka kebijakan berikut. Perubahan tidak mengubah ketentuan pinjaman lama.</w:t>
+        <w:t xml:space="preserve"> Pustakawan bisa mengubah nilai aturan peminjaman pada tabel berikut. Perubahan ini tidak mengubah ketentuan pinjaman yang sudah ada.</w:t>
       </w:r>
     </w:p>
     <w:p>
@@ -3516,7 +3176,7 @@
         <w:t>FR-14. Ringkasan dan riwayat.</w:t>
       </w:r>
       <w:r>
-        <w:t xml:space="preserve"> Pustakawan dapat melihat seluruh transaksi. Mahasiswa hanya dapat melihat transaksi miliknya.</w:t>
+        <w:t xml:space="preserve"> Pustakawan bisa melihat seluruh transaksi. Mahasiswa hanya bisa melihat transaksi miliknya sendiri.</w:t>
       </w:r>
     </w:p>
     <w:p>
@@ -3524,7 +3184,7 @@
         <w:pStyle w:val="FirstParagraph"/>
       </w:pPr>
       <w:r>
-        <w:t>Aturan awal yang telah disepakati adalah sebagai berikut.</w:t>
+        <w:t>Berikut aturan awal yang sudah disepakati.</w:t>
       </w:r>
     </w:p>
     <w:tbl>
@@ -3542,7 +3202,7 @@
         <w:tblLook w:val="0020" w:firstRow="1" w:lastRow="0" w:firstColumn="0" w:lastColumn="0" w:noHBand="0" w:noVBand="0"/>
       </w:tblPr>
       <w:tblGrid>
-        <w:gridCol w:w="2472"/>
+        <w:gridCol w:w="2893"/>
         <w:gridCol w:w="3828"/>
       </w:tblGrid>
       <w:tr>
@@ -3565,13 +3225,8 @@
               <w:pStyle w:val="Compact"/>
             </w:pPr>
             <w:r>
-              <w:t xml:space="preserve">Business </w:t>
-            </w:r>
-            <w:proofErr w:type="spellStart"/>
-            <w:r>
-              <w:t>rule</w:t>
-            </w:r>
-            <w:proofErr w:type="spellEnd"/>
+              <w:t>Aturan peminjaman</w:t>
+            </w:r>
           </w:p>
         </w:tc>
         <w:tc>
@@ -3588,19 +3243,9 @@
             <w:pPr>
               <w:pStyle w:val="Compact"/>
             </w:pPr>
-            <w:proofErr w:type="spellStart"/>
-            <w:r>
-              <w:t>Initial</w:t>
-            </w:r>
-            <w:proofErr w:type="spellEnd"/>
-            <w:r>
-              <w:t xml:space="preserve"> </w:t>
-            </w:r>
-            <w:proofErr w:type="spellStart"/>
-            <w:r>
-              <w:t>value</w:t>
-            </w:r>
-            <w:proofErr w:type="spellEnd"/>
+            <w:r>
+              <w:t>Nilai awal</w:t>
+            </w:r>
           </w:p>
         </w:tc>
       </w:tr>
@@ -3620,7 +3265,7 @@
               <w:pStyle w:val="Compact"/>
             </w:pPr>
             <w:r>
-              <w:t>Batas buku</w:t>
+              <w:t>Batas jumlah buku</w:t>
             </w:r>
           </w:p>
         </w:tc>
@@ -3740,7 +3385,7 @@
               <w:pStyle w:val="Compact"/>
             </w:pPr>
             <w:r>
-              <w:t>Waktu pengambilan</w:t>
+              <w:t>Batas waktu pengambilan</w:t>
             </w:r>
           </w:p>
         </w:tc>
@@ -3770,7 +3415,7 @@
         <w:pStyle w:val="BodyText"/>
       </w:pPr>
       <w:r>
-        <w:t>Kuota terpakai mencakup buku yang sedang dipinjam dan buku yang sudah disiapkan. Pengajuan yang masih menunggu atau mengantre belum memakai kuota. Akun nonaktif, pinjaman terlambat, denda belum lunas, kuota penuh, atau pengajuan ganda menghalangi pinjaman baru. Sistem memeriksa ulang kelayakan saat persetujuan dan penyerahan.</w:t>
+        <w:t>Buku yang sedang dipinjam dan yang sudah disiapkan sama-sama memakai kuota mahasiswa. Pengajuan yang masih menunggu atau mengantre belum memakai kuota. Mahasiswa tidak bisa mengajukan pinjaman baru jika akunnya nonaktif, memiliki pinjaman terlambat atau denda yang belum lunas, kuotanya penuh, atau ada pengajuan ganda. Sistem mengecek ulang kelayakan saat pengajuan disetujui dan buku diserahkan.</w:t>
       </w:r>
     </w:p>
     <w:p>
@@ -3778,15 +3423,7 @@
         <w:pStyle w:val="BodyText"/>
       </w:pPr>
       <w:r>
-        <w:t xml:space="preserve">Batas pengambilan dan jatuh tempo berlaku sampai akhir tanggal yang ditetapkan dalam WIB. </w:t>
-      </w:r>
-      <w:proofErr w:type="spellStart"/>
-      <w:r>
-        <w:t>Fitur</w:t>
-      </w:r>
-      <w:proofErr w:type="spellEnd"/>
-      <w:r>
-        <w:t xml:space="preserve"> perpanjangan pinjaman tidak termasuk dalam rancangan ini.</w:t>
+        <w:t>Batas waktu pengambilan dan jatuh tempo berlaku sampai akhir tanggal yang ditentukan dalam WIB. Rancangan ini tidak mencakup fitur perpanjangan masa pinjam.</w:t>
       </w:r>
     </w:p>
     <w:p>
@@ -3794,25 +3431,12 @@
         <w:pStyle w:val="Heading2"/>
       </w:pPr>
       <w:bookmarkStart w:id="32" w:name="non-functional-requirements"/>
-      <w:bookmarkStart w:id="33" w:name="_Toc244034973"/>
+      <w:bookmarkStart w:id="33" w:name="_Toc244116521"/>
       <w:bookmarkEnd w:id="30"/>
       <w:r>
-        <w:t>5.2. Non-</w:t>
-      </w:r>
-      <w:proofErr w:type="spellStart"/>
-      <w:r>
-        <w:t>functional</w:t>
-      </w:r>
-      <w:proofErr w:type="spellEnd"/>
-      <w:r>
-        <w:t xml:space="preserve"> </w:t>
-      </w:r>
-      <w:proofErr w:type="spellStart"/>
-      <w:r>
-        <w:t>Requirements</w:t>
+        <w:t>5.2. Kebutuhan nonfungsional</w:t>
       </w:r>
       <w:bookmarkEnd w:id="33"/>
-      <w:proofErr w:type="spellEnd"/>
     </w:p>
     <w:p>
       <w:pPr>
@@ -3830,23 +3454,7 @@
         <w:t>NFR-01. Keamanan.</w:t>
       </w:r>
       <w:r>
-        <w:t xml:space="preserve"> Kata sandi disimpan sebagai </w:t>
-      </w:r>
-      <w:proofErr w:type="spellStart"/>
-      <w:r>
-        <w:t>hash</w:t>
-      </w:r>
-      <w:proofErr w:type="spellEnd"/>
-      <w:r>
-        <w:t xml:space="preserve">. Sistem memeriksa hak akses pada server dan menggunakan HTTPS saat digunakan secara </w:t>
-      </w:r>
-      <w:proofErr w:type="spellStart"/>
-      <w:r>
-        <w:t>online</w:t>
-      </w:r>
-      <w:proofErr w:type="spellEnd"/>
-      <w:r>
-        <w:t>.</w:t>
+        <w:t xml:space="preserve"> Kata sandi disimpan dalam bentuk hash. Sistem mengecek hak akses di server dan menggunakan HTTPS saat aplikasi diakses secara online.</w:t>
       </w:r>
     </w:p>
     <w:p>
@@ -3865,7 +3473,7 @@
         <w:t>NFR-02. Integritas data.</w:t>
       </w:r>
       <w:r>
-        <w:t xml:space="preserve"> Satu buku tidak dapat disiapkan atau dipinjam oleh dua mahasiswa bersamaan. ISBN wajib unik. Pengiriman ulang transaksi tidak menggandakan pencatatan.</w:t>
+        <w:t xml:space="preserve"> Satu buku tidak bisa disiapkan atau dipinjam oleh dua mahasiswa pada saat yang sama. Setiap ISBN harus unik. Transaksi yang dikirim ulang tidak boleh tercatat lebih dari sekali.</w:t>
       </w:r>
     </w:p>
     <w:p>
@@ -3881,10 +3489,11 @@
           <w:b/>
           <w:bCs/>
         </w:rPr>
+        <w:lastRenderedPageBreak/>
         <w:t>NFR-03. Kinerja.</w:t>
       </w:r>
       <w:r>
-        <w:t xml:space="preserve"> Target waktu respons pencarian dan riwayat adalah maksimal 2 detik untuk 95% permintaan pada pengujian 20 pengguna bersamaan, 5.000 buku dengan ISBN berbeda.</w:t>
+        <w:t xml:space="preserve"> Pencarian dan riwayat ditargetkan merespons dalam waktu maksimal 2 detik untuk 95% permintaan. Target ini berlaku untuk pengujian dengan 20 pengguna yang mengakses bersamaan dan 5.000 buku dengan ISBN berbeda.</w:t>
       </w:r>
     </w:p>
     <w:p>
@@ -3903,7 +3512,7 @@
         <w:t>NFR-04. Kemudahan penggunaan.</w:t>
       </w:r>
       <w:r>
-        <w:t xml:space="preserve"> Tampilan dapat digunakan pada komputer dan ponsel, dengan formulir berlabel serta pesan kesalahan yang jelas.</w:t>
+        <w:t xml:space="preserve"> Tampilan bisa digunakan di komputer dan ponsel. Setiap formulir memiliki label dan pesan kesalahan yang jelas.</w:t>
       </w:r>
     </w:p>
     <w:p>
@@ -3922,7 +3531,7 @@
         <w:t>NFR-05. Pencadangan.</w:t>
       </w:r>
       <w:r>
-        <w:t xml:space="preserve"> Data dicadangkan setiap hari dan dapat dipulihkan dari cadangan terakhir.</w:t>
+        <w:t xml:space="preserve"> Data dicadangkan setiap hari dan bisa dipulihkan menggunakan cadangan terakhir.</w:t>
       </w:r>
     </w:p>
     <w:p>
@@ -3941,7 +3550,7 @@
         <w:t>NFR-06. Ketepatan waktu.</w:t>
       </w:r>
       <w:r>
-        <w:t xml:space="preserve"> Perhitungan jatuh tempo, pengambilan, dan keterlambatan konsisten dalam zona waktu Asia/Jakarta.</w:t>
+        <w:t xml:space="preserve"> Sistem menghitung jatuh tempo, batas pengambilan, dan keterlambatan secara konsisten dengan zona waktu Asia/Jakarta.</w:t>
       </w:r>
     </w:p>
     <w:p>
@@ -3960,7 +3569,7 @@
         <w:t>NFR-07. Riwayat aktivitas.</w:t>
       </w:r>
       <w:r>
-        <w:t xml:space="preserve"> Sistem menyimpan pelaku dan waktu transaksi penting agar perubahan dapat ditelusuri.</w:t>
+        <w:t xml:space="preserve"> Sistem mencatat siapa yang menjalankan transaksi penting dan kapan transaksi dilakukan agar perubahan bisa ditelusuri.</w:t>
       </w:r>
     </w:p>
     <w:p>
@@ -3968,7 +3577,7 @@
         <w:pStyle w:val="FirstParagraph"/>
       </w:pPr>
       <w:r>
-        <w:t>Target tersebut menjadi acuan pengujian saat implementasi. Aplikasi belum dibangun atau diuji. ERD lengkap tersedia pada bagian 5.3.</w:t>
+        <w:t>Target di atas digunakan sebagai acuan pengujian saat implementasi. Aplikasi belum dibangun atau diuji. ERD lengkap bisa dilihat di bagian 5.3.</w:t>
       </w:r>
     </w:p>
     <w:p>
@@ -3976,27 +3585,10 @@
         <w:pStyle w:val="Heading2"/>
       </w:pPr>
       <w:bookmarkStart w:id="34" w:name="entity-relationship-diagram"/>
-      <w:bookmarkStart w:id="35" w:name="_Toc244034974"/>
+      <w:bookmarkStart w:id="35" w:name="_Toc244116522"/>
       <w:bookmarkEnd w:id="32"/>
       <w:r>
-        <w:lastRenderedPageBreak/>
-        <w:t xml:space="preserve">5.3. </w:t>
-      </w:r>
-      <w:proofErr w:type="spellStart"/>
-      <w:r>
-        <w:t>Entity</w:t>
-      </w:r>
-      <w:proofErr w:type="spellEnd"/>
-      <w:r>
-        <w:t xml:space="preserve"> </w:t>
-      </w:r>
-      <w:proofErr w:type="spellStart"/>
-      <w:r>
-        <w:t>Relationship</w:t>
-      </w:r>
-      <w:proofErr w:type="spellEnd"/>
-      <w:r>
-        <w:t xml:space="preserve"> Diagram</w:t>
+        <w:t>5.3. Diagram relasi entitas (ERD)</w:t>
       </w:r>
       <w:bookmarkEnd w:id="35"/>
     </w:p>
@@ -4005,71 +3597,7 @@
         <w:pStyle w:val="FirstParagraph"/>
       </w:pPr>
       <w:r>
-        <w:t xml:space="preserve">ERD berikut menggabungkan seluruh 7 tabel dan 12 relasi dalam satu diagram. Setiap tabel menampilkan seluruh atribut, tipe data, dan kuncinya. PK adalah </w:t>
-      </w:r>
-      <w:proofErr w:type="spellStart"/>
-      <w:r>
-        <w:t>primary</w:t>
-      </w:r>
-      <w:proofErr w:type="spellEnd"/>
-      <w:r>
-        <w:t xml:space="preserve"> </w:t>
-      </w:r>
-      <w:proofErr w:type="spellStart"/>
-      <w:r>
-        <w:t>key</w:t>
-      </w:r>
-      <w:proofErr w:type="spellEnd"/>
-      <w:r>
-        <w:t xml:space="preserve">, FK adalah </w:t>
-      </w:r>
-      <w:proofErr w:type="spellStart"/>
-      <w:r>
-        <w:t>foreign</w:t>
-      </w:r>
-      <w:proofErr w:type="spellEnd"/>
-      <w:r>
-        <w:t xml:space="preserve"> </w:t>
-      </w:r>
-      <w:proofErr w:type="spellStart"/>
-      <w:r>
-        <w:t>key</w:t>
-      </w:r>
-      <w:proofErr w:type="spellEnd"/>
-      <w:r>
-        <w:t xml:space="preserve">, UK adalah </w:t>
-      </w:r>
-      <w:proofErr w:type="spellStart"/>
-      <w:r>
-        <w:t>unique</w:t>
-      </w:r>
-      <w:proofErr w:type="spellEnd"/>
-      <w:r>
-        <w:t xml:space="preserve"> </w:t>
-      </w:r>
-      <w:proofErr w:type="spellStart"/>
-      <w:r>
-        <w:t>key</w:t>
-      </w:r>
-      <w:proofErr w:type="spellEnd"/>
-      <w:r>
-        <w:t xml:space="preserve">, dan tanda ? menunjukkan nilai yang boleh kosong. Simbol </w:t>
-      </w:r>
-      <w:proofErr w:type="spellStart"/>
-      <w:r>
-        <w:t>Crow’s</w:t>
-      </w:r>
-      <w:proofErr w:type="spellEnd"/>
-      <w:r>
-        <w:t xml:space="preserve"> </w:t>
-      </w:r>
-      <w:proofErr w:type="spellStart"/>
-      <w:r>
-        <w:t>Foot</w:t>
-      </w:r>
-      <w:proofErr w:type="spellEnd"/>
-      <w:r>
-        <w:t xml:space="preserve"> menunjukkan tepat satu, nol atau satu, serta nol atau banyak.</w:t>
+        <w:t>ERD berikut menampilkan 7 tabel dan 12 relasi dalam satu diagram. Setiap tabel memuat seluruh atribut, tipe data, dan kuncinya. PK berarti primary key, FK berarti foreign key, dan UK berarti unique key. Tanda ? menunjukkan nilai yang boleh kosong. Simbol Crow's Foot menunjukkan hubungan tepat satu, nol atau satu, serta nol atau banyak.</w:t>
       </w:r>
     </w:p>
     <w:p>
@@ -4077,23 +3605,7 @@
         <w:pStyle w:val="BodyText"/>
       </w:pPr>
       <w:r>
-        <w:t xml:space="preserve">Satu data buku mewakili satu buku fisik dengan ISBN wajib dan unik. Setiap pengajuan menghasilkan paling banyak satu pinjaman dan setiap pinjaman memiliki paling banyak satu denda. Kebijakan disimpan per versi. </w:t>
-      </w:r>
-      <w:proofErr w:type="spellStart"/>
-      <w:r>
-        <w:t>Foreign</w:t>
-      </w:r>
-      <w:proofErr w:type="spellEnd"/>
-      <w:r>
-        <w:t xml:space="preserve"> </w:t>
-      </w:r>
-      <w:proofErr w:type="spellStart"/>
-      <w:r>
-        <w:t>key</w:t>
-      </w:r>
-      <w:proofErr w:type="spellEnd"/>
-      <w:r>
-        <w:t xml:space="preserve"> petugas merujuk pengguna dengan peran </w:t>
+        <w:t xml:space="preserve">Setiap data buku mewakili satu buku fisik dengan ISBN yang wajib diisi dan harus unik. Satu pengajuan bisa menghasilkan paling banyak satu pinjaman. Setiap pinjaman bisa memiliki paling banyak satu denda. Aturan peminjaman disimpan per versi. Foreign key petugas mengacu pada pengguna dengan peran </w:t>
       </w:r>
       <w:r>
         <w:rPr>
@@ -4126,6 +3638,7 @@
         <w:rPr>
           <w:noProof/>
         </w:rPr>
+        <w:lastRenderedPageBreak/>
         <w:drawing>
           <wp:inline distT="0" distB="0" distL="0" distR="0" wp14:anchorId="68DBAC49" wp14:editId="4B4FA5A5">
             <wp:extent cx="5731510" cy="3988828"/>
@@ -4176,43 +3689,25 @@
         <w:pStyle w:val="Heading1"/>
       </w:pPr>
       <w:bookmarkStart w:id="36" w:name="acknowledgement-approval"/>
-      <w:bookmarkStart w:id="37" w:name="_Toc244034975"/>
+      <w:bookmarkStart w:id="37" w:name="_Toc244116523"/>
       <w:bookmarkEnd w:id="28"/>
       <w:bookmarkEnd w:id="34"/>
       <w:r>
         <w:lastRenderedPageBreak/>
-        <w:t xml:space="preserve">6. </w:t>
-      </w:r>
-      <w:proofErr w:type="spellStart"/>
-      <w:r>
-        <w:t>Acknowledgement</w:t>
-      </w:r>
-      <w:proofErr w:type="spellEnd"/>
-      <w:r>
-        <w:t xml:space="preserve"> &amp; </w:t>
-      </w:r>
-      <w:proofErr w:type="spellStart"/>
-      <w:r>
-        <w:t>Approval</w:t>
+        <w:t>6. Pernyataan mengetahui dan persetujuan</w:t>
       </w:r>
       <w:bookmarkEnd w:id="37"/>
-      <w:proofErr w:type="spellEnd"/>
     </w:p>
     <w:p>
       <w:pPr>
         <w:pStyle w:val="Heading2"/>
       </w:pPr>
       <w:bookmarkStart w:id="38" w:name="acknowledgement"/>
-      <w:bookmarkStart w:id="39" w:name="_Toc244034976"/>
-      <w:r>
-        <w:t xml:space="preserve">6.1. </w:t>
-      </w:r>
-      <w:proofErr w:type="spellStart"/>
-      <w:r>
-        <w:t>Acknowledgement</w:t>
+      <w:bookmarkStart w:id="39" w:name="_Toc244116524"/>
+      <w:r>
+        <w:t>6.1. Pernyataan mengetahui</w:t>
       </w:r>
       <w:bookmarkEnd w:id="39"/>
-      <w:proofErr w:type="spellEnd"/>
     </w:p>
     <w:tbl>
       <w:tblPr>
@@ -4232,7 +3727,7 @@
         <w:gridCol w:w="1361"/>
         <w:gridCol w:w="2675"/>
         <w:gridCol w:w="1361"/>
-        <w:gridCol w:w="1361"/>
+        <w:gridCol w:w="1615"/>
       </w:tblGrid>
       <w:tr>
         <w:trPr>
@@ -4253,11 +3748,9 @@
             <w:pPr>
               <w:pStyle w:val="Compact"/>
             </w:pPr>
-            <w:proofErr w:type="spellStart"/>
-            <w:r>
-              <w:t>Name</w:t>
-            </w:r>
-            <w:proofErr w:type="spellEnd"/>
+            <w:r>
+              <w:t>Nama</w:t>
+            </w:r>
           </w:p>
         </w:tc>
         <w:tc>
@@ -4274,11 +3767,9 @@
             <w:pPr>
               <w:pStyle w:val="Compact"/>
             </w:pPr>
-            <w:proofErr w:type="spellStart"/>
-            <w:r>
-              <w:t>Role</w:t>
-            </w:r>
-            <w:proofErr w:type="spellEnd"/>
+            <w:r>
+              <w:t>Peran</w:t>
+            </w:r>
           </w:p>
         </w:tc>
         <w:tc>
@@ -4296,7 +3787,7 @@
               <w:pStyle w:val="Compact"/>
             </w:pPr>
             <w:r>
-              <w:t>Date</w:t>
+              <w:t>Tanggal</w:t>
             </w:r>
           </w:p>
         </w:tc>
@@ -4314,11 +3805,9 @@
             <w:pPr>
               <w:pStyle w:val="Compact"/>
             </w:pPr>
-            <w:proofErr w:type="spellStart"/>
-            <w:r>
-              <w:t>Signature</w:t>
-            </w:r>
-            <w:proofErr w:type="spellEnd"/>
+            <w:r>
+              <w:t>Tanda tangan</w:t>
+            </w:r>
           </w:p>
         </w:tc>
       </w:tr>
@@ -4484,17 +3973,12 @@
         <w:pStyle w:val="Heading2"/>
       </w:pPr>
       <w:bookmarkStart w:id="40" w:name="approval"/>
-      <w:bookmarkStart w:id="41" w:name="_Toc244034977"/>
+      <w:bookmarkStart w:id="41" w:name="_Toc244116525"/>
       <w:bookmarkEnd w:id="38"/>
       <w:r>
-        <w:t xml:space="preserve">6.2. </w:t>
-      </w:r>
-      <w:proofErr w:type="spellStart"/>
-      <w:r>
-        <w:t>Approval</w:t>
+        <w:t>6.2. Persetujuan dokumen</w:t>
       </w:r>
       <w:bookmarkEnd w:id="41"/>
-      <w:proofErr w:type="spellEnd"/>
     </w:p>
     <w:tbl>
       <w:tblPr>
@@ -4514,7 +3998,7 @@
         <w:gridCol w:w="1361"/>
         <w:gridCol w:w="2241"/>
         <w:gridCol w:w="1361"/>
-        <w:gridCol w:w="1361"/>
+        <w:gridCol w:w="1615"/>
       </w:tblGrid>
       <w:tr>
         <w:trPr>
@@ -4535,11 +4019,9 @@
             <w:pPr>
               <w:pStyle w:val="Compact"/>
             </w:pPr>
-            <w:proofErr w:type="spellStart"/>
-            <w:r>
-              <w:t>Name</w:t>
-            </w:r>
-            <w:proofErr w:type="spellEnd"/>
+            <w:r>
+              <w:t>Nama</w:t>
+            </w:r>
           </w:p>
         </w:tc>
         <w:tc>
@@ -4556,11 +4038,9 @@
             <w:pPr>
               <w:pStyle w:val="Compact"/>
             </w:pPr>
-            <w:proofErr w:type="spellStart"/>
-            <w:r>
-              <w:t>Role</w:t>
-            </w:r>
-            <w:proofErr w:type="spellEnd"/>
+            <w:r>
+              <w:t>Peran</w:t>
+            </w:r>
           </w:p>
         </w:tc>
         <w:tc>
@@ -4578,7 +4058,7 @@
               <w:pStyle w:val="Compact"/>
             </w:pPr>
             <w:r>
-              <w:t>Date</w:t>
+              <w:t>Tanggal</w:t>
             </w:r>
           </w:p>
         </w:tc>
@@ -4596,11 +4076,9 @@
             <w:pPr>
               <w:pStyle w:val="Compact"/>
             </w:pPr>
-            <w:proofErr w:type="spellStart"/>
-            <w:r>
-              <w:t>Signature</w:t>
-            </w:r>
-            <w:proofErr w:type="spellEnd"/>
+            <w:r>
+              <w:t>Tanda tangan</w:t>
+            </w:r>
           </w:p>
         </w:tc>
       </w:tr>
@@ -4765,13 +4243,8 @@
       <w:pPr>
         <w:pStyle w:val="BodyText"/>
       </w:pPr>
-      <w:proofErr w:type="spellStart"/>
-      <w:r>
-        <w:t>Fitur</w:t>
-      </w:r>
-      <w:proofErr w:type="spellEnd"/>
-      <w:r>
-        <w:t xml:space="preserve"> dan angka kebijakan telah dikonfirmasi pemilik proyek melalui percakapan. Persetujuan formal dokumen belum diberikan.</w:t>
+      <w:r>
+        <w:t>Pemilik proyek sudah mengonfirmasi fitur dan nilai aturan peminjaman melalui percakapan. Dokumen ini belum mendapat persetujuan formal.</w:t>
       </w:r>
       <w:bookmarkEnd w:id="1"/>
       <w:bookmarkEnd w:id="36"/>

</xml_diff>

<commit_message>
docs: update Merah Putih library BRD
</commit_message>
<xml_diff>
--- a/docs/BRD-perpus-merah-putih.docx
+++ b/docs/BRD-perpus-merah-putih.docx
@@ -389,7 +389,7 @@
       <w:bookmarkStart w:id="1" w:name="business-requirements-document-brd"/>
       <w:r>
         <w:lastRenderedPageBreak/>
-        <w:t>Daftar isi</w:t>
+        <w:t>Table of contents</w:t>
       </w:r>
     </w:p>
     <w:sdt>
@@ -419,13 +419,13 @@
           <w:r>
             <w:fldChar w:fldCharType="separate"/>
           </w:r>
-          <w:hyperlink w:anchor="_Toc244116506" w:history="1">
+          <w:hyperlink w:anchor="_Toc244118063" w:history="1">
             <w:r>
               <w:rPr>
                 <w:rStyle w:val="Hyperlink"/>
                 <w:noProof/>
               </w:rPr>
-              <w:t>1. Definisi kebutuhan bisnis</w:t>
+              <w:t>1. Business Requirements Definition</w:t>
             </w:r>
             <w:r>
               <w:rPr>
@@ -446,7 +446,7 @@
                 <w:noProof/>
                 <w:webHidden/>
               </w:rPr>
-              <w:instrText xml:space="preserve"> PAGEREF _Toc244116506 \h </w:instrText>
+              <w:instrText xml:space="preserve"> PAGEREF _Toc244118063 \h </w:instrText>
             </w:r>
             <w:r>
               <w:rPr>
@@ -485,13 +485,13 @@
               <w:lang w:val="en-ID" w:eastAsia="en-US"/>
             </w:rPr>
           </w:pPr>
-          <w:hyperlink w:anchor="_Toc244116507" w:history="1">
+          <w:hyperlink w:anchor="_Toc244118064" w:history="1">
             <w:r>
               <w:rPr>
                 <w:rStyle w:val="Hyperlink"/>
                 <w:noProof/>
               </w:rPr>
-              <w:t>2. Pengantar</w:t>
+              <w:t>2. Introduction</w:t>
             </w:r>
             <w:r>
               <w:rPr>
@@ -512,7 +512,7 @@
                 <w:noProof/>
                 <w:webHidden/>
               </w:rPr>
-              <w:instrText xml:space="preserve"> PAGEREF _Toc244116507 \h </w:instrText>
+              <w:instrText xml:space="preserve"> PAGEREF _Toc244118064 \h </w:instrText>
             </w:r>
             <w:r>
               <w:rPr>
@@ -551,13 +551,13 @@
               <w:lang w:val="en-ID" w:eastAsia="en-US"/>
             </w:rPr>
           </w:pPr>
-          <w:hyperlink w:anchor="_Toc244116508" w:history="1">
+          <w:hyperlink w:anchor="_Toc244118065" w:history="1">
             <w:r>
               <w:rPr>
                 <w:rStyle w:val="Hyperlink"/>
                 <w:noProof/>
               </w:rPr>
-              <w:t>2.1. Latar belakang</w:t>
+              <w:t>2.1. Background</w:t>
             </w:r>
             <w:r>
               <w:rPr>
@@ -578,7 +578,7 @@
                 <w:noProof/>
                 <w:webHidden/>
               </w:rPr>
-              <w:instrText xml:space="preserve"> PAGEREF _Toc244116508 \h </w:instrText>
+              <w:instrText xml:space="preserve"> PAGEREF _Toc244118065 \h </w:instrText>
             </w:r>
             <w:r>
               <w:rPr>
@@ -617,13 +617,13 @@
               <w:lang w:val="en-ID" w:eastAsia="en-US"/>
             </w:rPr>
           </w:pPr>
-          <w:hyperlink w:anchor="_Toc244116509" w:history="1">
+          <w:hyperlink w:anchor="_Toc244118066" w:history="1">
             <w:r>
               <w:rPr>
                 <w:rStyle w:val="Hyperlink"/>
                 <w:noProof/>
               </w:rPr>
-              <w:t>2.2. Tujuan dan perbaikan yang diharapkan</w:t>
+              <w:t>2.2. Objective &amp; Expected Improvements</w:t>
             </w:r>
             <w:r>
               <w:rPr>
@@ -644,7 +644,7 @@
                 <w:noProof/>
                 <w:webHidden/>
               </w:rPr>
-              <w:instrText xml:space="preserve"> PAGEREF _Toc244116509 \h </w:instrText>
+              <w:instrText xml:space="preserve"> PAGEREF _Toc244118066 \h </w:instrText>
             </w:r>
             <w:r>
               <w:rPr>
@@ -683,13 +683,13 @@
               <w:lang w:val="en-ID" w:eastAsia="en-US"/>
             </w:rPr>
           </w:pPr>
-          <w:hyperlink w:anchor="_Toc244116510" w:history="1">
+          <w:hyperlink w:anchor="_Toc244118067" w:history="1">
             <w:r>
               <w:rPr>
                 <w:rStyle w:val="Hyperlink"/>
                 <w:noProof/>
               </w:rPr>
-              <w:t>2.3. Gambaran proses bisnis</w:t>
+              <w:t>2.3. Business Process Overview</w:t>
             </w:r>
             <w:r>
               <w:rPr>
@@ -710,7 +710,7 @@
                 <w:noProof/>
                 <w:webHidden/>
               </w:rPr>
-              <w:instrText xml:space="preserve"> PAGEREF _Toc244116510 \h </w:instrText>
+              <w:instrText xml:space="preserve"> PAGEREF _Toc244118067 \h </w:instrText>
             </w:r>
             <w:r>
               <w:rPr>
@@ -749,13 +749,13 @@
               <w:lang w:val="en-ID" w:eastAsia="en-US"/>
             </w:rPr>
           </w:pPr>
-          <w:hyperlink w:anchor="_Toc244116511" w:history="1">
+          <w:hyperlink w:anchor="_Toc244118068" w:history="1">
             <w:r>
               <w:rPr>
                 <w:rStyle w:val="Hyperlink"/>
                 <w:noProof/>
               </w:rPr>
-              <w:t>2.3.1. Proses bisnis saat ini</w:t>
+              <w:t>2.3.1. Current Business Process</w:t>
             </w:r>
             <w:r>
               <w:rPr>
@@ -776,7 +776,7 @@
                 <w:noProof/>
                 <w:webHidden/>
               </w:rPr>
-              <w:instrText xml:space="preserve"> PAGEREF _Toc244116511 \h </w:instrText>
+              <w:instrText xml:space="preserve"> PAGEREF _Toc244118068 \h </w:instrText>
             </w:r>
             <w:r>
               <w:rPr>
@@ -815,13 +815,13 @@
               <w:lang w:val="en-ID" w:eastAsia="en-US"/>
             </w:rPr>
           </w:pPr>
-          <w:hyperlink w:anchor="_Toc244116512" w:history="1">
+          <w:hyperlink w:anchor="_Toc244118069" w:history="1">
             <w:r>
               <w:rPr>
                 <w:rStyle w:val="Hyperlink"/>
                 <w:noProof/>
               </w:rPr>
-              <w:t>3. Ruang lingkup</w:t>
+              <w:t>3. Scope</w:t>
             </w:r>
             <w:r>
               <w:rPr>
@@ -842,7 +842,7 @@
                 <w:noProof/>
                 <w:webHidden/>
               </w:rPr>
-              <w:instrText xml:space="preserve"> PAGEREF _Toc244116512 \h </w:instrText>
+              <w:instrText xml:space="preserve"> PAGEREF _Toc244118069 \h </w:instrText>
             </w:r>
             <w:r>
               <w:rPr>
@@ -881,13 +881,13 @@
               <w:lang w:val="en-ID" w:eastAsia="en-US"/>
             </w:rPr>
           </w:pPr>
-          <w:hyperlink w:anchor="_Toc244116513" w:history="1">
+          <w:hyperlink w:anchor="_Toc244118070" w:history="1">
             <w:r>
               <w:rPr>
                 <w:rStyle w:val="Hyperlink"/>
                 <w:noProof/>
               </w:rPr>
-              <w:t>3.1. Yang termasuk dalam proyek</w:t>
+              <w:t>3.1. In Scope</w:t>
             </w:r>
             <w:r>
               <w:rPr>
@@ -908,7 +908,7 @@
                 <w:noProof/>
                 <w:webHidden/>
               </w:rPr>
-              <w:instrText xml:space="preserve"> PAGEREF _Toc244116513 \h </w:instrText>
+              <w:instrText xml:space="preserve"> PAGEREF _Toc244118070 \h </w:instrText>
             </w:r>
             <w:r>
               <w:rPr>
@@ -947,13 +947,13 @@
               <w:lang w:val="en-ID" w:eastAsia="en-US"/>
             </w:rPr>
           </w:pPr>
-          <w:hyperlink w:anchor="_Toc244116514" w:history="1">
+          <w:hyperlink w:anchor="_Toc244118071" w:history="1">
             <w:r>
               <w:rPr>
                 <w:rStyle w:val="Hyperlink"/>
                 <w:noProof/>
               </w:rPr>
-              <w:t>3.2. Yang tidak termasuk dalam proyek</w:t>
+              <w:t>3.2. Out Of Scope</w:t>
             </w:r>
             <w:r>
               <w:rPr>
@@ -974,7 +974,7 @@
                 <w:noProof/>
                 <w:webHidden/>
               </w:rPr>
-              <w:instrText xml:space="preserve"> PAGEREF _Toc244116514 \h </w:instrText>
+              <w:instrText xml:space="preserve"> PAGEREF _Toc244118071 \h </w:instrText>
             </w:r>
             <w:r>
               <w:rPr>
@@ -1013,13 +1013,13 @@
               <w:lang w:val="en-ID" w:eastAsia="en-US"/>
             </w:rPr>
           </w:pPr>
-          <w:hyperlink w:anchor="_Toc244116515" w:history="1">
+          <w:hyperlink w:anchor="_Toc244118072" w:history="1">
             <w:r>
               <w:rPr>
                 <w:rStyle w:val="Hyperlink"/>
                 <w:noProof/>
               </w:rPr>
-              <w:t>4. Gambaran sistem</w:t>
+              <w:t>4. System Perspective</w:t>
             </w:r>
             <w:r>
               <w:rPr>
@@ -1040,7 +1040,7 @@
                 <w:noProof/>
                 <w:webHidden/>
               </w:rPr>
-              <w:instrText xml:space="preserve"> PAGEREF _Toc244116515 \h </w:instrText>
+              <w:instrText xml:space="preserve"> PAGEREF _Toc244118072 \h </w:instrText>
             </w:r>
             <w:r>
               <w:rPr>
@@ -1079,13 +1079,13 @@
               <w:lang w:val="en-ID" w:eastAsia="en-US"/>
             </w:rPr>
           </w:pPr>
-          <w:hyperlink w:anchor="_Toc244116516" w:history="1">
+          <w:hyperlink w:anchor="_Toc244118073" w:history="1">
             <w:r>
               <w:rPr>
                 <w:rStyle w:val="Hyperlink"/>
                 <w:noProof/>
               </w:rPr>
-              <w:t>4.1. Asumsi</w:t>
+              <w:t>4.1. Assumption</w:t>
             </w:r>
             <w:r>
               <w:rPr>
@@ -1106,7 +1106,7 @@
                 <w:noProof/>
                 <w:webHidden/>
               </w:rPr>
-              <w:instrText xml:space="preserve"> PAGEREF _Toc244116516 \h </w:instrText>
+              <w:instrText xml:space="preserve"> PAGEREF _Toc244118073 \h </w:instrText>
             </w:r>
             <w:r>
               <w:rPr>
@@ -1145,13 +1145,13 @@
               <w:lang w:val="en-ID" w:eastAsia="en-US"/>
             </w:rPr>
           </w:pPr>
-          <w:hyperlink w:anchor="_Toc244116517" w:history="1">
+          <w:hyperlink w:anchor="_Toc244118074" w:history="1">
             <w:r>
               <w:rPr>
                 <w:rStyle w:val="Hyperlink"/>
                 <w:noProof/>
               </w:rPr>
-              <w:t>4.2. Hal di luar tanggung jawab aplikasi</w:t>
+              <w:t>4.2. Exclusions</w:t>
             </w:r>
             <w:r>
               <w:rPr>
@@ -1172,7 +1172,7 @@
                 <w:noProof/>
                 <w:webHidden/>
               </w:rPr>
-              <w:instrText xml:space="preserve"> PAGEREF _Toc244116517 \h </w:instrText>
+              <w:instrText xml:space="preserve"> PAGEREF _Toc244118074 \h </w:instrText>
             </w:r>
             <w:r>
               <w:rPr>
@@ -1211,13 +1211,13 @@
               <w:lang w:val="en-ID" w:eastAsia="en-US"/>
             </w:rPr>
           </w:pPr>
-          <w:hyperlink w:anchor="_Toc244116518" w:history="1">
+          <w:hyperlink w:anchor="_Toc244118075" w:history="1">
             <w:r>
               <w:rPr>
                 <w:rStyle w:val="Hyperlink"/>
                 <w:noProof/>
               </w:rPr>
-              <w:t>4.3. Batasan</w:t>
+              <w:t>4.3. Constraints</w:t>
             </w:r>
             <w:r>
               <w:rPr>
@@ -1238,7 +1238,7 @@
                 <w:noProof/>
                 <w:webHidden/>
               </w:rPr>
-              <w:instrText xml:space="preserve"> PAGEREF _Toc244116518 \h </w:instrText>
+              <w:instrText xml:space="preserve"> PAGEREF _Toc244118075 \h </w:instrText>
             </w:r>
             <w:r>
               <w:rPr>
@@ -1277,13 +1277,13 @@
               <w:lang w:val="en-ID" w:eastAsia="en-US"/>
             </w:rPr>
           </w:pPr>
-          <w:hyperlink w:anchor="_Toc244116519" w:history="1">
+          <w:hyperlink w:anchor="_Toc244118076" w:history="1">
             <w:r>
               <w:rPr>
                 <w:rStyle w:val="Hyperlink"/>
                 <w:noProof/>
               </w:rPr>
-              <w:t>5. Kebutuhan bisnis</w:t>
+              <w:t>5. Business Requirement</w:t>
             </w:r>
             <w:r>
               <w:rPr>
@@ -1304,7 +1304,7 @@
                 <w:noProof/>
                 <w:webHidden/>
               </w:rPr>
-              <w:instrText xml:space="preserve"> PAGEREF _Toc244116519 \h </w:instrText>
+              <w:instrText xml:space="preserve"> PAGEREF _Toc244118076 \h </w:instrText>
             </w:r>
             <w:r>
               <w:rPr>
@@ -1343,13 +1343,13 @@
               <w:lang w:val="en-ID" w:eastAsia="en-US"/>
             </w:rPr>
           </w:pPr>
-          <w:hyperlink w:anchor="_Toc244116520" w:history="1">
+          <w:hyperlink w:anchor="_Toc244118077" w:history="1">
             <w:r>
               <w:rPr>
                 <w:rStyle w:val="Hyperlink"/>
                 <w:noProof/>
               </w:rPr>
-              <w:t>5.1. Kebutuhan fungsional</w:t>
+              <w:t>5.1. Functional Requirements</w:t>
             </w:r>
             <w:r>
               <w:rPr>
@@ -1370,7 +1370,7 @@
                 <w:noProof/>
                 <w:webHidden/>
               </w:rPr>
-              <w:instrText xml:space="preserve"> PAGEREF _Toc244116520 \h </w:instrText>
+              <w:instrText xml:space="preserve"> PAGEREF _Toc244118077 \h </w:instrText>
             </w:r>
             <w:r>
               <w:rPr>
@@ -1409,13 +1409,13 @@
               <w:lang w:val="en-ID" w:eastAsia="en-US"/>
             </w:rPr>
           </w:pPr>
-          <w:hyperlink w:anchor="_Toc244116521" w:history="1">
+          <w:hyperlink w:anchor="_Toc244118078" w:history="1">
             <w:r>
               <w:rPr>
                 <w:rStyle w:val="Hyperlink"/>
                 <w:noProof/>
               </w:rPr>
-              <w:t>5.2. Kebutuhan nonfungsional</w:t>
+              <w:t>5.2. Non Functional Requirements</w:t>
             </w:r>
             <w:r>
               <w:rPr>
@@ -1436,7 +1436,7 @@
                 <w:noProof/>
                 <w:webHidden/>
               </w:rPr>
-              <w:instrText xml:space="preserve"> PAGEREF _Toc244116521 \h </w:instrText>
+              <w:instrText xml:space="preserve"> PAGEREF _Toc244118078 \h </w:instrText>
             </w:r>
             <w:r>
               <w:rPr>
@@ -1475,13 +1475,13 @@
               <w:lang w:val="en-ID" w:eastAsia="en-US"/>
             </w:rPr>
           </w:pPr>
-          <w:hyperlink w:anchor="_Toc244116522" w:history="1">
+          <w:hyperlink w:anchor="_Toc244118079" w:history="1">
             <w:r>
               <w:rPr>
                 <w:rStyle w:val="Hyperlink"/>
                 <w:noProof/>
               </w:rPr>
-              <w:t>5.3. Diagram relasi entitas (ERD)</w:t>
+              <w:t>5.3. Entity Relationship Diagram</w:t>
             </w:r>
             <w:r>
               <w:rPr>
@@ -1502,7 +1502,7 @@
                 <w:noProof/>
                 <w:webHidden/>
               </w:rPr>
-              <w:instrText xml:space="preserve"> PAGEREF _Toc244116522 \h </w:instrText>
+              <w:instrText xml:space="preserve"> PAGEREF _Toc244118079 \h </w:instrText>
             </w:r>
             <w:r>
               <w:rPr>
@@ -1541,13 +1541,13 @@
               <w:lang w:val="en-ID" w:eastAsia="en-US"/>
             </w:rPr>
           </w:pPr>
-          <w:hyperlink w:anchor="_Toc244116523" w:history="1">
+          <w:hyperlink w:anchor="_Toc244118080" w:history="1">
             <w:r>
               <w:rPr>
                 <w:rStyle w:val="Hyperlink"/>
                 <w:noProof/>
               </w:rPr>
-              <w:t>6. Pernyataan mengetahui dan persetujuan</w:t>
+              <w:t>6. Acknowledgement &amp; Approval</w:t>
             </w:r>
             <w:r>
               <w:rPr>
@@ -1568,7 +1568,7 @@
                 <w:noProof/>
                 <w:webHidden/>
               </w:rPr>
-              <w:instrText xml:space="preserve"> PAGEREF _Toc244116523 \h </w:instrText>
+              <w:instrText xml:space="preserve"> PAGEREF _Toc244118080 \h </w:instrText>
             </w:r>
             <w:r>
               <w:rPr>
@@ -1588,7 +1588,7 @@
                 <w:noProof/>
                 <w:webHidden/>
               </w:rPr>
-              <w:t>9</w:t>
+              <w:t>8</w:t>
             </w:r>
             <w:r>
               <w:rPr>
@@ -1607,13 +1607,13 @@
               <w:lang w:val="en-ID" w:eastAsia="en-US"/>
             </w:rPr>
           </w:pPr>
-          <w:hyperlink w:anchor="_Toc244116524" w:history="1">
+          <w:hyperlink w:anchor="_Toc244118081" w:history="1">
             <w:r>
               <w:rPr>
                 <w:rStyle w:val="Hyperlink"/>
                 <w:noProof/>
               </w:rPr>
-              <w:t>6.1. Pernyataan mengetahui</w:t>
+              <w:t>6.1. Acknowledge</w:t>
             </w:r>
             <w:r>
               <w:rPr>
@@ -1634,7 +1634,7 @@
                 <w:noProof/>
                 <w:webHidden/>
               </w:rPr>
-              <w:instrText xml:space="preserve"> PAGEREF _Toc244116524 \h </w:instrText>
+              <w:instrText xml:space="preserve"> PAGEREF _Toc244118081 \h </w:instrText>
             </w:r>
             <w:r>
               <w:rPr>
@@ -1654,7 +1654,7 @@
                 <w:noProof/>
                 <w:webHidden/>
               </w:rPr>
-              <w:t>9</w:t>
+              <w:t>8</w:t>
             </w:r>
             <w:r>
               <w:rPr>
@@ -1673,13 +1673,13 @@
               <w:lang w:val="en-ID" w:eastAsia="en-US"/>
             </w:rPr>
           </w:pPr>
-          <w:hyperlink w:anchor="_Toc244116525" w:history="1">
+          <w:hyperlink w:anchor="_Toc244118082" w:history="1">
             <w:r>
               <w:rPr>
                 <w:rStyle w:val="Hyperlink"/>
                 <w:noProof/>
               </w:rPr>
-              <w:t>6.2. Persetujuan dokumen</w:t>
+              <w:t>6.2. Approval</w:t>
             </w:r>
             <w:r>
               <w:rPr>
@@ -1700,7 +1700,7 @@
                 <w:noProof/>
                 <w:webHidden/>
               </w:rPr>
-              <w:instrText xml:space="preserve"> PAGEREF _Toc244116525 \h </w:instrText>
+              <w:instrText xml:space="preserve"> PAGEREF _Toc244118082 \h </w:instrText>
             </w:r>
             <w:r>
               <w:rPr>
@@ -1720,7 +1720,7 @@
                 <w:noProof/>
                 <w:webHidden/>
               </w:rPr>
-              <w:t>9</w:t>
+              <w:t>8</w:t>
             </w:r>
             <w:r>
               <w:rPr>
@@ -1747,11 +1747,11 @@
         <w:pageBreakBefore/>
       </w:pPr>
       <w:bookmarkStart w:id="2" w:name="business-requirements-definition"/>
-      <w:bookmarkStart w:id="3" w:name="_Toc244116506"/>
+      <w:bookmarkStart w:id="3" w:name="_Toc244118063"/>
       <w:bookmarkEnd w:id="0"/>
       <w:r>
         <w:lastRenderedPageBreak/>
-        <w:t>1. Definisi kebutuhan bisnis</w:t>
+        <w:t>1. Business Requirements Definition</w:t>
       </w:r>
       <w:bookmarkEnd w:id="3"/>
     </w:p>
@@ -2384,10 +2384,10 @@
         <w:pStyle w:val="Heading1"/>
       </w:pPr>
       <w:bookmarkStart w:id="4" w:name="introduction"/>
-      <w:bookmarkStart w:id="5" w:name="_Toc244116507"/>
+      <w:bookmarkStart w:id="5" w:name="_Toc244118064"/>
       <w:bookmarkEnd w:id="2"/>
       <w:r>
-        <w:t>2. Pengantar</w:t>
+        <w:t>2. Introduction</w:t>
       </w:r>
       <w:bookmarkEnd w:id="5"/>
     </w:p>
@@ -2396,9 +2396,9 @@
         <w:pStyle w:val="Heading2"/>
       </w:pPr>
       <w:bookmarkStart w:id="6" w:name="background"/>
-      <w:bookmarkStart w:id="7" w:name="_Toc244116508"/>
-      <w:r>
-        <w:t>2.1. Latar belakang</w:t>
+      <w:bookmarkStart w:id="7" w:name="_Toc244118065"/>
+      <w:r>
+        <w:t>2.1. Background</w:t>
       </w:r>
       <w:bookmarkEnd w:id="7"/>
     </w:p>
@@ -2415,10 +2415,10 @@
         <w:pStyle w:val="Heading2"/>
       </w:pPr>
       <w:bookmarkStart w:id="8" w:name="objective-expected-improvements"/>
-      <w:bookmarkStart w:id="9" w:name="_Toc244116509"/>
+      <w:bookmarkStart w:id="9" w:name="_Toc244118066"/>
       <w:bookmarkEnd w:id="6"/>
       <w:r>
-        <w:t>2.2. Tujuan dan perbaikan yang diharapkan</w:t>
+        <w:t>2.2. Objective &amp; Expected Improvements</w:t>
       </w:r>
       <w:bookmarkEnd w:id="9"/>
     </w:p>
@@ -2488,10 +2488,10 @@
         <w:pStyle w:val="Heading2"/>
       </w:pPr>
       <w:bookmarkStart w:id="10" w:name="business-process-overview"/>
-      <w:bookmarkStart w:id="11" w:name="_Toc244116510"/>
+      <w:bookmarkStart w:id="11" w:name="_Toc244118067"/>
       <w:bookmarkEnd w:id="8"/>
       <w:r>
-        <w:t>2.3. Gambaran proses bisnis</w:t>
+        <w:t>2.3. Business Process Overview</w:t>
       </w:r>
       <w:bookmarkEnd w:id="11"/>
     </w:p>
@@ -2516,9 +2516,9 @@
         <w:pStyle w:val="Heading3"/>
       </w:pPr>
       <w:bookmarkStart w:id="12" w:name="current-business-process"/>
-      <w:bookmarkStart w:id="13" w:name="_Toc244116511"/>
-      <w:r>
-        <w:t>2.3.1. Proses bisnis saat ini</w:t>
+      <w:bookmarkStart w:id="13" w:name="_Toc244118068"/>
+      <w:r>
+        <w:t>2.3.1. Current Business Process</w:t>
       </w:r>
       <w:bookmarkEnd w:id="13"/>
     </w:p>
@@ -2535,12 +2535,12 @@
         <w:pStyle w:val="Heading1"/>
       </w:pPr>
       <w:bookmarkStart w:id="14" w:name="scope"/>
-      <w:bookmarkStart w:id="15" w:name="_Toc244116512"/>
+      <w:bookmarkStart w:id="15" w:name="_Toc244118069"/>
       <w:bookmarkEnd w:id="4"/>
       <w:bookmarkEnd w:id="10"/>
       <w:bookmarkEnd w:id="12"/>
       <w:r>
-        <w:t>3. Ruang lingkup</w:t>
+        <w:t>3. Scope</w:t>
       </w:r>
       <w:bookmarkEnd w:id="15"/>
     </w:p>
@@ -2549,9 +2549,9 @@
         <w:pStyle w:val="Heading2"/>
       </w:pPr>
       <w:bookmarkStart w:id="16" w:name="in-scope"/>
-      <w:bookmarkStart w:id="17" w:name="_Toc244116513"/>
-      <w:r>
-        <w:t>3.1. Yang termasuk dalam proyek</w:t>
+      <w:bookmarkStart w:id="17" w:name="_Toc244118070"/>
+      <w:r>
+        <w:t>3.1. In Scope</w:t>
       </w:r>
       <w:bookmarkEnd w:id="17"/>
     </w:p>
@@ -2644,10 +2644,10 @@
         <w:pStyle w:val="Heading2"/>
       </w:pPr>
       <w:bookmarkStart w:id="18" w:name="out-of-scope"/>
-      <w:bookmarkStart w:id="19" w:name="_Toc244116514"/>
+      <w:bookmarkStart w:id="19" w:name="_Toc244118071"/>
       <w:bookmarkEnd w:id="16"/>
       <w:r>
-        <w:t>3.2. Yang tidak termasuk dalam proyek</w:t>
+        <w:t>3.2. Out Of Scope</w:t>
       </w:r>
       <w:bookmarkEnd w:id="19"/>
     </w:p>
@@ -2728,12 +2728,12 @@
         <w:pStyle w:val="Heading1"/>
       </w:pPr>
       <w:bookmarkStart w:id="20" w:name="system-perspective"/>
-      <w:bookmarkStart w:id="21" w:name="_Toc244116515"/>
+      <w:bookmarkStart w:id="21" w:name="_Toc244118072"/>
       <w:bookmarkEnd w:id="14"/>
       <w:bookmarkEnd w:id="18"/>
       <w:r>
         <w:lastRenderedPageBreak/>
-        <w:t>4. Gambaran sistem</w:t>
+        <w:t>4. System Perspective</w:t>
       </w:r>
       <w:bookmarkEnd w:id="21"/>
     </w:p>
@@ -2742,9 +2742,9 @@
         <w:pStyle w:val="Heading2"/>
       </w:pPr>
       <w:bookmarkStart w:id="22" w:name="assumptions"/>
-      <w:bookmarkStart w:id="23" w:name="_Toc244116516"/>
-      <w:r>
-        <w:t>4.1. Asumsi</w:t>
+      <w:bookmarkStart w:id="23" w:name="_Toc244118073"/>
+      <w:r>
+        <w:t>4.1. Assumption</w:t>
       </w:r>
       <w:bookmarkEnd w:id="23"/>
     </w:p>
@@ -2813,10 +2813,10 @@
         <w:pStyle w:val="Heading2"/>
       </w:pPr>
       <w:bookmarkStart w:id="24" w:name="exclusions"/>
-      <w:bookmarkStart w:id="25" w:name="_Toc244116517"/>
+      <w:bookmarkStart w:id="25" w:name="_Toc244118074"/>
       <w:bookmarkEnd w:id="22"/>
       <w:r>
-        <w:t>4.2. Hal di luar tanggung jawab aplikasi</w:t>
+        <w:t>4.2. Exclusions</w:t>
       </w:r>
       <w:bookmarkEnd w:id="25"/>
     </w:p>
@@ -2833,10 +2833,10 @@
         <w:pStyle w:val="Heading2"/>
       </w:pPr>
       <w:bookmarkStart w:id="26" w:name="constraints"/>
-      <w:bookmarkStart w:id="27" w:name="_Toc244116518"/>
+      <w:bookmarkStart w:id="27" w:name="_Toc244118075"/>
       <w:bookmarkEnd w:id="24"/>
       <w:r>
-        <w:t>4.3. Batasan</w:t>
+        <w:t>4.3. Constraints</w:t>
       </w:r>
       <w:bookmarkEnd w:id="27"/>
     </w:p>
@@ -2893,11 +2893,11 @@
         <w:pStyle w:val="Heading1"/>
       </w:pPr>
       <w:bookmarkStart w:id="28" w:name="business-requirements"/>
-      <w:bookmarkStart w:id="29" w:name="_Toc244116519"/>
+      <w:bookmarkStart w:id="29" w:name="_Toc244118076"/>
       <w:bookmarkEnd w:id="20"/>
       <w:bookmarkEnd w:id="26"/>
       <w:r>
-        <w:t>5. Kebutuhan bisnis</w:t>
+        <w:t>5. Business Requirement</w:t>
       </w:r>
       <w:bookmarkEnd w:id="29"/>
     </w:p>
@@ -2906,9 +2906,9 @@
         <w:pStyle w:val="Heading2"/>
       </w:pPr>
       <w:bookmarkStart w:id="30" w:name="functional-requirements"/>
-      <w:bookmarkStart w:id="31" w:name="_Toc244116520"/>
-      <w:r>
-        <w:t>5.1. Kebutuhan fungsional</w:t>
+      <w:bookmarkStart w:id="31" w:name="_Toc244118077"/>
+      <w:r>
+        <w:t>5.1. Functional Requirements</w:t>
       </w:r>
       <w:bookmarkEnd w:id="31"/>
     </w:p>
@@ -3431,10 +3431,10 @@
         <w:pStyle w:val="Heading2"/>
       </w:pPr>
       <w:bookmarkStart w:id="32" w:name="non-functional-requirements"/>
-      <w:bookmarkStart w:id="33" w:name="_Toc244116521"/>
+      <w:bookmarkStart w:id="33" w:name="_Toc244118078"/>
       <w:bookmarkEnd w:id="30"/>
       <w:r>
-        <w:t>5.2. Kebutuhan nonfungsional</w:t>
+        <w:t>5.2. Non Functional Requirements</w:t>
       </w:r>
       <w:bookmarkEnd w:id="33"/>
     </w:p>
@@ -3585,10 +3585,10 @@
         <w:pStyle w:val="Heading2"/>
       </w:pPr>
       <w:bookmarkStart w:id="34" w:name="entity-relationship-diagram"/>
-      <w:bookmarkStart w:id="35" w:name="_Toc244116522"/>
+      <w:bookmarkStart w:id="35" w:name="_Toc244118079"/>
       <w:bookmarkEnd w:id="32"/>
       <w:r>
-        <w:t>5.3. Diagram relasi entitas (ERD)</w:t>
+        <w:t>5.3. Entity Relationship Diagram</w:t>
       </w:r>
       <w:bookmarkEnd w:id="35"/>
     </w:p>
@@ -3638,10 +3638,9 @@
         <w:rPr>
           <w:noProof/>
         </w:rPr>
-        <w:lastRenderedPageBreak/>
         <w:drawing>
-          <wp:inline distT="0" distB="0" distL="0" distR="0" wp14:anchorId="68DBAC49" wp14:editId="4B4FA5A5">
-            <wp:extent cx="5731510" cy="3988828"/>
+          <wp:inline distT="0" distB="0" distL="0" distR="0" wp14:anchorId="68DBAC49" wp14:editId="5DF2CABF">
+            <wp:extent cx="4913376" cy="3310128"/>
             <wp:effectExtent l="0" t="0" r="0" b="0"/>
             <wp:docPr id="26" name="Picture" descr="ERD lengkap. Seluruh tabel dan relasi"/>
             <wp:cNvGraphicFramePr/>
@@ -3662,7 +3661,7 @@
                   <pic:spPr bwMode="auto">
                     <a:xfrm>
                       <a:off x="0" y="0"/>
-                      <a:ext cx="5731510" cy="3988828"/>
+                      <a:ext cx="4977980" cy="3353652"/>
                     </a:xfrm>
                     <a:prstGeom prst="rect">
                       <a:avLst/>
@@ -3689,12 +3688,12 @@
         <w:pStyle w:val="Heading1"/>
       </w:pPr>
       <w:bookmarkStart w:id="36" w:name="acknowledgement-approval"/>
-      <w:bookmarkStart w:id="37" w:name="_Toc244116523"/>
+      <w:bookmarkStart w:id="37" w:name="_Toc244118080"/>
       <w:bookmarkEnd w:id="28"/>
       <w:bookmarkEnd w:id="34"/>
       <w:r>
         <w:lastRenderedPageBreak/>
-        <w:t>6. Pernyataan mengetahui dan persetujuan</w:t>
+        <w:t>6. Acknowledgement &amp; Approval</w:t>
       </w:r>
       <w:bookmarkEnd w:id="37"/>
     </w:p>
@@ -3703,9 +3702,9 @@
         <w:pStyle w:val="Heading2"/>
       </w:pPr>
       <w:bookmarkStart w:id="38" w:name="acknowledgement"/>
-      <w:bookmarkStart w:id="39" w:name="_Toc244116524"/>
-      <w:r>
-        <w:t>6.1. Pernyataan mengetahui</w:t>
+      <w:bookmarkStart w:id="39" w:name="_Toc244118081"/>
+      <w:r>
+        <w:t>6.1. Acknowledge</w:t>
       </w:r>
       <w:bookmarkEnd w:id="39"/>
     </w:p>
@@ -3973,10 +3972,10 @@
         <w:pStyle w:val="Heading2"/>
       </w:pPr>
       <w:bookmarkStart w:id="40" w:name="approval"/>
-      <w:bookmarkStart w:id="41" w:name="_Toc244116525"/>
+      <w:bookmarkStart w:id="41" w:name="_Toc244118082"/>
       <w:bookmarkEnd w:id="38"/>
       <w:r>
-        <w:t>6.2. Persetujuan dokumen</w:t>
+        <w:t>6.2. Approval</w:t>
       </w:r>
       <w:bookmarkEnd w:id="41"/>
     </w:p>

</xml_diff>